<commit_message>
lecture22, group assignment, syllabus update
</commit_message>
<xml_diff>
--- a/syllabus/Community Ecology Syllabus 2025.docx
+++ b/syllabus/Community Ecology Syllabus 2025.docx
@@ -455,7 +455,7 @@
         <w:pStyle w:val="Heading1"/>
         <w:numPr>
           <w:ilvl w:val="0"/>
-          <w:numId w:val="4"/>
+          <w:numId w:val="7"/>
         </w:numPr>
         <w:tabs>
           <w:tab w:val="left" w:leader="none" w:pos="540"/>
@@ -519,6 +519,492 @@
     <w:p>
       <w:pPr>
         <w:pStyle w:val="Heading1"/>
+        <w:numPr>
+          <w:ilvl w:val="0"/>
+          <w:numId w:val="7"/>
+        </w:numPr>
+        <w:tabs>
+          <w:tab w:val="left" w:leader="none" w:pos="540"/>
+        </w:tabs>
+        <w:ind w:left="540" w:hanging="540"/>
+        <w:jc w:val="left"/>
+        <w:rPr>
+          <w:rFonts w:ascii="Calibri" w:cs="Calibri" w:eastAsia="Calibri" w:hAnsi="Calibri"/>
+          <w:sz w:val="22"/>
+          <w:szCs w:val="22"/>
+        </w:rPr>
+      </w:pPr>
+      <w:r>
+        <w:rPr>
+          <w:rFonts w:ascii="Calibri" w:cs="Calibri" w:eastAsia="Calibri" w:hAnsi="Calibri"/>
+          <w:sz w:val="22"/>
+          <w:szCs w:val="22"/>
+          <w:rtl w:val="0"/>
+        </w:rPr>
+        <w:t xml:space="preserve">Course Prerequisites</w:t>
+      </w:r>
+    </w:p>
+    <w:p>
+      <w:pPr>
+        <w:ind w:left="540" w:firstLine="0"/>
+        <w:rPr>
+          <w:rFonts w:ascii="Calibri" w:cs="Calibri" w:eastAsia="Calibri" w:hAnsi="Calibri"/>
+          <w:sz w:val="22"/>
+          <w:szCs w:val="22"/>
+        </w:rPr>
+      </w:pPr>
+      <w:r>
+        <w:rPr>
+          <w:rFonts w:ascii="Calibri" w:cs="Calibri" w:eastAsia="Calibri" w:hAnsi="Calibri"/>
+          <w:sz w:val="22"/>
+          <w:szCs w:val="22"/>
+          <w:rtl w:val="0"/>
+        </w:rPr>
+        <w:t xml:space="preserve">Undergraduate Students</w:t>
+      </w:r>
+      <w:r>
+        <w:rPr>
+          <w:rFonts w:ascii="Calibri" w:cs="Calibri" w:eastAsia="Calibri" w:hAnsi="Calibri"/>
+          <w:b w:val="1"/>
+          <w:sz w:val="22"/>
+          <w:szCs w:val="22"/>
+          <w:rtl w:val="0"/>
+        </w:rPr>
+        <w:t xml:space="preserve">: </w:t>
+      </w:r>
+      <w:r>
+        <w:rPr>
+          <w:rFonts w:ascii="Calibri" w:cs="Calibri" w:eastAsia="Calibri" w:hAnsi="Calibri"/>
+          <w:sz w:val="22"/>
+          <w:szCs w:val="22"/>
+          <w:rtl w:val="0"/>
+        </w:rPr>
+        <w:t xml:space="preserve">PCB 3043 or equivalent, or consent </w:t>
+      </w:r>
+      <w:r>
+        <w:rPr>
+          <w:rFonts w:ascii="Calibri" w:cs="Calibri" w:eastAsia="Calibri" w:hAnsi="Calibri"/>
+          <w:sz w:val="22"/>
+          <w:szCs w:val="22"/>
+          <w:rtl w:val="0"/>
+        </w:rPr>
+        <w:t xml:space="preserve">of instructor</w:t>
+      </w:r>
+      <w:r>
+        <w:rPr>
+          <w:rFonts w:ascii="Calibri" w:cs="Calibri" w:eastAsia="Calibri" w:hAnsi="Calibri"/>
+          <w:sz w:val="22"/>
+          <w:szCs w:val="22"/>
+          <w:rtl w:val="0"/>
+        </w:rPr>
+        <w:t xml:space="preserve">.</w:t>
+      </w:r>
+    </w:p>
+    <w:p>
+      <w:pPr>
+        <w:ind w:left="540" w:firstLine="0"/>
+        <w:rPr>
+          <w:rFonts w:ascii="Calibri" w:cs="Calibri" w:eastAsia="Calibri" w:hAnsi="Calibri"/>
+          <w:sz w:val="22"/>
+          <w:szCs w:val="22"/>
+        </w:rPr>
+      </w:pPr>
+      <w:r>
+        <w:rPr>
+          <w:rFonts w:ascii="Calibri" w:cs="Calibri" w:eastAsia="Calibri" w:hAnsi="Calibri"/>
+          <w:sz w:val="22"/>
+          <w:szCs w:val="22"/>
+          <w:rtl w:val="0"/>
+        </w:rPr>
+        <w:t xml:space="preserve">Graduate Students: None</w:t>
+      </w:r>
+    </w:p>
+    <w:p>
+      <w:pPr>
+        <w:rPr>
+          <w:rFonts w:ascii="Calibri" w:cs="Calibri" w:eastAsia="Calibri" w:hAnsi="Calibri"/>
+          <w:sz w:val="22"/>
+          <w:szCs w:val="22"/>
+        </w:rPr>
+      </w:pPr>
+      <w:r>
+        <w:rPr>
+          <w:rtl w:val="0"/>
+        </w:rPr>
+      </w:r>
+    </w:p>
+    <w:p>
+      <w:pPr>
+        <w:pStyle w:val="Heading1"/>
+        <w:numPr>
+          <w:ilvl w:val="0"/>
+          <w:numId w:val="7"/>
+        </w:numPr>
+        <w:tabs>
+          <w:tab w:val="left" w:leader="none" w:pos="540"/>
+        </w:tabs>
+        <w:ind w:left="540" w:hanging="540"/>
+        <w:jc w:val="left"/>
+        <w:rPr>
+          <w:rFonts w:ascii="Calibri" w:cs="Calibri" w:eastAsia="Calibri" w:hAnsi="Calibri"/>
+          <w:sz w:val="22"/>
+          <w:szCs w:val="22"/>
+        </w:rPr>
+      </w:pPr>
+      <w:r>
+        <w:rPr>
+          <w:rFonts w:ascii="Calibri" w:cs="Calibri" w:eastAsia="Calibri" w:hAnsi="Calibri"/>
+          <w:sz w:val="22"/>
+          <w:szCs w:val="22"/>
+          <w:rtl w:val="0"/>
+        </w:rPr>
+        <w:t xml:space="preserve">Course Purpose </w:t>
+      </w:r>
+      <w:r>
+        <w:rPr>
+          <w:rtl w:val="0"/>
+        </w:rPr>
+      </w:r>
+    </w:p>
+    <w:p>
+      <w:pPr>
+        <w:ind w:left="540" w:firstLine="0"/>
+        <w:rPr>
+          <w:rFonts w:ascii="Calibri" w:cs="Calibri" w:eastAsia="Calibri" w:hAnsi="Calibri"/>
+          <w:sz w:val="22"/>
+          <w:szCs w:val="22"/>
+        </w:rPr>
+      </w:pPr>
+      <w:r>
+        <w:rPr>
+          <w:rFonts w:ascii="Calibri" w:cs="Calibri" w:eastAsia="Calibri" w:hAnsi="Calibri"/>
+          <w:sz w:val="22"/>
+          <w:szCs w:val="22"/>
+          <w:rtl w:val="0"/>
+        </w:rPr>
+        <w:t xml:space="preserve">Community ecology is focused on biological diversity, including its distribution, origin, maintenance, and consequences. Historically, much of this work has focused on understanding current biodiversity, but with the increasing impacts of global change, community ecology is expanding to place greater emphasis on prediction and forecasting.  Further, community ecology concepts and tools are increasingly being integrated into other fields: global climate models integrate plant traits and distributions, human health and medicine use tools from community ecology to understand disease spread and coexistence, agriculture uses community ecology ideas to understand productivity and pest dynamics, conservation biology and ecological restoration are informed by community ecology (and provide experimental tests of community ecology theory), community ecology has reshaped our understanding of human history and anthropology, and even the business world is increasingly interested in community ecology as the carbon and biodiversity credit markets grow.</w:t>
+      </w:r>
+    </w:p>
+    <w:p>
+      <w:pPr>
+        <w:ind w:left="540" w:firstLine="0"/>
+        <w:rPr>
+          <w:rFonts w:ascii="Calibri" w:cs="Calibri" w:eastAsia="Calibri" w:hAnsi="Calibri"/>
+          <w:sz w:val="22"/>
+          <w:szCs w:val="22"/>
+        </w:rPr>
+      </w:pPr>
+      <w:r>
+        <w:rPr>
+          <w:rtl w:val="0"/>
+        </w:rPr>
+      </w:r>
+    </w:p>
+    <w:p>
+      <w:pPr>
+        <w:pStyle w:val="Heading1"/>
+        <w:numPr>
+          <w:ilvl w:val="0"/>
+          <w:numId w:val="7"/>
+        </w:numPr>
+        <w:tabs>
+          <w:tab w:val="left" w:leader="none" w:pos="540"/>
+        </w:tabs>
+        <w:ind w:left="540" w:hanging="540"/>
+        <w:jc w:val="left"/>
+        <w:rPr>
+          <w:rFonts w:ascii="Calibri" w:cs="Calibri" w:eastAsia="Calibri" w:hAnsi="Calibri"/>
+          <w:sz w:val="22"/>
+          <w:szCs w:val="22"/>
+        </w:rPr>
+      </w:pPr>
+      <w:bookmarkStart w:colFirst="0" w:colLast="0" w:name="_heading=h.gjdgxs" w:id="0"/>
+      <w:bookmarkEnd w:id="0"/>
+      <w:r>
+        <w:rPr>
+          <w:rFonts w:ascii="Calibri" w:cs="Calibri" w:eastAsia="Calibri" w:hAnsi="Calibri"/>
+          <w:sz w:val="22"/>
+          <w:szCs w:val="22"/>
+          <w:rtl w:val="0"/>
+        </w:rPr>
+        <w:t xml:space="preserve">Course Format</w:t>
+      </w:r>
+      <w:r>
+        <w:rPr>
+          <w:rtl w:val="0"/>
+        </w:rPr>
+      </w:r>
+    </w:p>
+    <w:p>
+      <w:pPr>
+        <w:ind w:left="540" w:firstLine="0"/>
+        <w:rPr>
+          <w:rFonts w:ascii="Calibri" w:cs="Calibri" w:eastAsia="Calibri" w:hAnsi="Calibri"/>
+          <w:sz w:val="22"/>
+          <w:szCs w:val="22"/>
+        </w:rPr>
+      </w:pPr>
+      <w:r>
+        <w:rPr>
+          <w:rFonts w:ascii="Calibri" w:cs="Calibri" w:eastAsia="Calibri" w:hAnsi="Calibri"/>
+          <w:sz w:val="22"/>
+          <w:szCs w:val="22"/>
+          <w:rtl w:val="0"/>
+        </w:rPr>
+        <w:t xml:space="preserve">Classes will be a combination of lecture, discussion, and student presentations. Assignments are designed to (1) reinforce and expand upon concepts and ideas from class, (2) encourage students to better understand their own study system (or a system of their choice) through the lens of community ecology, and (3) strengthen skills that are important for success in the natural sciences (and related fields).</w:t>
+      </w:r>
+    </w:p>
+    <w:p>
+      <w:pPr>
+        <w:rPr>
+          <w:rFonts w:ascii="Calibri" w:cs="Calibri" w:eastAsia="Calibri" w:hAnsi="Calibri"/>
+          <w:sz w:val="22"/>
+          <w:szCs w:val="22"/>
+        </w:rPr>
+      </w:pPr>
+      <w:r>
+        <w:rPr>
+          <w:rtl w:val="0"/>
+        </w:rPr>
+      </w:r>
+    </w:p>
+    <w:p>
+      <w:pPr>
+        <w:pStyle w:val="Heading1"/>
+        <w:numPr>
+          <w:ilvl w:val="0"/>
+          <w:numId w:val="7"/>
+        </w:numPr>
+        <w:tabs>
+          <w:tab w:val="left" w:leader="none" w:pos="540"/>
+        </w:tabs>
+        <w:ind w:left="540" w:hanging="540"/>
+        <w:jc w:val="left"/>
+        <w:rPr>
+          <w:rFonts w:ascii="Calibri" w:cs="Calibri" w:eastAsia="Calibri" w:hAnsi="Calibri"/>
+          <w:sz w:val="22"/>
+          <w:szCs w:val="22"/>
+        </w:rPr>
+      </w:pPr>
+      <w:r>
+        <w:rPr>
+          <w:rFonts w:ascii="Calibri" w:cs="Calibri" w:eastAsia="Calibri" w:hAnsi="Calibri"/>
+          <w:sz w:val="22"/>
+          <w:szCs w:val="22"/>
+          <w:rtl w:val="0"/>
+        </w:rPr>
+        <w:t xml:space="preserve">Student Learning Outcomes</w:t>
+      </w:r>
+    </w:p>
+    <w:p>
+      <w:pPr>
+        <w:ind w:left="540" w:firstLine="0"/>
+        <w:rPr>
+          <w:rFonts w:ascii="Calibri" w:cs="Calibri" w:eastAsia="Calibri" w:hAnsi="Calibri"/>
+          <w:i w:val="1"/>
+          <w:sz w:val="22"/>
+          <w:szCs w:val="22"/>
+        </w:rPr>
+      </w:pPr>
+      <w:r>
+        <w:rPr>
+          <w:rtl w:val="0"/>
+        </w:rPr>
+      </w:r>
+    </w:p>
+    <w:p>
+      <w:pPr>
+        <w:numPr>
+          <w:ilvl w:val="0"/>
+          <w:numId w:val="10"/>
+        </w:numPr>
+        <w:ind w:left="720" w:hanging="360"/>
+        <w:rPr>
+          <w:rFonts w:ascii="Calibri" w:cs="Calibri" w:eastAsia="Calibri" w:hAnsi="Calibri"/>
+          <w:sz w:val="22"/>
+          <w:szCs w:val="22"/>
+          <w:u w:val="none"/>
+        </w:rPr>
+      </w:pPr>
+      <w:r>
+        <w:rPr>
+          <w:rFonts w:ascii="Calibri" w:cs="Calibri" w:eastAsia="Calibri" w:hAnsi="Calibri"/>
+          <w:sz w:val="22"/>
+          <w:szCs w:val="22"/>
+          <w:rtl w:val="0"/>
+        </w:rPr>
+        <w:t xml:space="preserve">Describe some of the major patterns that community ecology seeks to explain</w:t>
+      </w:r>
+    </w:p>
+    <w:p>
+      <w:pPr>
+        <w:numPr>
+          <w:ilvl w:val="0"/>
+          <w:numId w:val="10"/>
+        </w:numPr>
+        <w:ind w:left="720" w:hanging="360"/>
+        <w:rPr>
+          <w:rFonts w:ascii="Calibri" w:cs="Calibri" w:eastAsia="Calibri" w:hAnsi="Calibri"/>
+          <w:sz w:val="22"/>
+          <w:szCs w:val="22"/>
+          <w:u w:val="none"/>
+        </w:rPr>
+      </w:pPr>
+      <w:r>
+        <w:rPr>
+          <w:rFonts w:ascii="Calibri" w:cs="Calibri" w:eastAsia="Calibri" w:hAnsi="Calibri"/>
+          <w:sz w:val="22"/>
+          <w:szCs w:val="22"/>
+          <w:rtl w:val="0"/>
+        </w:rPr>
+        <w:t xml:space="preserve">Describe major theoretical idea/hypotheses/concepts in community ecology</w:t>
+      </w:r>
+    </w:p>
+    <w:p>
+      <w:pPr>
+        <w:numPr>
+          <w:ilvl w:val="0"/>
+          <w:numId w:val="10"/>
+        </w:numPr>
+        <w:ind w:left="720" w:hanging="360"/>
+        <w:rPr>
+          <w:rFonts w:ascii="Calibri" w:cs="Calibri" w:eastAsia="Calibri" w:hAnsi="Calibri"/>
+          <w:sz w:val="22"/>
+          <w:szCs w:val="22"/>
+          <w:u w:val="none"/>
+        </w:rPr>
+      </w:pPr>
+      <w:r>
+        <w:rPr>
+          <w:rFonts w:ascii="Calibri" w:cs="Calibri" w:eastAsia="Calibri" w:hAnsi="Calibri"/>
+          <w:sz w:val="22"/>
+          <w:szCs w:val="22"/>
+          <w:rtl w:val="0"/>
+        </w:rPr>
+        <w:t xml:space="preserve">Propose studies that could tease apart different mechanisms underlying communities</w:t>
+      </w:r>
+    </w:p>
+    <w:p>
+      <w:pPr>
+        <w:numPr>
+          <w:ilvl w:val="0"/>
+          <w:numId w:val="10"/>
+        </w:numPr>
+        <w:ind w:left="720" w:hanging="360"/>
+        <w:rPr>
+          <w:rFonts w:ascii="Calibri" w:cs="Calibri" w:eastAsia="Calibri" w:hAnsi="Calibri"/>
+          <w:sz w:val="22"/>
+          <w:szCs w:val="22"/>
+          <w:u w:val="none"/>
+        </w:rPr>
+      </w:pPr>
+      <w:r>
+        <w:rPr>
+          <w:rFonts w:ascii="Calibri" w:cs="Calibri" w:eastAsia="Calibri" w:hAnsi="Calibri"/>
+          <w:sz w:val="22"/>
+          <w:szCs w:val="22"/>
+          <w:rtl w:val="0"/>
+        </w:rPr>
+        <w:t xml:space="preserve">Evaluate the strengths and weaknesses of different approaches/tools</w:t>
+      </w:r>
+    </w:p>
+    <w:p>
+      <w:pPr>
+        <w:numPr>
+          <w:ilvl w:val="0"/>
+          <w:numId w:val="10"/>
+        </w:numPr>
+        <w:ind w:left="720" w:hanging="360"/>
+        <w:rPr>
+          <w:rFonts w:ascii="Calibri" w:cs="Calibri" w:eastAsia="Calibri" w:hAnsi="Calibri"/>
+          <w:sz w:val="22"/>
+          <w:szCs w:val="22"/>
+          <w:u w:val="none"/>
+        </w:rPr>
+      </w:pPr>
+      <w:r>
+        <w:rPr>
+          <w:rFonts w:ascii="Calibri" w:cs="Calibri" w:eastAsia="Calibri" w:hAnsi="Calibri"/>
+          <w:sz w:val="22"/>
+          <w:szCs w:val="22"/>
+          <w:rtl w:val="0"/>
+        </w:rPr>
+        <w:t xml:space="preserve">Apply the concepts of community ecology to your own work</w:t>
+      </w:r>
+    </w:p>
+    <w:p>
+      <w:pPr>
+        <w:ind w:left="540" w:firstLine="0"/>
+        <w:rPr>
+          <w:rFonts w:ascii="Calibri" w:cs="Calibri" w:eastAsia="Calibri" w:hAnsi="Calibri"/>
+          <w:sz w:val="22"/>
+          <w:szCs w:val="22"/>
+        </w:rPr>
+      </w:pPr>
+      <w:r>
+        <w:rPr>
+          <w:rtl w:val="0"/>
+        </w:rPr>
+      </w:r>
+    </w:p>
+    <w:p>
+      <w:pPr>
+        <w:rPr>
+          <w:rFonts w:ascii="Calibri" w:cs="Calibri" w:eastAsia="Calibri" w:hAnsi="Calibri"/>
+          <w:sz w:val="22"/>
+          <w:szCs w:val="22"/>
+        </w:rPr>
+      </w:pPr>
+      <w:r>
+        <w:rPr>
+          <w:rtl w:val="0"/>
+        </w:rPr>
+      </w:r>
+    </w:p>
+    <w:p>
+      <w:pPr>
+        <w:pStyle w:val="Heading1"/>
+        <w:numPr>
+          <w:ilvl w:val="0"/>
+          <w:numId w:val="7"/>
+        </w:numPr>
+        <w:tabs>
+          <w:tab w:val="left" w:leader="none" w:pos="540"/>
+        </w:tabs>
+        <w:ind w:left="540" w:hanging="540"/>
+        <w:jc w:val="left"/>
+        <w:rPr>
+          <w:rFonts w:ascii="Calibri" w:cs="Calibri" w:eastAsia="Calibri" w:hAnsi="Calibri"/>
+          <w:sz w:val="22"/>
+          <w:szCs w:val="22"/>
+        </w:rPr>
+      </w:pPr>
+      <w:r>
+        <w:rPr>
+          <w:rFonts w:ascii="Calibri" w:cs="Calibri" w:eastAsia="Calibri" w:hAnsi="Calibri"/>
+          <w:sz w:val="22"/>
+          <w:szCs w:val="22"/>
+          <w:rtl w:val="0"/>
+        </w:rPr>
+        <w:t xml:space="preserve">Required Texts and/or Readings and Course Materials</w:t>
+      </w:r>
+    </w:p>
+    <w:p>
+      <w:pPr>
+        <w:tabs>
+          <w:tab w:val="left" w:leader="none" w:pos="540"/>
+        </w:tabs>
+        <w:rPr/>
+      </w:pPr>
+      <w:r>
+        <w:rPr>
+          <w:rtl w:val="0"/>
+        </w:rPr>
+        <w:tab/>
+      </w:r>
+    </w:p>
+    <w:p>
+      <w:pPr>
         <w:numPr>
           <w:ilvl w:val="0"/>
           <w:numId w:val="4"/>
@@ -526,26 +1012,79 @@
         <w:tabs>
           <w:tab w:val="left" w:leader="none" w:pos="540"/>
         </w:tabs>
-        <w:ind w:left="540" w:hanging="540"/>
-        <w:jc w:val="left"/>
-        <w:rPr>
-          <w:rFonts w:ascii="Calibri" w:cs="Calibri" w:eastAsia="Calibri" w:hAnsi="Calibri"/>
-          <w:sz w:val="22"/>
-          <w:szCs w:val="22"/>
-        </w:rPr>
-      </w:pPr>
-      <w:r>
-        <w:rPr>
-          <w:rFonts w:ascii="Calibri" w:cs="Calibri" w:eastAsia="Calibri" w:hAnsi="Calibri"/>
-          <w:sz w:val="22"/>
-          <w:szCs w:val="22"/>
-          <w:rtl w:val="0"/>
-        </w:rPr>
-        <w:t xml:space="preserve">Course Prerequisites</w:t>
-      </w:r>
-    </w:p>
-    <w:p>
-      <w:pPr>
+        <w:ind w:left="720" w:hanging="360"/>
+        <w:rPr>
+          <w:rFonts w:ascii="Calibri" w:cs="Calibri" w:eastAsia="Calibri" w:hAnsi="Calibri"/>
+          <w:sz w:val="22"/>
+          <w:szCs w:val="22"/>
+        </w:rPr>
+      </w:pPr>
+      <w:r>
+        <w:rPr>
+          <w:rFonts w:ascii="Calibri" w:cs="Calibri" w:eastAsia="Calibri" w:hAnsi="Calibri"/>
+          <w:sz w:val="22"/>
+          <w:szCs w:val="22"/>
+          <w:rtl w:val="0"/>
+        </w:rPr>
+        <w:t xml:space="preserve">Community Ecology (2nd Edition) by Gary G. Mittelbach and Brian J. McGill (ISBN: 0198835868)</w:t>
+      </w:r>
+    </w:p>
+    <w:p>
+      <w:pPr>
+        <w:tabs>
+          <w:tab w:val="left" w:leader="none" w:pos="540"/>
+        </w:tabs>
+        <w:rPr>
+          <w:rFonts w:ascii="Calibri" w:cs="Calibri" w:eastAsia="Calibri" w:hAnsi="Calibri"/>
+          <w:sz w:val="22"/>
+          <w:szCs w:val="22"/>
+        </w:rPr>
+      </w:pPr>
+      <w:r>
+        <w:rPr>
+          <w:rtl w:val="0"/>
+        </w:rPr>
+      </w:r>
+    </w:p>
+    <w:p>
+      <w:pPr>
+        <w:tabs>
+          <w:tab w:val="left" w:leader="none" w:pos="540"/>
+        </w:tabs>
+        <w:rPr>
+          <w:rFonts w:ascii="Calibri" w:cs="Calibri" w:eastAsia="Calibri" w:hAnsi="Calibri"/>
+          <w:sz w:val="22"/>
+          <w:szCs w:val="22"/>
+        </w:rPr>
+      </w:pPr>
+      <w:r>
+        <w:rPr>
+          <w:rFonts w:ascii="Calibri" w:cs="Calibri" w:eastAsia="Calibri" w:hAnsi="Calibri"/>
+          <w:sz w:val="22"/>
+          <w:szCs w:val="22"/>
+          <w:rtl w:val="0"/>
+        </w:rPr>
+        <w:t xml:space="preserve">In addition to this text, students will select readings from the scientific literature of their choosing.</w:t>
+      </w:r>
+    </w:p>
+    <w:p>
+      <w:pPr>
+        <w:tabs>
+          <w:tab w:val="left" w:leader="none" w:pos="540"/>
+        </w:tabs>
+        <w:rPr/>
+      </w:pPr>
+      <w:r>
+        <w:rPr>
+          <w:rtl w:val="0"/>
+        </w:rPr>
+      </w:r>
+    </w:p>
+    <w:p>
+      <w:pPr>
+        <w:tabs>
+          <w:tab w:val="left" w:leader="none" w:pos="540"/>
+        </w:tabs>
         <w:ind w:left="540" w:firstLine="0"/>
         <w:rPr>
           <w:rFonts w:ascii="Calibri" w:cs="Calibri" w:eastAsia="Calibri" w:hAnsi="Calibri"/>
@@ -555,72 +1094,13 @@
       </w:pPr>
       <w:r>
         <w:rPr>
-          <w:rFonts w:ascii="Calibri" w:cs="Calibri" w:eastAsia="Calibri" w:hAnsi="Calibri"/>
-          <w:sz w:val="22"/>
-          <w:szCs w:val="22"/>
-          <w:rtl w:val="0"/>
-        </w:rPr>
-        <w:t xml:space="preserve">Undergraduate Students</w:t>
-      </w:r>
-      <w:r>
-        <w:rPr>
-          <w:rFonts w:ascii="Calibri" w:cs="Calibri" w:eastAsia="Calibri" w:hAnsi="Calibri"/>
-          <w:b w:val="1"/>
-          <w:sz w:val="22"/>
-          <w:szCs w:val="22"/>
-          <w:rtl w:val="0"/>
-        </w:rPr>
-        <w:t xml:space="preserve">: </w:t>
-      </w:r>
-      <w:r>
-        <w:rPr>
-          <w:rFonts w:ascii="Calibri" w:cs="Calibri" w:eastAsia="Calibri" w:hAnsi="Calibri"/>
-          <w:sz w:val="22"/>
-          <w:szCs w:val="22"/>
-          <w:rtl w:val="0"/>
-        </w:rPr>
-        <w:t xml:space="preserve">PCB 3043 or equivalent, or consent </w:t>
-      </w:r>
-      <w:r>
-        <w:rPr>
-          <w:rFonts w:ascii="Calibri" w:cs="Calibri" w:eastAsia="Calibri" w:hAnsi="Calibri"/>
-          <w:sz w:val="22"/>
-          <w:szCs w:val="22"/>
-          <w:rtl w:val="0"/>
-        </w:rPr>
-        <w:t xml:space="preserve">of instructor</w:t>
-      </w:r>
-      <w:r>
-        <w:rPr>
-          <w:rFonts w:ascii="Calibri" w:cs="Calibri" w:eastAsia="Calibri" w:hAnsi="Calibri"/>
-          <w:sz w:val="22"/>
-          <w:szCs w:val="22"/>
-          <w:rtl w:val="0"/>
-        </w:rPr>
-        <w:t xml:space="preserve">.</w:t>
+          <w:rtl w:val="0"/>
+        </w:rPr>
       </w:r>
     </w:p>
     <w:p>
       <w:pPr>
         <w:ind w:left="540" w:firstLine="0"/>
-        <w:rPr>
-          <w:rFonts w:ascii="Calibri" w:cs="Calibri" w:eastAsia="Calibri" w:hAnsi="Calibri"/>
-          <w:sz w:val="22"/>
-          <w:szCs w:val="22"/>
-        </w:rPr>
-      </w:pPr>
-      <w:r>
-        <w:rPr>
-          <w:rFonts w:ascii="Calibri" w:cs="Calibri" w:eastAsia="Calibri" w:hAnsi="Calibri"/>
-          <w:sz w:val="22"/>
-          <w:szCs w:val="22"/>
-          <w:rtl w:val="0"/>
-        </w:rPr>
-        <w:t xml:space="preserve">Graduate Students: None</w:t>
-      </w:r>
-    </w:p>
-    <w:p>
-      <w:pPr>
         <w:rPr>
           <w:rFonts w:ascii="Calibri" w:cs="Calibri" w:eastAsia="Calibri" w:hAnsi="Calibri"/>
           <w:sz w:val="22"/>
@@ -638,7 +1118,7 @@
         <w:pStyle w:val="Heading1"/>
         <w:numPr>
           <w:ilvl w:val="0"/>
-          <w:numId w:val="4"/>
+          <w:numId w:val="7"/>
         </w:numPr>
         <w:tabs>
           <w:tab w:val="left" w:leader="none" w:pos="540"/>
@@ -658,36 +1138,166 @@
           <w:szCs w:val="22"/>
           <w:rtl w:val="0"/>
         </w:rPr>
-        <w:t xml:space="preserve">Course Purpose </w:t>
-      </w:r>
-      <w:r>
-        <w:rPr>
-          <w:rtl w:val="0"/>
-        </w:rPr>
-      </w:r>
-    </w:p>
-    <w:p>
-      <w:pPr>
-        <w:ind w:left="540" w:firstLine="0"/>
-        <w:rPr>
-          <w:rFonts w:ascii="Calibri" w:cs="Calibri" w:eastAsia="Calibri" w:hAnsi="Calibri"/>
-          <w:sz w:val="22"/>
-          <w:szCs w:val="22"/>
-        </w:rPr>
-      </w:pPr>
-      <w:r>
-        <w:rPr>
-          <w:rFonts w:ascii="Calibri" w:cs="Calibri" w:eastAsia="Calibri" w:hAnsi="Calibri"/>
-          <w:sz w:val="22"/>
-          <w:szCs w:val="22"/>
-          <w:rtl w:val="0"/>
-        </w:rPr>
-        <w:t xml:space="preserve">Community ecology is focused on biological diversity, including its distribution, origin, maintenance, and consequences. Historically, much of this work has focused on understanding current biodiversity, but with the increasing impacts of global change, community ecology is expanding to place greater emphasis on prediction and forecasting.  Further, community ecology concepts and tools are increasingly being integrated into other fields: global climate models integrate plant traits and distributions, human health and medicine use tools from community ecology to understand disease spread and coexistence, agriculture uses community ecology ideas to understand productivity and pest dynamics, conservation biology and ecological restoration are informed by community ecology (and provide experimental tests of community ecology theory), community ecology has reshaped our understanding of human history and anthropology, and even the business world is increasingly interested in community ecology as the carbon and biodiversity credit markets grow.</w:t>
-      </w:r>
-    </w:p>
-    <w:p>
-      <w:pPr>
-        <w:ind w:left="540" w:firstLine="0"/>
+        <w:t xml:space="preserve">Grading Scale</w:t>
+      </w:r>
+    </w:p>
+    <w:p>
+      <w:pPr>
+        <w:ind w:left="720" w:firstLine="0"/>
+        <w:rPr>
+          <w:rFonts w:ascii="Calibri" w:cs="Calibri" w:eastAsia="Calibri" w:hAnsi="Calibri"/>
+          <w:sz w:val="22"/>
+          <w:szCs w:val="22"/>
+        </w:rPr>
+      </w:pPr>
+      <w:r>
+        <w:rPr>
+          <w:rtl w:val="0"/>
+        </w:rPr>
+      </w:r>
+    </w:p>
+    <w:p>
+      <w:pPr>
+        <w:ind w:left="720" w:firstLine="0"/>
+        <w:rPr>
+          <w:rFonts w:ascii="Calibri" w:cs="Calibri" w:eastAsia="Calibri" w:hAnsi="Calibri"/>
+          <w:sz w:val="22"/>
+          <w:szCs w:val="22"/>
+        </w:rPr>
+      </w:pPr>
+      <w:r>
+        <w:rPr>
+          <w:rFonts w:ascii="Calibri" w:cs="Calibri" w:eastAsia="Calibri" w:hAnsi="Calibri"/>
+          <w:sz w:val="22"/>
+          <w:szCs w:val="22"/>
+          <w:rtl w:val="0"/>
+        </w:rPr>
+        <w:t xml:space="preserve">Grading Scale (%)</w:t>
+      </w:r>
+    </w:p>
+    <w:p>
+      <w:pPr>
+        <w:tabs>
+          <w:tab w:val="left" w:leader="none" w:pos="1800"/>
+        </w:tabs>
+        <w:ind w:left="720" w:firstLine="0"/>
+        <w:rPr>
+          <w:rFonts w:ascii="Calibri" w:cs="Calibri" w:eastAsia="Calibri" w:hAnsi="Calibri"/>
+          <w:sz w:val="22"/>
+          <w:szCs w:val="22"/>
+        </w:rPr>
+      </w:pPr>
+      <w:r>
+        <w:rPr>
+          <w:rFonts w:ascii="Calibri" w:cs="Calibri" w:eastAsia="Calibri" w:hAnsi="Calibri"/>
+          <w:sz w:val="22"/>
+          <w:szCs w:val="22"/>
+          <w:rtl w:val="0"/>
+        </w:rPr>
+        <w:t xml:space="preserve">90-100</w:t>
+        <w:tab/>
+        <w:t xml:space="preserve">A</w:t>
+      </w:r>
+    </w:p>
+    <w:p>
+      <w:pPr>
+        <w:tabs>
+          <w:tab w:val="left" w:leader="none" w:pos="1800"/>
+        </w:tabs>
+        <w:ind w:left="720" w:firstLine="0"/>
+        <w:rPr>
+          <w:rFonts w:ascii="Calibri" w:cs="Calibri" w:eastAsia="Calibri" w:hAnsi="Calibri"/>
+          <w:sz w:val="22"/>
+          <w:szCs w:val="22"/>
+        </w:rPr>
+      </w:pPr>
+      <w:r>
+        <w:rPr>
+          <w:rFonts w:ascii="Calibri" w:cs="Calibri" w:eastAsia="Calibri" w:hAnsi="Calibri"/>
+          <w:sz w:val="22"/>
+          <w:szCs w:val="22"/>
+          <w:rtl w:val="0"/>
+        </w:rPr>
+        <w:t xml:space="preserve">80 - 89</w:t>
+        <w:tab/>
+        <w:t xml:space="preserve">B</w:t>
+      </w:r>
+    </w:p>
+    <w:p>
+      <w:pPr>
+        <w:tabs>
+          <w:tab w:val="left" w:leader="none" w:pos="1800"/>
+        </w:tabs>
+        <w:ind w:left="720" w:firstLine="0"/>
+        <w:rPr>
+          <w:rFonts w:ascii="Calibri" w:cs="Calibri" w:eastAsia="Calibri" w:hAnsi="Calibri"/>
+          <w:sz w:val="22"/>
+          <w:szCs w:val="22"/>
+        </w:rPr>
+      </w:pPr>
+      <w:r>
+        <w:rPr>
+          <w:rFonts w:ascii="Calibri" w:cs="Calibri" w:eastAsia="Calibri" w:hAnsi="Calibri"/>
+          <w:sz w:val="22"/>
+          <w:szCs w:val="22"/>
+          <w:rtl w:val="0"/>
+        </w:rPr>
+        <w:t xml:space="preserve">70 - 79</w:t>
+        <w:tab/>
+        <w:t xml:space="preserve">C</w:t>
+      </w:r>
+    </w:p>
+    <w:p>
+      <w:pPr>
+        <w:tabs>
+          <w:tab w:val="left" w:leader="none" w:pos="1800"/>
+        </w:tabs>
+        <w:ind w:left="720" w:firstLine="0"/>
+        <w:rPr>
+          <w:rFonts w:ascii="Calibri" w:cs="Calibri" w:eastAsia="Calibri" w:hAnsi="Calibri"/>
+          <w:sz w:val="22"/>
+          <w:szCs w:val="22"/>
+        </w:rPr>
+      </w:pPr>
+      <w:r>
+        <w:rPr>
+          <w:rFonts w:ascii="Calibri" w:cs="Calibri" w:eastAsia="Calibri" w:hAnsi="Calibri"/>
+          <w:sz w:val="22"/>
+          <w:szCs w:val="22"/>
+          <w:rtl w:val="0"/>
+        </w:rPr>
+        <w:t xml:space="preserve">60 - 69</w:t>
+        <w:tab/>
+        <w:t xml:space="preserve">D</w:t>
+      </w:r>
+    </w:p>
+    <w:p>
+      <w:pPr>
+        <w:tabs>
+          <w:tab w:val="left" w:leader="none" w:pos="1800"/>
+        </w:tabs>
+        <w:ind w:left="720" w:firstLine="0"/>
+        <w:rPr>
+          <w:rFonts w:ascii="Calibri" w:cs="Calibri" w:eastAsia="Calibri" w:hAnsi="Calibri"/>
+          <w:sz w:val="22"/>
+          <w:szCs w:val="22"/>
+        </w:rPr>
+      </w:pPr>
+      <w:r>
+        <w:rPr>
+          <w:rFonts w:ascii="Calibri" w:cs="Calibri" w:eastAsia="Calibri" w:hAnsi="Calibri"/>
+          <w:sz w:val="22"/>
+          <w:szCs w:val="22"/>
+          <w:rtl w:val="0"/>
+        </w:rPr>
+        <w:t xml:space="preserve">0 - 59</w:t>
+        <w:tab/>
+        <w:t xml:space="preserve">F</w:t>
+      </w:r>
+    </w:p>
+    <w:p>
+      <w:pPr>
+        <w:jc w:val="both"/>
         <w:rPr>
           <w:rFonts w:ascii="Calibri" w:cs="Calibri" w:eastAsia="Calibri" w:hAnsi="Calibri"/>
           <w:sz w:val="22"/>
@@ -705,7 +1315,7 @@
         <w:pStyle w:val="Heading1"/>
         <w:numPr>
           <w:ilvl w:val="0"/>
-          <w:numId w:val="4"/>
+          <w:numId w:val="7"/>
         </w:numPr>
         <w:tabs>
           <w:tab w:val="left" w:leader="none" w:pos="540"/>
@@ -718,616 +1328,6 @@
           <w:szCs w:val="22"/>
         </w:rPr>
       </w:pPr>
-      <w:bookmarkStart w:colFirst="0" w:colLast="0" w:name="_heading=h.gjdgxs" w:id="0"/>
-      <w:bookmarkEnd w:id="0"/>
-      <w:r>
-        <w:rPr>
-          <w:rFonts w:ascii="Calibri" w:cs="Calibri" w:eastAsia="Calibri" w:hAnsi="Calibri"/>
-          <w:sz w:val="22"/>
-          <w:szCs w:val="22"/>
-          <w:rtl w:val="0"/>
-        </w:rPr>
-        <w:t xml:space="preserve">Course Format</w:t>
-      </w:r>
-      <w:r>
-        <w:rPr>
-          <w:rtl w:val="0"/>
-        </w:rPr>
-      </w:r>
-    </w:p>
-    <w:p>
-      <w:pPr>
-        <w:ind w:left="540" w:firstLine="0"/>
-        <w:rPr>
-          <w:rFonts w:ascii="Calibri" w:cs="Calibri" w:eastAsia="Calibri" w:hAnsi="Calibri"/>
-          <w:sz w:val="22"/>
-          <w:szCs w:val="22"/>
-        </w:rPr>
-      </w:pPr>
-      <w:r>
-        <w:rPr>
-          <w:rFonts w:ascii="Calibri" w:cs="Calibri" w:eastAsia="Calibri" w:hAnsi="Calibri"/>
-          <w:sz w:val="22"/>
-          <w:szCs w:val="22"/>
-          <w:rtl w:val="0"/>
-        </w:rPr>
-        <w:t xml:space="preserve">Classes will be a combination of lecture, discussion, and student presentations. Assignments are designed to (1) reinforce and expand upon concepts and ideas from class, (2) encourage students to better understand their own study system (or a system of their choice) through the lens of community ecology, and (3) strengthen skills that are important for success in the natural sciences (and related fields).</w:t>
-      </w:r>
-    </w:p>
-    <w:p>
-      <w:pPr>
-        <w:rPr>
-          <w:rFonts w:ascii="Calibri" w:cs="Calibri" w:eastAsia="Calibri" w:hAnsi="Calibri"/>
-          <w:sz w:val="22"/>
-          <w:szCs w:val="22"/>
-        </w:rPr>
-      </w:pPr>
-      <w:r>
-        <w:rPr>
-          <w:rtl w:val="0"/>
-        </w:rPr>
-      </w:r>
-    </w:p>
-    <w:p>
-      <w:pPr>
-        <w:pStyle w:val="Heading1"/>
-        <w:numPr>
-          <w:ilvl w:val="0"/>
-          <w:numId w:val="4"/>
-        </w:numPr>
-        <w:tabs>
-          <w:tab w:val="left" w:leader="none" w:pos="540"/>
-        </w:tabs>
-        <w:ind w:left="540" w:hanging="540"/>
-        <w:jc w:val="left"/>
-        <w:rPr>
-          <w:rFonts w:ascii="Calibri" w:cs="Calibri" w:eastAsia="Calibri" w:hAnsi="Calibri"/>
-          <w:sz w:val="22"/>
-          <w:szCs w:val="22"/>
-        </w:rPr>
-      </w:pPr>
-      <w:r>
-        <w:rPr>
-          <w:rFonts w:ascii="Calibri" w:cs="Calibri" w:eastAsia="Calibri" w:hAnsi="Calibri"/>
-          <w:sz w:val="22"/>
-          <w:szCs w:val="22"/>
-          <w:rtl w:val="0"/>
-        </w:rPr>
-        <w:t xml:space="preserve">Student Learning Outcomes</w:t>
-      </w:r>
-    </w:p>
-    <w:p>
-      <w:pPr>
-        <w:ind w:left="540" w:firstLine="0"/>
-        <w:rPr>
-          <w:rFonts w:ascii="Calibri" w:cs="Calibri" w:eastAsia="Calibri" w:hAnsi="Calibri"/>
-          <w:i w:val="1"/>
-          <w:sz w:val="22"/>
-          <w:szCs w:val="22"/>
-        </w:rPr>
-      </w:pPr>
-      <w:r>
-        <w:rPr>
-          <w:rtl w:val="0"/>
-        </w:rPr>
-      </w:r>
-    </w:p>
-    <w:p>
-      <w:pPr>
-        <w:numPr>
-          <w:ilvl w:val="0"/>
-          <w:numId w:val="5"/>
-        </w:numPr>
-        <w:ind w:left="720" w:hanging="360"/>
-        <w:rPr>
-          <w:rFonts w:ascii="Calibri" w:cs="Calibri" w:eastAsia="Calibri" w:hAnsi="Calibri"/>
-          <w:sz w:val="22"/>
-          <w:szCs w:val="22"/>
-          <w:u w:val="none"/>
-        </w:rPr>
-      </w:pPr>
-      <w:r>
-        <w:rPr>
-          <w:rFonts w:ascii="Calibri" w:cs="Calibri" w:eastAsia="Calibri" w:hAnsi="Calibri"/>
-          <w:sz w:val="22"/>
-          <w:szCs w:val="22"/>
-          <w:rtl w:val="0"/>
-        </w:rPr>
-        <w:t xml:space="preserve">Describe some of the major patterns that community ecology seeks to explain</w:t>
-      </w:r>
-    </w:p>
-    <w:p>
-      <w:pPr>
-        <w:numPr>
-          <w:ilvl w:val="0"/>
-          <w:numId w:val="5"/>
-        </w:numPr>
-        <w:ind w:left="720" w:hanging="360"/>
-        <w:rPr>
-          <w:rFonts w:ascii="Calibri" w:cs="Calibri" w:eastAsia="Calibri" w:hAnsi="Calibri"/>
-          <w:sz w:val="22"/>
-          <w:szCs w:val="22"/>
-          <w:u w:val="none"/>
-        </w:rPr>
-      </w:pPr>
-      <w:r>
-        <w:rPr>
-          <w:rFonts w:ascii="Calibri" w:cs="Calibri" w:eastAsia="Calibri" w:hAnsi="Calibri"/>
-          <w:sz w:val="22"/>
-          <w:szCs w:val="22"/>
-          <w:rtl w:val="0"/>
-        </w:rPr>
-        <w:t xml:space="preserve">Describe major theoretical idea/hypotheses/concepts in community ecology</w:t>
-      </w:r>
-    </w:p>
-    <w:p>
-      <w:pPr>
-        <w:numPr>
-          <w:ilvl w:val="0"/>
-          <w:numId w:val="5"/>
-        </w:numPr>
-        <w:ind w:left="720" w:hanging="360"/>
-        <w:rPr>
-          <w:rFonts w:ascii="Calibri" w:cs="Calibri" w:eastAsia="Calibri" w:hAnsi="Calibri"/>
-          <w:sz w:val="22"/>
-          <w:szCs w:val="22"/>
-          <w:u w:val="none"/>
-        </w:rPr>
-      </w:pPr>
-      <w:r>
-        <w:rPr>
-          <w:rFonts w:ascii="Calibri" w:cs="Calibri" w:eastAsia="Calibri" w:hAnsi="Calibri"/>
-          <w:sz w:val="22"/>
-          <w:szCs w:val="22"/>
-          <w:rtl w:val="0"/>
-        </w:rPr>
-        <w:t xml:space="preserve">Propose studies that could tease apart different mechanisms underlying communities</w:t>
-      </w:r>
-    </w:p>
-    <w:p>
-      <w:pPr>
-        <w:numPr>
-          <w:ilvl w:val="0"/>
-          <w:numId w:val="5"/>
-        </w:numPr>
-        <w:ind w:left="720" w:hanging="360"/>
-        <w:rPr>
-          <w:rFonts w:ascii="Calibri" w:cs="Calibri" w:eastAsia="Calibri" w:hAnsi="Calibri"/>
-          <w:sz w:val="22"/>
-          <w:szCs w:val="22"/>
-          <w:u w:val="none"/>
-        </w:rPr>
-      </w:pPr>
-      <w:r>
-        <w:rPr>
-          <w:rFonts w:ascii="Calibri" w:cs="Calibri" w:eastAsia="Calibri" w:hAnsi="Calibri"/>
-          <w:sz w:val="22"/>
-          <w:szCs w:val="22"/>
-          <w:rtl w:val="0"/>
-        </w:rPr>
-        <w:t xml:space="preserve">Evaluate the strengths and weaknesses of different approaches/tools</w:t>
-      </w:r>
-    </w:p>
-    <w:p>
-      <w:pPr>
-        <w:numPr>
-          <w:ilvl w:val="0"/>
-          <w:numId w:val="5"/>
-        </w:numPr>
-        <w:ind w:left="720" w:hanging="360"/>
-        <w:rPr>
-          <w:rFonts w:ascii="Calibri" w:cs="Calibri" w:eastAsia="Calibri" w:hAnsi="Calibri"/>
-          <w:sz w:val="22"/>
-          <w:szCs w:val="22"/>
-          <w:u w:val="none"/>
-        </w:rPr>
-      </w:pPr>
-      <w:r>
-        <w:rPr>
-          <w:rFonts w:ascii="Calibri" w:cs="Calibri" w:eastAsia="Calibri" w:hAnsi="Calibri"/>
-          <w:sz w:val="22"/>
-          <w:szCs w:val="22"/>
-          <w:rtl w:val="0"/>
-        </w:rPr>
-        <w:t xml:space="preserve">Apply the concepts of community ecology to your own work</w:t>
-      </w:r>
-    </w:p>
-    <w:p>
-      <w:pPr>
-        <w:ind w:left="540" w:firstLine="0"/>
-        <w:rPr>
-          <w:rFonts w:ascii="Calibri" w:cs="Calibri" w:eastAsia="Calibri" w:hAnsi="Calibri"/>
-          <w:sz w:val="22"/>
-          <w:szCs w:val="22"/>
-        </w:rPr>
-      </w:pPr>
-      <w:r>
-        <w:rPr>
-          <w:rtl w:val="0"/>
-        </w:rPr>
-      </w:r>
-    </w:p>
-    <w:p>
-      <w:pPr>
-        <w:rPr>
-          <w:rFonts w:ascii="Calibri" w:cs="Calibri" w:eastAsia="Calibri" w:hAnsi="Calibri"/>
-          <w:sz w:val="22"/>
-          <w:szCs w:val="22"/>
-        </w:rPr>
-      </w:pPr>
-      <w:r>
-        <w:rPr>
-          <w:rtl w:val="0"/>
-        </w:rPr>
-      </w:r>
-    </w:p>
-    <w:p>
-      <w:pPr>
-        <w:pStyle w:val="Heading1"/>
-        <w:numPr>
-          <w:ilvl w:val="0"/>
-          <w:numId w:val="4"/>
-        </w:numPr>
-        <w:tabs>
-          <w:tab w:val="left" w:leader="none" w:pos="540"/>
-        </w:tabs>
-        <w:ind w:left="540" w:hanging="540"/>
-        <w:jc w:val="left"/>
-        <w:rPr>
-          <w:rFonts w:ascii="Calibri" w:cs="Calibri" w:eastAsia="Calibri" w:hAnsi="Calibri"/>
-          <w:sz w:val="22"/>
-          <w:szCs w:val="22"/>
-        </w:rPr>
-      </w:pPr>
-      <w:r>
-        <w:rPr>
-          <w:rFonts w:ascii="Calibri" w:cs="Calibri" w:eastAsia="Calibri" w:hAnsi="Calibri"/>
-          <w:sz w:val="22"/>
-          <w:szCs w:val="22"/>
-          <w:rtl w:val="0"/>
-        </w:rPr>
-        <w:t xml:space="preserve">Required Texts and/or Readings and Course Materials</w:t>
-      </w:r>
-    </w:p>
-    <w:p>
-      <w:pPr>
-        <w:tabs>
-          <w:tab w:val="left" w:leader="none" w:pos="540"/>
-        </w:tabs>
-        <w:rPr/>
-      </w:pPr>
-      <w:r>
-        <w:rPr>
-          <w:rtl w:val="0"/>
-        </w:rPr>
-        <w:tab/>
-      </w:r>
-    </w:p>
-    <w:p>
-      <w:pPr>
-        <w:numPr>
-          <w:ilvl w:val="0"/>
-          <w:numId w:val="1"/>
-        </w:numPr>
-        <w:tabs>
-          <w:tab w:val="left" w:leader="none" w:pos="540"/>
-        </w:tabs>
-        <w:ind w:left="720" w:hanging="360"/>
-        <w:rPr>
-          <w:rFonts w:ascii="Calibri" w:cs="Calibri" w:eastAsia="Calibri" w:hAnsi="Calibri"/>
-          <w:sz w:val="22"/>
-          <w:szCs w:val="22"/>
-        </w:rPr>
-      </w:pPr>
-      <w:r>
-        <w:rPr>
-          <w:rFonts w:ascii="Calibri" w:cs="Calibri" w:eastAsia="Calibri" w:hAnsi="Calibri"/>
-          <w:sz w:val="22"/>
-          <w:szCs w:val="22"/>
-          <w:rtl w:val="0"/>
-        </w:rPr>
-        <w:t xml:space="preserve">Community Ecology (2nd Edition) by Gary G. Mittelbach and Brian J. McGill (ISBN: 0198835868)</w:t>
-      </w:r>
-    </w:p>
-    <w:p>
-      <w:pPr>
-        <w:tabs>
-          <w:tab w:val="left" w:leader="none" w:pos="540"/>
-        </w:tabs>
-        <w:rPr>
-          <w:rFonts w:ascii="Calibri" w:cs="Calibri" w:eastAsia="Calibri" w:hAnsi="Calibri"/>
-          <w:sz w:val="22"/>
-          <w:szCs w:val="22"/>
-        </w:rPr>
-      </w:pPr>
-      <w:r>
-        <w:rPr>
-          <w:rtl w:val="0"/>
-        </w:rPr>
-      </w:r>
-    </w:p>
-    <w:p>
-      <w:pPr>
-        <w:tabs>
-          <w:tab w:val="left" w:leader="none" w:pos="540"/>
-        </w:tabs>
-        <w:rPr>
-          <w:rFonts w:ascii="Calibri" w:cs="Calibri" w:eastAsia="Calibri" w:hAnsi="Calibri"/>
-          <w:sz w:val="22"/>
-          <w:szCs w:val="22"/>
-        </w:rPr>
-      </w:pPr>
-      <w:r>
-        <w:rPr>
-          <w:rFonts w:ascii="Calibri" w:cs="Calibri" w:eastAsia="Calibri" w:hAnsi="Calibri"/>
-          <w:sz w:val="22"/>
-          <w:szCs w:val="22"/>
-          <w:rtl w:val="0"/>
-        </w:rPr>
-        <w:t xml:space="preserve">In addition to this text, students will select readings from the scientific literature of their choosing.</w:t>
-      </w:r>
-    </w:p>
-    <w:p>
-      <w:pPr>
-        <w:tabs>
-          <w:tab w:val="left" w:leader="none" w:pos="540"/>
-        </w:tabs>
-        <w:rPr/>
-      </w:pPr>
-      <w:r>
-        <w:rPr>
-          <w:rtl w:val="0"/>
-        </w:rPr>
-      </w:r>
-    </w:p>
-    <w:p>
-      <w:pPr>
-        <w:tabs>
-          <w:tab w:val="left" w:leader="none" w:pos="540"/>
-        </w:tabs>
-        <w:ind w:left="540" w:firstLine="0"/>
-        <w:rPr>
-          <w:rFonts w:ascii="Calibri" w:cs="Calibri" w:eastAsia="Calibri" w:hAnsi="Calibri"/>
-          <w:sz w:val="22"/>
-          <w:szCs w:val="22"/>
-        </w:rPr>
-      </w:pPr>
-      <w:r>
-        <w:rPr>
-          <w:rtl w:val="0"/>
-        </w:rPr>
-      </w:r>
-    </w:p>
-    <w:p>
-      <w:pPr>
-        <w:ind w:left="540" w:firstLine="0"/>
-        <w:rPr>
-          <w:rFonts w:ascii="Calibri" w:cs="Calibri" w:eastAsia="Calibri" w:hAnsi="Calibri"/>
-          <w:sz w:val="22"/>
-          <w:szCs w:val="22"/>
-        </w:rPr>
-      </w:pPr>
-      <w:r>
-        <w:rPr>
-          <w:rtl w:val="0"/>
-        </w:rPr>
-      </w:r>
-    </w:p>
-    <w:p>
-      <w:pPr>
-        <w:pStyle w:val="Heading1"/>
-        <w:numPr>
-          <w:ilvl w:val="0"/>
-          <w:numId w:val="4"/>
-        </w:numPr>
-        <w:tabs>
-          <w:tab w:val="left" w:leader="none" w:pos="540"/>
-        </w:tabs>
-        <w:ind w:left="540" w:hanging="540"/>
-        <w:jc w:val="left"/>
-        <w:rPr>
-          <w:rFonts w:ascii="Calibri" w:cs="Calibri" w:eastAsia="Calibri" w:hAnsi="Calibri"/>
-          <w:sz w:val="22"/>
-          <w:szCs w:val="22"/>
-        </w:rPr>
-      </w:pPr>
-      <w:r>
-        <w:rPr>
-          <w:rFonts w:ascii="Calibri" w:cs="Calibri" w:eastAsia="Calibri" w:hAnsi="Calibri"/>
-          <w:sz w:val="22"/>
-          <w:szCs w:val="22"/>
-          <w:rtl w:val="0"/>
-        </w:rPr>
-        <w:t xml:space="preserve">Grading Scale</w:t>
-      </w:r>
-    </w:p>
-    <w:p>
-      <w:pPr>
-        <w:ind w:left="720" w:firstLine="0"/>
-        <w:rPr>
-          <w:rFonts w:ascii="Calibri" w:cs="Calibri" w:eastAsia="Calibri" w:hAnsi="Calibri"/>
-          <w:sz w:val="22"/>
-          <w:szCs w:val="22"/>
-        </w:rPr>
-      </w:pPr>
-      <w:r>
-        <w:rPr>
-          <w:rtl w:val="0"/>
-        </w:rPr>
-      </w:r>
-    </w:p>
-    <w:p>
-      <w:pPr>
-        <w:ind w:left="720" w:firstLine="0"/>
-        <w:rPr>
-          <w:rFonts w:ascii="Calibri" w:cs="Calibri" w:eastAsia="Calibri" w:hAnsi="Calibri"/>
-          <w:sz w:val="22"/>
-          <w:szCs w:val="22"/>
-        </w:rPr>
-      </w:pPr>
-      <w:r>
-        <w:rPr>
-          <w:rFonts w:ascii="Calibri" w:cs="Calibri" w:eastAsia="Calibri" w:hAnsi="Calibri"/>
-          <w:sz w:val="22"/>
-          <w:szCs w:val="22"/>
-          <w:rtl w:val="0"/>
-        </w:rPr>
-        <w:t xml:space="preserve">Grading Scale (%)</w:t>
-      </w:r>
-    </w:p>
-    <w:p>
-      <w:pPr>
-        <w:tabs>
-          <w:tab w:val="left" w:leader="none" w:pos="1800"/>
-        </w:tabs>
-        <w:ind w:left="720" w:firstLine="0"/>
-        <w:rPr>
-          <w:rFonts w:ascii="Calibri" w:cs="Calibri" w:eastAsia="Calibri" w:hAnsi="Calibri"/>
-          <w:sz w:val="22"/>
-          <w:szCs w:val="22"/>
-        </w:rPr>
-      </w:pPr>
-      <w:r>
-        <w:rPr>
-          <w:rFonts w:ascii="Calibri" w:cs="Calibri" w:eastAsia="Calibri" w:hAnsi="Calibri"/>
-          <w:sz w:val="22"/>
-          <w:szCs w:val="22"/>
-          <w:rtl w:val="0"/>
-        </w:rPr>
-        <w:t xml:space="preserve">90-100</w:t>
-        <w:tab/>
-        <w:t xml:space="preserve">A</w:t>
-      </w:r>
-    </w:p>
-    <w:p>
-      <w:pPr>
-        <w:tabs>
-          <w:tab w:val="left" w:leader="none" w:pos="1800"/>
-        </w:tabs>
-        <w:ind w:left="720" w:firstLine="0"/>
-        <w:rPr>
-          <w:rFonts w:ascii="Calibri" w:cs="Calibri" w:eastAsia="Calibri" w:hAnsi="Calibri"/>
-          <w:sz w:val="22"/>
-          <w:szCs w:val="22"/>
-        </w:rPr>
-      </w:pPr>
-      <w:r>
-        <w:rPr>
-          <w:rFonts w:ascii="Calibri" w:cs="Calibri" w:eastAsia="Calibri" w:hAnsi="Calibri"/>
-          <w:sz w:val="22"/>
-          <w:szCs w:val="22"/>
-          <w:rtl w:val="0"/>
-        </w:rPr>
-        <w:t xml:space="preserve">80 - 89</w:t>
-        <w:tab/>
-        <w:t xml:space="preserve">B</w:t>
-      </w:r>
-    </w:p>
-    <w:p>
-      <w:pPr>
-        <w:tabs>
-          <w:tab w:val="left" w:leader="none" w:pos="1800"/>
-        </w:tabs>
-        <w:ind w:left="720" w:firstLine="0"/>
-        <w:rPr>
-          <w:rFonts w:ascii="Calibri" w:cs="Calibri" w:eastAsia="Calibri" w:hAnsi="Calibri"/>
-          <w:sz w:val="22"/>
-          <w:szCs w:val="22"/>
-        </w:rPr>
-      </w:pPr>
-      <w:r>
-        <w:rPr>
-          <w:rFonts w:ascii="Calibri" w:cs="Calibri" w:eastAsia="Calibri" w:hAnsi="Calibri"/>
-          <w:sz w:val="22"/>
-          <w:szCs w:val="22"/>
-          <w:rtl w:val="0"/>
-        </w:rPr>
-        <w:t xml:space="preserve">70 - 79</w:t>
-        <w:tab/>
-        <w:t xml:space="preserve">C</w:t>
-      </w:r>
-    </w:p>
-    <w:p>
-      <w:pPr>
-        <w:tabs>
-          <w:tab w:val="left" w:leader="none" w:pos="1800"/>
-        </w:tabs>
-        <w:ind w:left="720" w:firstLine="0"/>
-        <w:rPr>
-          <w:rFonts w:ascii="Calibri" w:cs="Calibri" w:eastAsia="Calibri" w:hAnsi="Calibri"/>
-          <w:sz w:val="22"/>
-          <w:szCs w:val="22"/>
-        </w:rPr>
-      </w:pPr>
-      <w:r>
-        <w:rPr>
-          <w:rFonts w:ascii="Calibri" w:cs="Calibri" w:eastAsia="Calibri" w:hAnsi="Calibri"/>
-          <w:sz w:val="22"/>
-          <w:szCs w:val="22"/>
-          <w:rtl w:val="0"/>
-        </w:rPr>
-        <w:t xml:space="preserve">60 - 69</w:t>
-        <w:tab/>
-        <w:t xml:space="preserve">D</w:t>
-      </w:r>
-    </w:p>
-    <w:p>
-      <w:pPr>
-        <w:tabs>
-          <w:tab w:val="left" w:leader="none" w:pos="1800"/>
-        </w:tabs>
-        <w:ind w:left="720" w:firstLine="0"/>
-        <w:rPr>
-          <w:rFonts w:ascii="Calibri" w:cs="Calibri" w:eastAsia="Calibri" w:hAnsi="Calibri"/>
-          <w:sz w:val="22"/>
-          <w:szCs w:val="22"/>
-        </w:rPr>
-      </w:pPr>
-      <w:r>
-        <w:rPr>
-          <w:rFonts w:ascii="Calibri" w:cs="Calibri" w:eastAsia="Calibri" w:hAnsi="Calibri"/>
-          <w:sz w:val="22"/>
-          <w:szCs w:val="22"/>
-          <w:rtl w:val="0"/>
-        </w:rPr>
-        <w:t xml:space="preserve">0 - 59</w:t>
-        <w:tab/>
-        <w:t xml:space="preserve">F</w:t>
-      </w:r>
-    </w:p>
-    <w:p>
-      <w:pPr>
-        <w:jc w:val="both"/>
-        <w:rPr>
-          <w:rFonts w:ascii="Calibri" w:cs="Calibri" w:eastAsia="Calibri" w:hAnsi="Calibri"/>
-          <w:sz w:val="22"/>
-          <w:szCs w:val="22"/>
-        </w:rPr>
-      </w:pPr>
-      <w:r>
-        <w:rPr>
-          <w:rtl w:val="0"/>
-        </w:rPr>
-      </w:r>
-    </w:p>
-    <w:p>
-      <w:pPr>
-        <w:pStyle w:val="Heading1"/>
-        <w:numPr>
-          <w:ilvl w:val="0"/>
-          <w:numId w:val="4"/>
-        </w:numPr>
-        <w:tabs>
-          <w:tab w:val="left" w:leader="none" w:pos="540"/>
-        </w:tabs>
-        <w:ind w:left="540" w:hanging="540"/>
-        <w:jc w:val="left"/>
-        <w:rPr>
-          <w:rFonts w:ascii="Calibri" w:cs="Calibri" w:eastAsia="Calibri" w:hAnsi="Calibri"/>
-          <w:sz w:val="22"/>
-          <w:szCs w:val="22"/>
-        </w:rPr>
-      </w:pPr>
       <w:r>
         <w:rPr>
           <w:rFonts w:ascii="Calibri" w:cs="Calibri" w:eastAsia="Calibri" w:hAnsi="Calibri"/>
@@ -1403,7 +1403,7 @@
         <w:tab/>
         <w:tab/>
         <w:tab/>
-        <w:t xml:space="preserve">40%</w:t>
+        <w:t xml:space="preserve">45%</w:t>
       </w:r>
     </w:p>
     <w:p>
@@ -1580,7 +1580,7 @@
           <w:szCs w:val="22"/>
           <w:rtl w:val="0"/>
         </w:rPr>
-        <w:t xml:space="preserve">Group Presentation Assignment</w:t>
+        <w:t xml:space="preserve">Group Project Assignment</w:t>
         <w:tab/>
         <w:tab/>
         <w:tab/>
@@ -1592,38 +1592,7 @@
         <w:tabs>
           <w:tab w:val="left" w:leader="none" w:pos="4680"/>
         </w:tabs>
-        <w:ind w:left="1705" w:firstLine="0"/>
-        <w:rPr>
-          <w:rFonts w:ascii="Calibri" w:cs="Calibri" w:eastAsia="Calibri" w:hAnsi="Calibri"/>
-          <w:sz w:val="22"/>
-          <w:szCs w:val="22"/>
-        </w:rPr>
-      </w:pPr>
-      <w:r>
-        <w:rPr>
-          <w:rFonts w:ascii="Calibri" w:cs="Calibri" w:eastAsia="Calibri" w:hAnsi="Calibri"/>
-          <w:sz w:val="22"/>
-          <w:szCs w:val="22"/>
-          <w:rtl w:val="0"/>
-        </w:rPr>
-        <w:t xml:space="preserve">TBD Assignment </w:t>
-        <w:tab/>
-        <w:tab/>
-        <w:tab/>
-        <w:t xml:space="preserve">5%</w:t>
-      </w:r>
-      <w:r>
-        <w:rPr>
-          <w:rtl w:val="0"/>
-        </w:rPr>
-      </w:r>
-    </w:p>
-    <w:p>
-      <w:pPr>
-        <w:tabs>
-          <w:tab w:val="left" w:leader="none" w:pos="4680"/>
-        </w:tabs>
-        <w:ind w:left="1705" w:firstLine="0"/>
+        <w:ind w:left="0" w:firstLine="0"/>
         <w:rPr>
           <w:rFonts w:ascii="Calibri" w:cs="Calibri" w:eastAsia="Calibri" w:hAnsi="Calibri"/>
           <w:sz w:val="22"/>
@@ -2127,7 +2096,7 @@
           <w:rtl w:val="0"/>
         </w:rPr>
         <w:tab/>
-        <w:t xml:space="preserve">Patchy Environments/ Metacommunities Assignment</w:t>
+        <w:t xml:space="preserve">Group Presentation Assignment</w:t>
       </w:r>
     </w:p>
     <w:p>
@@ -2149,44 +2118,7 @@
           <w:szCs w:val="22"/>
           <w:rtl w:val="0"/>
         </w:rPr>
-        <w:t xml:space="preserve">TBD</w:t>
-      </w:r>
-    </w:p>
-    <w:p>
-      <w:pPr>
-        <w:tabs>
-          <w:tab w:val="left" w:leader="none" w:pos="540"/>
-        </w:tabs>
-        <w:rPr/>
-      </w:pPr>
-      <w:r>
-        <w:rPr>
-          <w:rtl w:val="0"/>
-        </w:rPr>
-      </w:r>
-    </w:p>
-    <w:p>
-      <w:pPr>
-        <w:tabs>
-          <w:tab w:val="left" w:leader="none" w:pos="540"/>
-        </w:tabs>
-        <w:rPr>
-          <w:rFonts w:ascii="Calibri" w:cs="Calibri" w:eastAsia="Calibri" w:hAnsi="Calibri"/>
-          <w:b w:val="1"/>
-          <w:sz w:val="22"/>
-          <w:szCs w:val="22"/>
-        </w:rPr>
-      </w:pPr>
-      <w:r>
-        <w:rPr>
-          <w:rFonts w:ascii="Calibri" w:cs="Calibri" w:eastAsia="Calibri" w:hAnsi="Calibri"/>
-          <w:b w:val="1"/>
-          <w:sz w:val="22"/>
-          <w:szCs w:val="22"/>
-          <w:rtl w:val="0"/>
-        </w:rPr>
-        <w:tab/>
-        <w:t xml:space="preserve">Group Presentation Assignment</w:t>
+        <w:t xml:space="preserve">This assignment focuses on the variable ecosystems we have in Florida. Students will work in groups of their choosing (or individually) and will select a variable ecosystem in Florida. Students will prepare some sort of product that explains to a lay audience why variability in an ecosystem is important. Where applicable, students should also refer to any impacts of changing variability.</w:t>
       </w:r>
     </w:p>
     <w:p>
@@ -2208,28 +2140,6 @@
           <w:szCs w:val="22"/>
           <w:rtl w:val="0"/>
         </w:rPr>
-        <w:t xml:space="preserve">This assignment focuses on the variable ecosystems we have in Florida. Students will work in groups of their choosing (or individually) and will select a variable ecosystem in Florida. Students will prepare some sort of product that explains to a lay audience why variability in an ecosystem is important. Where applicable, students should also refer to any impacts of changing variability.</w:t>
-      </w:r>
-    </w:p>
-    <w:p>
-      <w:pPr>
-        <w:tabs>
-          <w:tab w:val="left" w:leader="none" w:pos="540"/>
-        </w:tabs>
-        <w:ind w:left="540" w:firstLine="0"/>
-        <w:rPr>
-          <w:rFonts w:ascii="Calibri" w:cs="Calibri" w:eastAsia="Calibri" w:hAnsi="Calibri"/>
-          <w:sz w:val="22"/>
-          <w:szCs w:val="22"/>
-        </w:rPr>
-      </w:pPr>
-      <w:r>
-        <w:rPr>
-          <w:rFonts w:ascii="Calibri" w:cs="Calibri" w:eastAsia="Calibri" w:hAnsi="Calibri"/>
-          <w:sz w:val="22"/>
-          <w:szCs w:val="22"/>
-          <w:rtl w:val="0"/>
-        </w:rPr>
         <w:t xml:space="preserve">This is open to student creativity and can be anything that can convey information. Video, presentation, board game, comic strip, poetry anthology, diorama, whatever.  Bonus points for creativity.</w:t>
       </w:r>
     </w:p>
@@ -2256,7 +2166,7 @@
         <w:pStyle w:val="Heading1"/>
         <w:numPr>
           <w:ilvl w:val="0"/>
-          <w:numId w:val="4"/>
+          <w:numId w:val="7"/>
         </w:numPr>
         <w:tabs>
           <w:tab w:val="left" w:leader="none" w:pos="540"/>
@@ -2317,7 +2227,7 @@
         <w:pStyle w:val="Heading1"/>
         <w:numPr>
           <w:ilvl w:val="0"/>
-          <w:numId w:val="4"/>
+          <w:numId w:val="7"/>
         </w:numPr>
         <w:tabs>
           <w:tab w:val="left" w:leader="none" w:pos="540"/>
@@ -2743,7 +2653,7 @@
                   <w:widowControl w:val="0"/>
                   <w:numPr>
                     <w:ilvl w:val="0"/>
-                    <w:numId w:val="6"/>
+                    <w:numId w:val="14"/>
                   </w:numPr>
                   <w:ind w:left="720" w:hanging="360"/>
                   <w:rPr>
@@ -2768,7 +2678,7 @@
                   <w:widowControl w:val="0"/>
                   <w:numPr>
                     <w:ilvl w:val="0"/>
-                    <w:numId w:val="6"/>
+                    <w:numId w:val="14"/>
                   </w:numPr>
                   <w:ind w:left="720" w:hanging="360"/>
                   <w:rPr>
@@ -2793,7 +2703,7 @@
                   <w:widowControl w:val="0"/>
                   <w:numPr>
                     <w:ilvl w:val="0"/>
-                    <w:numId w:val="6"/>
+                    <w:numId w:val="14"/>
                   </w:numPr>
                   <w:ind w:left="720" w:hanging="360"/>
                   <w:rPr>
@@ -3015,7 +2925,7 @@
                   <w:widowControl w:val="0"/>
                   <w:numPr>
                     <w:ilvl w:val="0"/>
-                    <w:numId w:val="2"/>
+                    <w:numId w:val="5"/>
                   </w:numPr>
                   <w:ind w:left="720" w:hanging="360"/>
                   <w:rPr>
@@ -3040,7 +2950,7 @@
                   <w:widowControl w:val="0"/>
                   <w:numPr>
                     <w:ilvl w:val="0"/>
-                    <w:numId w:val="2"/>
+                    <w:numId w:val="5"/>
                   </w:numPr>
                   <w:ind w:left="720" w:hanging="360"/>
                   <w:rPr>
@@ -3167,7 +3077,7 @@
                   <w:widowControl w:val="0"/>
                   <w:numPr>
                     <w:ilvl w:val="0"/>
-                    <w:numId w:val="3"/>
+                    <w:numId w:val="6"/>
                   </w:numPr>
                   <w:ind w:left="720" w:hanging="360"/>
                   <w:rPr>
@@ -3184,7 +3094,7 @@
                     <w:szCs w:val="22"/>
                     <w:rtl w:val="0"/>
                   </w:rPr>
-                  <w:t xml:space="preserve">Drivers of DIversity Gradients</w:t>
+                  <w:t xml:space="preserve">Drivers of Diversity Gradients</w:t>
                 </w:r>
               </w:p>
             </w:tc>
@@ -3299,7 +3209,7 @@
                     <w:szCs w:val="22"/>
                     <w:rtl w:val="0"/>
                   </w:rPr>
-                  <w:t xml:space="preserve">Diversity Patterns</w:t>
+                  <w:t xml:space="preserve">Diversity Pattern Paper Presentations</w:t>
                 </w:r>
               </w:p>
             </w:tc>
@@ -3425,6 +3335,81 @@
                   <w:t xml:space="preserve">Biodiversity and Ecosystem Functioning</w:t>
                 </w:r>
               </w:p>
+              <w:p>
+                <w:pPr>
+                  <w:widowControl w:val="0"/>
+                  <w:numPr>
+                    <w:ilvl w:val="0"/>
+                    <w:numId w:val="13"/>
+                  </w:numPr>
+                  <w:ind w:left="720" w:hanging="360"/>
+                  <w:rPr>
+                    <w:rFonts w:ascii="Arial" w:cs="Arial" w:eastAsia="Arial" w:hAnsi="Arial"/>
+                    <w:sz w:val="22"/>
+                    <w:szCs w:val="22"/>
+                    <w:u w:val="none"/>
+                  </w:rPr>
+                </w:pPr>
+                <w:r>
+                  <w:rPr>
+                    <w:rFonts w:ascii="Arial" w:cs="Arial" w:eastAsia="Arial" w:hAnsi="Arial"/>
+                    <w:sz w:val="22"/>
+                    <w:szCs w:val="22"/>
+                    <w:rtl w:val="0"/>
+                  </w:rPr>
+                  <w:t xml:space="preserve">Ecosystem function/services</w:t>
+                </w:r>
+              </w:p>
+              <w:p>
+                <w:pPr>
+                  <w:widowControl w:val="0"/>
+                  <w:numPr>
+                    <w:ilvl w:val="0"/>
+                    <w:numId w:val="13"/>
+                  </w:numPr>
+                  <w:ind w:left="720" w:hanging="360"/>
+                  <w:rPr>
+                    <w:rFonts w:ascii="Arial" w:cs="Arial" w:eastAsia="Arial" w:hAnsi="Arial"/>
+                    <w:sz w:val="22"/>
+                    <w:szCs w:val="22"/>
+                    <w:u w:val="none"/>
+                  </w:rPr>
+                </w:pPr>
+                <w:r>
+                  <w:rPr>
+                    <w:rFonts w:ascii="Arial" w:cs="Arial" w:eastAsia="Arial" w:hAnsi="Arial"/>
+                    <w:sz w:val="22"/>
+                    <w:szCs w:val="22"/>
+                    <w:rtl w:val="0"/>
+                  </w:rPr>
+                  <w:t xml:space="preserve">Biodiv. and ecosystem functioning</w:t>
+                </w:r>
+              </w:p>
+              <w:p>
+                <w:pPr>
+                  <w:widowControl w:val="0"/>
+                  <w:numPr>
+                    <w:ilvl w:val="0"/>
+                    <w:numId w:val="13"/>
+                  </w:numPr>
+                  <w:ind w:left="720" w:hanging="360"/>
+                  <w:rPr>
+                    <w:rFonts w:ascii="Arial" w:cs="Arial" w:eastAsia="Arial" w:hAnsi="Arial"/>
+                    <w:sz w:val="22"/>
+                    <w:szCs w:val="22"/>
+                    <w:u w:val="none"/>
+                  </w:rPr>
+                </w:pPr>
+                <w:r>
+                  <w:rPr>
+                    <w:rFonts w:ascii="Arial" w:cs="Arial" w:eastAsia="Arial" w:hAnsi="Arial"/>
+                    <w:sz w:val="22"/>
+                    <w:szCs w:val="22"/>
+                    <w:rtl w:val="0"/>
+                  </w:rPr>
+                  <w:t xml:space="preserve">Multifunctionality</w:t>
+                </w:r>
+              </w:p>
             </w:tc>
             <w:tc>
               <w:tcPr>
@@ -3521,6 +3506,31 @@
                   <w:t xml:space="preserve">Biodiversity and Ecosystem Functioning</w:t>
                 </w:r>
               </w:p>
+              <w:p>
+                <w:pPr>
+                  <w:widowControl w:val="0"/>
+                  <w:numPr>
+                    <w:ilvl w:val="0"/>
+                    <w:numId w:val="12"/>
+                  </w:numPr>
+                  <w:ind w:left="720" w:hanging="360"/>
+                  <w:rPr>
+                    <w:rFonts w:ascii="Arial" w:cs="Arial" w:eastAsia="Arial" w:hAnsi="Arial"/>
+                    <w:sz w:val="22"/>
+                    <w:szCs w:val="22"/>
+                    <w:u w:val="none"/>
+                  </w:rPr>
+                </w:pPr>
+                <w:r>
+                  <w:rPr>
+                    <w:rFonts w:ascii="Arial" w:cs="Arial" w:eastAsia="Arial" w:hAnsi="Arial"/>
+                    <w:sz w:val="22"/>
+                    <w:szCs w:val="22"/>
+                    <w:rtl w:val="0"/>
+                  </w:rPr>
+                  <w:t xml:space="preserve">Unanswered questions</w:t>
+                </w:r>
+              </w:p>
             </w:tc>
             <w:tc>
               <w:tcPr>
@@ -4036,21 +4046,58 @@
               <w:p>
                 <w:pPr>
                   <w:widowControl w:val="0"/>
-                  <w:ind w:left="0" w:firstLine="0"/>
-                  <w:rPr>
-                    <w:rFonts w:ascii="Arial" w:cs="Arial" w:eastAsia="Arial" w:hAnsi="Arial"/>
-                    <w:sz w:val="22"/>
-                    <w:szCs w:val="22"/>
-                  </w:rPr>
-                </w:pPr>
-                <w:r>
-                  <w:rPr>
-                    <w:rFonts w:ascii="Arial" w:cs="Arial" w:eastAsia="Arial" w:hAnsi="Arial"/>
-                    <w:sz w:val="22"/>
-                    <w:szCs w:val="22"/>
-                    <w:rtl w:val="0"/>
-                  </w:rPr>
-                  <w:t xml:space="preserve">Review</w:t>
+                  <w:rPr>
+                    <w:rFonts w:ascii="Arial" w:cs="Arial" w:eastAsia="Arial" w:hAnsi="Arial"/>
+                    <w:sz w:val="22"/>
+                    <w:szCs w:val="22"/>
+                  </w:rPr>
+                </w:pPr>
+                <w:r>
+                  <w:rPr>
+                    <w:rFonts w:ascii="Arial" w:cs="Arial" w:eastAsia="Arial" w:hAnsi="Arial"/>
+                    <w:sz w:val="22"/>
+                    <w:szCs w:val="22"/>
+                    <w:rtl w:val="0"/>
+                  </w:rPr>
+                  <w:t xml:space="preserve">Network Assignment,</w:t>
+                </w:r>
+              </w:p>
+              <w:p>
+                <w:pPr>
+                  <w:widowControl w:val="0"/>
+                  <w:rPr>
+                    <w:rFonts w:ascii="Arial" w:cs="Arial" w:eastAsia="Arial" w:hAnsi="Arial"/>
+                    <w:sz w:val="22"/>
+                    <w:szCs w:val="22"/>
+                  </w:rPr>
+                </w:pPr>
+                <w:r>
+                  <w:rPr>
+                    <w:rFonts w:ascii="Arial" w:cs="Arial" w:eastAsia="Arial" w:hAnsi="Arial"/>
+                    <w:sz w:val="22"/>
+                    <w:szCs w:val="22"/>
+                    <w:rtl w:val="0"/>
+                  </w:rPr>
+                  <w:t xml:space="preserve">Study strategy for midterm,</w:t>
+                </w:r>
+              </w:p>
+              <w:p>
+                <w:pPr>
+                  <w:widowControl w:val="0"/>
+                  <w:rPr>
+                    <w:rFonts w:ascii="Arial" w:cs="Arial" w:eastAsia="Arial" w:hAnsi="Arial"/>
+                    <w:sz w:val="22"/>
+                    <w:szCs w:val="22"/>
+                  </w:rPr>
+                </w:pPr>
+                <w:r>
+                  <w:rPr>
+                    <w:rFonts w:ascii="Arial" w:cs="Arial" w:eastAsia="Arial" w:hAnsi="Arial"/>
+                    <w:sz w:val="22"/>
+                    <w:szCs w:val="22"/>
+                    <w:rtl w:val="0"/>
+                  </w:rPr>
+                  <w:t xml:space="preserve">Mutualism and Facilitation</w:t>
                 </w:r>
               </w:p>
             </w:tc>
@@ -4393,25 +4440,6 @@
                     <w:szCs w:val="22"/>
                     <w:rtl w:val="0"/>
                   </w:rPr>
-                  <w:t xml:space="preserve">Network Assignment,</w:t>
-                </w:r>
-              </w:p>
-              <w:p>
-                <w:pPr>
-                  <w:widowControl w:val="0"/>
-                  <w:rPr>
-                    <w:rFonts w:ascii="Arial" w:cs="Arial" w:eastAsia="Arial" w:hAnsi="Arial"/>
-                    <w:sz w:val="22"/>
-                    <w:szCs w:val="22"/>
-                  </w:rPr>
-                </w:pPr>
-                <w:r>
-                  <w:rPr>
-                    <w:rFonts w:ascii="Arial" w:cs="Arial" w:eastAsia="Arial" w:hAnsi="Arial"/>
-                    <w:sz w:val="22"/>
-                    <w:szCs w:val="22"/>
-                    <w:rtl w:val="0"/>
-                  </w:rPr>
                   <w:t xml:space="preserve">Dr.Tanya Strydom guest lecture</w:t>
                 </w:r>
               </w:p>
@@ -4514,7 +4542,51 @@
                     <w:szCs w:val="22"/>
                     <w:rtl w:val="0"/>
                   </w:rPr>
+                  <w:t xml:space="preserve">Paper presentation 2 assignment,</w:t>
+                </w:r>
+              </w:p>
+              <w:p>
+                <w:pPr>
+                  <w:widowControl w:val="0"/>
+                  <w:rPr>
+                    <w:rFonts w:ascii="Arial" w:cs="Arial" w:eastAsia="Arial" w:hAnsi="Arial"/>
+                    <w:sz w:val="22"/>
+                    <w:szCs w:val="22"/>
+                  </w:rPr>
+                </w:pPr>
+                <w:r>
+                  <w:rPr>
+                    <w:rFonts w:ascii="Arial" w:cs="Arial" w:eastAsia="Arial" w:hAnsi="Arial"/>
+                    <w:sz w:val="22"/>
+                    <w:szCs w:val="22"/>
+                    <w:rtl w:val="0"/>
+                  </w:rPr>
                   <w:t xml:space="preserve">Community assembly</w:t>
+                </w:r>
+              </w:p>
+              <w:p>
+                <w:pPr>
+                  <w:widowControl w:val="0"/>
+                  <w:numPr>
+                    <w:ilvl w:val="0"/>
+                    <w:numId w:val="2"/>
+                  </w:numPr>
+                  <w:ind w:left="720" w:hanging="360"/>
+                  <w:rPr>
+                    <w:rFonts w:ascii="Arial" w:cs="Arial" w:eastAsia="Arial" w:hAnsi="Arial"/>
+                    <w:sz w:val="22"/>
+                    <w:szCs w:val="22"/>
+                    <w:u w:val="none"/>
+                  </w:rPr>
+                </w:pPr>
+                <w:r>
+                  <w:rPr>
+                    <w:rFonts w:ascii="Arial" w:cs="Arial" w:eastAsia="Arial" w:hAnsi="Arial"/>
+                    <w:sz w:val="22"/>
+                    <w:szCs w:val="22"/>
+                    <w:rtl w:val="0"/>
+                  </w:rPr>
+                  <w:t xml:space="preserve">Overview</w:t>
                 </w:r>
               </w:p>
             </w:tc>
@@ -4610,7 +4682,7 @@
                     <w:szCs w:val="22"/>
                     <w:rtl w:val="0"/>
                   </w:rPr>
-                  <w:t xml:space="preserve">Paper presentation 2,</w:t>
+                  <w:t xml:space="preserve">Check-in and feedback,</w:t>
                 </w:r>
               </w:p>
               <w:p>
@@ -4629,26 +4701,32 @@
                     <w:szCs w:val="22"/>
                     <w:rtl w:val="0"/>
                   </w:rPr>
-                  <w:t xml:space="preserve">Check-in and feedback,</w:t>
+                  <w:t xml:space="preserve">Community assembly</w:t>
                 </w:r>
               </w:p>
               <w:p>
                 <w:pPr>
                   <w:widowControl w:val="0"/>
-                  <w:rPr>
-                    <w:rFonts w:ascii="Arial" w:cs="Arial" w:eastAsia="Arial" w:hAnsi="Arial"/>
-                    <w:sz w:val="22"/>
-                    <w:szCs w:val="22"/>
-                  </w:rPr>
-                </w:pPr>
-                <w:r>
-                  <w:rPr>
-                    <w:rFonts w:ascii="Arial" w:cs="Arial" w:eastAsia="Arial" w:hAnsi="Arial"/>
-                    <w:sz w:val="22"/>
-                    <w:szCs w:val="22"/>
-                    <w:rtl w:val="0"/>
-                  </w:rPr>
-                  <w:t xml:space="preserve">Community assembly</w:t>
+                  <w:numPr>
+                    <w:ilvl w:val="0"/>
+                    <w:numId w:val="17"/>
+                  </w:numPr>
+                  <w:ind w:left="720" w:hanging="360"/>
+                  <w:rPr>
+                    <w:rFonts w:ascii="Arial" w:cs="Arial" w:eastAsia="Arial" w:hAnsi="Arial"/>
+                    <w:sz w:val="22"/>
+                    <w:szCs w:val="22"/>
+                    <w:u w:val="none"/>
+                  </w:rPr>
+                </w:pPr>
+                <w:r>
+                  <w:rPr>
+                    <w:rFonts w:ascii="Arial" w:cs="Arial" w:eastAsia="Arial" w:hAnsi="Arial"/>
+                    <w:sz w:val="22"/>
+                    <w:szCs w:val="22"/>
+                    <w:rtl w:val="0"/>
+                  </w:rPr>
+                  <w:t xml:space="preserve">Testing examples</w:t>
                 </w:r>
               </w:p>
             </w:tc>
@@ -4977,6 +5055,31 @@
                   <w:t xml:space="preserve">Community assembly</w:t>
                 </w:r>
               </w:p>
+              <w:p>
+                <w:pPr>
+                  <w:widowControl w:val="0"/>
+                  <w:numPr>
+                    <w:ilvl w:val="0"/>
+                    <w:numId w:val="15"/>
+                  </w:numPr>
+                  <w:ind w:left="720" w:hanging="360"/>
+                  <w:rPr>
+                    <w:rFonts w:ascii="Arial" w:cs="Arial" w:eastAsia="Arial" w:hAnsi="Arial"/>
+                    <w:sz w:val="22"/>
+                    <w:szCs w:val="22"/>
+                    <w:u w:val="none"/>
+                  </w:rPr>
+                </w:pPr>
+                <w:r>
+                  <w:rPr>
+                    <w:rFonts w:ascii="Arial" w:cs="Arial" w:eastAsia="Arial" w:hAnsi="Arial"/>
+                    <w:sz w:val="22"/>
+                    <w:szCs w:val="22"/>
+                    <w:rtl w:val="0"/>
+                  </w:rPr>
+                  <w:t xml:space="preserve">Cons. Bio. Implications</w:t>
+                </w:r>
+              </w:p>
             </w:tc>
             <w:tc>
               <w:tcPr>
@@ -5070,7 +5173,7 @@
                     <w:szCs w:val="22"/>
                     <w:rtl w:val="0"/>
                   </w:rPr>
-                  <w:t xml:space="preserve">Community assembly</w:t>
+                  <w:t xml:space="preserve">Community assembly paper presentations</w:t>
                 </w:r>
               </w:p>
             </w:tc>
@@ -5193,6 +5296,31 @@
                   <w:t xml:space="preserve">Trait-based ecology</w:t>
                 </w:r>
               </w:p>
+              <w:p>
+                <w:pPr>
+                  <w:widowControl w:val="0"/>
+                  <w:numPr>
+                    <w:ilvl w:val="0"/>
+                    <w:numId w:val="16"/>
+                  </w:numPr>
+                  <w:ind w:left="720" w:hanging="360"/>
+                  <w:rPr>
+                    <w:rFonts w:ascii="Arial" w:cs="Arial" w:eastAsia="Arial" w:hAnsi="Arial"/>
+                    <w:sz w:val="22"/>
+                    <w:szCs w:val="22"/>
+                    <w:u w:val="none"/>
+                  </w:rPr>
+                </w:pPr>
+                <w:r>
+                  <w:rPr>
+                    <w:rFonts w:ascii="Arial" w:cs="Arial" w:eastAsia="Arial" w:hAnsi="Arial"/>
+                    <w:sz w:val="22"/>
+                    <w:szCs w:val="22"/>
+                    <w:rtl w:val="0"/>
+                  </w:rPr>
+                  <w:t xml:space="preserve">Overview</w:t>
+                </w:r>
+              </w:p>
             </w:tc>
             <w:tc>
               <w:tcPr>
@@ -5289,6 +5417,31 @@
                   <w:t xml:space="preserve">Trait-based ecology</w:t>
                 </w:r>
               </w:p>
+              <w:p>
+                <w:pPr>
+                  <w:widowControl w:val="0"/>
+                  <w:numPr>
+                    <w:ilvl w:val="0"/>
+                    <w:numId w:val="1"/>
+                  </w:numPr>
+                  <w:ind w:left="720" w:hanging="360"/>
+                  <w:rPr>
+                    <w:rFonts w:ascii="Arial" w:cs="Arial" w:eastAsia="Arial" w:hAnsi="Arial"/>
+                    <w:sz w:val="22"/>
+                    <w:szCs w:val="22"/>
+                    <w:u w:val="none"/>
+                  </w:rPr>
+                </w:pPr>
+                <w:r>
+                  <w:rPr>
+                    <w:rFonts w:ascii="Arial" w:cs="Arial" w:eastAsia="Arial" w:hAnsi="Arial"/>
+                    <w:sz w:val="22"/>
+                    <w:szCs w:val="22"/>
+                    <w:rtl w:val="0"/>
+                  </w:rPr>
+                  <w:t xml:space="preserve">Traits and community assembly</w:t>
+                </w:r>
+              </w:p>
             </w:tc>
             <w:tc>
               <w:tcPr>
@@ -5385,6 +5538,31 @@
                   <w:t xml:space="preserve">Trait-based ecology</w:t>
                 </w:r>
               </w:p>
+              <w:p>
+                <w:pPr>
+                  <w:widowControl w:val="0"/>
+                  <w:numPr>
+                    <w:ilvl w:val="0"/>
+                    <w:numId w:val="9"/>
+                  </w:numPr>
+                  <w:ind w:left="720" w:hanging="360"/>
+                  <w:rPr>
+                    <w:rFonts w:ascii="Arial" w:cs="Arial" w:eastAsia="Arial" w:hAnsi="Arial"/>
+                    <w:sz w:val="22"/>
+                    <w:szCs w:val="22"/>
+                    <w:u w:val="none"/>
+                  </w:rPr>
+                </w:pPr>
+                <w:r>
+                  <w:rPr>
+                    <w:rFonts w:ascii="Arial" w:cs="Arial" w:eastAsia="Arial" w:hAnsi="Arial"/>
+                    <w:sz w:val="22"/>
+                    <w:szCs w:val="22"/>
+                    <w:rtl w:val="0"/>
+                  </w:rPr>
+                  <w:t xml:space="preserve">Traits and Ecosystem function</w:t>
+                </w:r>
+              </w:p>
             </w:tc>
             <w:tc>
               <w:tcPr>
@@ -5481,6 +5659,31 @@
                   <w:t xml:space="preserve">Trait-based ecology</w:t>
                 </w:r>
               </w:p>
+              <w:p>
+                <w:pPr>
+                  <w:widowControl w:val="0"/>
+                  <w:numPr>
+                    <w:ilvl w:val="0"/>
+                    <w:numId w:val="3"/>
+                  </w:numPr>
+                  <w:ind w:left="720" w:hanging="360"/>
+                  <w:rPr>
+                    <w:rFonts w:ascii="Arial" w:cs="Arial" w:eastAsia="Arial" w:hAnsi="Arial"/>
+                    <w:sz w:val="22"/>
+                    <w:szCs w:val="22"/>
+                    <w:u w:val="none"/>
+                  </w:rPr>
+                </w:pPr>
+                <w:r>
+                  <w:rPr>
+                    <w:rFonts w:ascii="Arial" w:cs="Arial" w:eastAsia="Arial" w:hAnsi="Arial"/>
+                    <w:sz w:val="22"/>
+                    <w:szCs w:val="22"/>
+                    <w:rtl w:val="0"/>
+                  </w:rPr>
+                  <w:t xml:space="preserve">Traits and Global Change</w:t>
+                </w:r>
+              </w:p>
             </w:tc>
             <w:tc>
               <w:tcPr>
@@ -5585,7 +5788,7 @@
                     <w:szCs w:val="22"/>
                     <w:rtl w:val="0"/>
                   </w:rPr>
-                  <w:t xml:space="preserve">TBD Assignment,</w:t>
+                  <w:t xml:space="preserve">Group presentation assignment,</w:t>
                 </w:r>
               </w:p>
               <w:p>
@@ -5821,25 +6024,6 @@
                     <w:szCs w:val="22"/>
                     <w:rtl w:val="0"/>
                   </w:rPr>
-                  <w:t xml:space="preserve">Group Presentation Assignment,</w:t>
-                </w:r>
-              </w:p>
-              <w:p>
-                <w:pPr>
-                  <w:widowControl w:val="0"/>
-                  <w:rPr>
-                    <w:rFonts w:ascii="Arial" w:cs="Arial" w:eastAsia="Arial" w:hAnsi="Arial"/>
-                    <w:sz w:val="22"/>
-                    <w:szCs w:val="22"/>
-                  </w:rPr>
-                </w:pPr>
-                <w:r>
-                  <w:rPr>
-                    <w:rFonts w:ascii="Arial" w:cs="Arial" w:eastAsia="Arial" w:hAnsi="Arial"/>
-                    <w:sz w:val="22"/>
-                    <w:szCs w:val="22"/>
-                    <w:rtl w:val="0"/>
-                  </w:rPr>
                   <w:t xml:space="preserve">Metacommunities</w:t>
                 </w:r>
               </w:p>
@@ -5963,13 +6147,8 @@
                 </w:pPr>
                 <w:r>
                   <w:rPr>
-                    <w:rFonts w:ascii="Arial" w:cs="Arial" w:eastAsia="Arial" w:hAnsi="Arial"/>
-                    <w:b w:val="1"/>
-                    <w:sz w:val="22"/>
-                    <w:szCs w:val="22"/>
-                    <w:rtl w:val="0"/>
-                  </w:rPr>
-                  <w:t xml:space="preserve">TBD Assignment (due Friday)</w:t>
+                    <w:rtl w:val="0"/>
+                  </w:rPr>
                 </w:r>
               </w:p>
             </w:tc>
@@ -6046,6 +6225,31 @@
                   <w:t xml:space="preserve">Variable environments</w:t>
                 </w:r>
               </w:p>
+              <w:p>
+                <w:pPr>
+                  <w:widowControl w:val="0"/>
+                  <w:numPr>
+                    <w:ilvl w:val="0"/>
+                    <w:numId w:val="8"/>
+                  </w:numPr>
+                  <w:ind w:left="720" w:hanging="360"/>
+                  <w:rPr>
+                    <w:rFonts w:ascii="Arial" w:cs="Arial" w:eastAsia="Arial" w:hAnsi="Arial"/>
+                    <w:sz w:val="22"/>
+                    <w:szCs w:val="22"/>
+                    <w:u w:val="none"/>
+                  </w:rPr>
+                </w:pPr>
+                <w:r>
+                  <w:rPr>
+                    <w:rFonts w:ascii="Arial" w:cs="Arial" w:eastAsia="Arial" w:hAnsi="Arial"/>
+                    <w:sz w:val="22"/>
+                    <w:szCs w:val="22"/>
+                    <w:rtl w:val="0"/>
+                  </w:rPr>
+                  <w:t xml:space="preserve">Global</w:t>
+                </w:r>
+              </w:p>
             </w:tc>
             <w:tc>
               <w:tcPr>
@@ -6142,6 +6346,31 @@
                   <w:t xml:space="preserve">Variable environments</w:t>
                 </w:r>
               </w:p>
+              <w:p>
+                <w:pPr>
+                  <w:widowControl w:val="0"/>
+                  <w:numPr>
+                    <w:ilvl w:val="0"/>
+                    <w:numId w:val="11"/>
+                  </w:numPr>
+                  <w:ind w:left="720" w:hanging="360"/>
+                  <w:rPr>
+                    <w:rFonts w:ascii="Arial" w:cs="Arial" w:eastAsia="Arial" w:hAnsi="Arial"/>
+                    <w:sz w:val="22"/>
+                    <w:szCs w:val="22"/>
+                    <w:u w:val="none"/>
+                  </w:rPr>
+                </w:pPr>
+                <w:r>
+                  <w:rPr>
+                    <w:rFonts w:ascii="Arial" w:cs="Arial" w:eastAsia="Arial" w:hAnsi="Arial"/>
+                    <w:sz w:val="22"/>
+                    <w:szCs w:val="22"/>
+                    <w:rtl w:val="0"/>
+                  </w:rPr>
+                  <w:t xml:space="preserve">Local</w:t>
+                </w:r>
+              </w:p>
             </w:tc>
             <w:tc>
               <w:tcPr>
@@ -6341,7 +6570,7 @@
         <w:pStyle w:val="Heading1"/>
         <w:numPr>
           <w:ilvl w:val="0"/>
-          <w:numId w:val="4"/>
+          <w:numId w:val="7"/>
         </w:numPr>
         <w:tabs>
           <w:tab w:val="left" w:leader="none" w:pos="540"/>
@@ -6464,7 +6693,7 @@
         <w:pStyle w:val="Heading1"/>
         <w:numPr>
           <w:ilvl w:val="0"/>
-          <w:numId w:val="4"/>
+          <w:numId w:val="7"/>
         </w:numPr>
         <w:tabs>
           <w:tab w:val="left" w:leader="none" w:pos="540"/>
@@ -6903,7 +7132,7 @@
         <w:pStyle w:val="Heading1"/>
         <w:numPr>
           <w:ilvl w:val="0"/>
-          <w:numId w:val="4"/>
+          <w:numId w:val="7"/>
         </w:numPr>
         <w:tabs>
           <w:tab w:val="left" w:leader="none" w:pos="540"/>
@@ -7113,7 +7342,7 @@
         <w:pStyle w:val="Heading1"/>
         <w:numPr>
           <w:ilvl w:val="0"/>
-          <w:numId w:val="4"/>
+          <w:numId w:val="7"/>
         </w:numPr>
         <w:tabs>
           <w:tab w:val="left" w:leader="none" w:pos="540"/>
@@ -7475,7 +7704,7 @@
         <w:pStyle w:val="Heading1"/>
         <w:numPr>
           <w:ilvl w:val="0"/>
-          <w:numId w:val="4"/>
+          <w:numId w:val="7"/>
         </w:numPr>
         <w:tabs>
           <w:tab w:val="left" w:leader="none" w:pos="540"/>
@@ -7855,7 +8084,7 @@
     <w:lvl w:ilvl="0">
       <w:start w:val="1"/>
       <w:numFmt w:val="bullet"/>
-      <w:lvlText w:val="●"/>
+      <w:lvlText w:val="-"/>
       <w:lvlJc w:val="left"/>
       <w:pPr>
         <w:ind w:left="720" w:hanging="360"/>
@@ -7867,7 +8096,7 @@
     <w:lvl w:ilvl="1">
       <w:start w:val="1"/>
       <w:numFmt w:val="bullet"/>
-      <w:lvlText w:val="○"/>
+      <w:lvlText w:val="-"/>
       <w:lvlJc w:val="left"/>
       <w:pPr>
         <w:ind w:left="1440" w:hanging="360"/>
@@ -7879,7 +8108,7 @@
     <w:lvl w:ilvl="2">
       <w:start w:val="1"/>
       <w:numFmt w:val="bullet"/>
-      <w:lvlText w:val="■"/>
+      <w:lvlText w:val="-"/>
       <w:lvlJc w:val="left"/>
       <w:pPr>
         <w:ind w:left="2160" w:hanging="360"/>
@@ -7891,7 +8120,7 @@
     <w:lvl w:ilvl="3">
       <w:start w:val="1"/>
       <w:numFmt w:val="bullet"/>
-      <w:lvlText w:val="●"/>
+      <w:lvlText w:val="-"/>
       <w:lvlJc w:val="left"/>
       <w:pPr>
         <w:ind w:left="2880" w:hanging="360"/>
@@ -7903,7 +8132,7 @@
     <w:lvl w:ilvl="4">
       <w:start w:val="1"/>
       <w:numFmt w:val="bullet"/>
-      <w:lvlText w:val="○"/>
+      <w:lvlText w:val="-"/>
       <w:lvlJc w:val="left"/>
       <w:pPr>
         <w:ind w:left="3600" w:hanging="360"/>
@@ -7915,7 +8144,7 @@
     <w:lvl w:ilvl="5">
       <w:start w:val="1"/>
       <w:numFmt w:val="bullet"/>
-      <w:lvlText w:val="■"/>
+      <w:lvlText w:val="-"/>
       <w:lvlJc w:val="left"/>
       <w:pPr>
         <w:ind w:left="4320" w:hanging="360"/>
@@ -7927,7 +8156,7 @@
     <w:lvl w:ilvl="6">
       <w:start w:val="1"/>
       <w:numFmt w:val="bullet"/>
-      <w:lvlText w:val="●"/>
+      <w:lvlText w:val="-"/>
       <w:lvlJc w:val="left"/>
       <w:pPr>
         <w:ind w:left="5040" w:hanging="360"/>
@@ -7939,7 +8168,7 @@
     <w:lvl w:ilvl="7">
       <w:start w:val="1"/>
       <w:numFmt w:val="bullet"/>
-      <w:lvlText w:val="○"/>
+      <w:lvlText w:val="-"/>
       <w:lvlJc w:val="left"/>
       <w:pPr>
         <w:ind w:left="5760" w:hanging="360"/>
@@ -7951,7 +8180,7 @@
     <w:lvl w:ilvl="8">
       <w:start w:val="1"/>
       <w:numFmt w:val="bullet"/>
-      <w:lvlText w:val="■"/>
+      <w:lvlText w:val="-"/>
       <w:lvlJc w:val="left"/>
       <w:pPr>
         <w:ind w:left="6480" w:hanging="360"/>
@@ -8184,102 +8413,118 @@
   <w:abstractNum w:abstractNumId="4">
     <w:lvl w:ilvl="0">
       <w:start w:val="1"/>
-      <w:numFmt w:val="upperRoman"/>
-      <w:lvlText w:val="%1."/>
-      <w:lvlJc w:val="left"/>
-      <w:pPr>
-        <w:ind w:left="2952" w:hanging="432"/>
-      </w:pPr>
-      <w:rPr>
-        <w:rFonts w:ascii="Calibri" w:cs="Calibri" w:eastAsia="Calibri" w:hAnsi="Calibri"/>
+      <w:numFmt w:val="bullet"/>
+      <w:lvlText w:val="●"/>
+      <w:lvlJc w:val="left"/>
+      <w:pPr>
+        <w:ind w:left="720" w:hanging="360"/>
+      </w:pPr>
+      <w:rPr>
+        <w:u w:val="none"/>
       </w:rPr>
     </w:lvl>
     <w:lvl w:ilvl="1">
       <w:start w:val="1"/>
-      <w:numFmt w:val="decimal"/>
-      <w:lvlText w:val="%1.%2."/>
-      <w:lvlJc w:val="left"/>
-      <w:pPr>
-        <w:ind w:left="576" w:hanging="576"/>
-      </w:pPr>
-      <w:rPr/>
+      <w:numFmt w:val="bullet"/>
+      <w:lvlText w:val="○"/>
+      <w:lvlJc w:val="left"/>
+      <w:pPr>
+        <w:ind w:left="1440" w:hanging="360"/>
+      </w:pPr>
+      <w:rPr>
+        <w:u w:val="none"/>
+      </w:rPr>
     </w:lvl>
     <w:lvl w:ilvl="2">
       <w:start w:val="1"/>
-      <w:numFmt w:val="decimal"/>
-      <w:lvlText w:val="%1.%2.%3"/>
-      <w:lvlJc w:val="left"/>
-      <w:pPr>
-        <w:ind w:left="720" w:hanging="720"/>
-      </w:pPr>
-      <w:rPr/>
+      <w:numFmt w:val="bullet"/>
+      <w:lvlText w:val="■"/>
+      <w:lvlJc w:val="left"/>
+      <w:pPr>
+        <w:ind w:left="2160" w:hanging="360"/>
+      </w:pPr>
+      <w:rPr>
+        <w:u w:val="none"/>
+      </w:rPr>
     </w:lvl>
     <w:lvl w:ilvl="3">
       <w:start w:val="1"/>
-      <w:numFmt w:val="decimal"/>
-      <w:lvlText w:val="%1.%2.%3.%4"/>
-      <w:lvlJc w:val="left"/>
-      <w:pPr>
-        <w:ind w:left="864" w:hanging="864"/>
-      </w:pPr>
-      <w:rPr/>
+      <w:numFmt w:val="bullet"/>
+      <w:lvlText w:val="●"/>
+      <w:lvlJc w:val="left"/>
+      <w:pPr>
+        <w:ind w:left="2880" w:hanging="360"/>
+      </w:pPr>
+      <w:rPr>
+        <w:u w:val="none"/>
+      </w:rPr>
     </w:lvl>
     <w:lvl w:ilvl="4">
       <w:start w:val="1"/>
-      <w:numFmt w:val="decimal"/>
-      <w:lvlText w:val="%1.%2.%3.%4.%5"/>
-      <w:lvlJc w:val="left"/>
-      <w:pPr>
-        <w:ind w:left="1008" w:hanging="1008"/>
-      </w:pPr>
-      <w:rPr/>
+      <w:numFmt w:val="bullet"/>
+      <w:lvlText w:val="○"/>
+      <w:lvlJc w:val="left"/>
+      <w:pPr>
+        <w:ind w:left="3600" w:hanging="360"/>
+      </w:pPr>
+      <w:rPr>
+        <w:u w:val="none"/>
+      </w:rPr>
     </w:lvl>
     <w:lvl w:ilvl="5">
       <w:start w:val="1"/>
-      <w:numFmt w:val="decimal"/>
-      <w:lvlText w:val="%1.%2.%3.%4.%5.%6"/>
-      <w:lvlJc w:val="left"/>
-      <w:pPr>
-        <w:ind w:left="1152" w:hanging="1152"/>
-      </w:pPr>
-      <w:rPr/>
+      <w:numFmt w:val="bullet"/>
+      <w:lvlText w:val="■"/>
+      <w:lvlJc w:val="left"/>
+      <w:pPr>
+        <w:ind w:left="4320" w:hanging="360"/>
+      </w:pPr>
+      <w:rPr>
+        <w:u w:val="none"/>
+      </w:rPr>
     </w:lvl>
     <w:lvl w:ilvl="6">
       <w:start w:val="1"/>
-      <w:numFmt w:val="decimal"/>
-      <w:lvlText w:val="%1.%2.%3.%4.%5.%6.%7"/>
-      <w:lvlJc w:val="left"/>
-      <w:pPr>
-        <w:ind w:left="1296" w:hanging="1296"/>
-      </w:pPr>
-      <w:rPr/>
+      <w:numFmt w:val="bullet"/>
+      <w:lvlText w:val="●"/>
+      <w:lvlJc w:val="left"/>
+      <w:pPr>
+        <w:ind w:left="5040" w:hanging="360"/>
+      </w:pPr>
+      <w:rPr>
+        <w:u w:val="none"/>
+      </w:rPr>
     </w:lvl>
     <w:lvl w:ilvl="7">
       <w:start w:val="1"/>
-      <w:numFmt w:val="decimal"/>
-      <w:lvlText w:val="%1.%2.%3.%4.%5.%6.%7.%8"/>
-      <w:lvlJc w:val="left"/>
-      <w:pPr>
-        <w:ind w:left="1440" w:hanging="1440"/>
-      </w:pPr>
-      <w:rPr/>
+      <w:numFmt w:val="bullet"/>
+      <w:lvlText w:val="○"/>
+      <w:lvlJc w:val="left"/>
+      <w:pPr>
+        <w:ind w:left="5760" w:hanging="360"/>
+      </w:pPr>
+      <w:rPr>
+        <w:u w:val="none"/>
+      </w:rPr>
     </w:lvl>
     <w:lvl w:ilvl="8">
       <w:start w:val="1"/>
-      <w:numFmt w:val="decimal"/>
-      <w:lvlText w:val="%1.%2.%3.%4.%5.%6.%7.%8.%9"/>
-      <w:lvlJc w:val="left"/>
-      <w:pPr>
-        <w:ind w:left="1584" w:hanging="1584"/>
-      </w:pPr>
-      <w:rPr/>
+      <w:numFmt w:val="bullet"/>
+      <w:lvlText w:val="■"/>
+      <w:lvlJc w:val="left"/>
+      <w:pPr>
+        <w:ind w:left="6480" w:hanging="360"/>
+      </w:pPr>
+      <w:rPr>
+        <w:u w:val="none"/>
+      </w:rPr>
     </w:lvl>
   </w:abstractNum>
   <w:abstractNum w:abstractNumId="5">
     <w:lvl w:ilvl="0">
       <w:start w:val="1"/>
       <w:numFmt w:val="bullet"/>
-      <w:lvlText w:val="●"/>
+      <w:lvlText w:val="-"/>
       <w:lvlJc w:val="left"/>
       <w:pPr>
         <w:ind w:left="720" w:hanging="360"/>
@@ -8291,7 +8536,7 @@
     <w:lvl w:ilvl="1">
       <w:start w:val="1"/>
       <w:numFmt w:val="bullet"/>
-      <w:lvlText w:val="○"/>
+      <w:lvlText w:val="-"/>
       <w:lvlJc w:val="left"/>
       <w:pPr>
         <w:ind w:left="1440" w:hanging="360"/>
@@ -8303,7 +8548,7 @@
     <w:lvl w:ilvl="2">
       <w:start w:val="1"/>
       <w:numFmt w:val="bullet"/>
-      <w:lvlText w:val="■"/>
+      <w:lvlText w:val="-"/>
       <w:lvlJc w:val="left"/>
       <w:pPr>
         <w:ind w:left="2160" w:hanging="360"/>
@@ -8315,7 +8560,7 @@
     <w:lvl w:ilvl="3">
       <w:start w:val="1"/>
       <w:numFmt w:val="bullet"/>
-      <w:lvlText w:val="●"/>
+      <w:lvlText w:val="-"/>
       <w:lvlJc w:val="left"/>
       <w:pPr>
         <w:ind w:left="2880" w:hanging="360"/>
@@ -8327,7 +8572,7 @@
     <w:lvl w:ilvl="4">
       <w:start w:val="1"/>
       <w:numFmt w:val="bullet"/>
-      <w:lvlText w:val="○"/>
+      <w:lvlText w:val="-"/>
       <w:lvlJc w:val="left"/>
       <w:pPr>
         <w:ind w:left="3600" w:hanging="360"/>
@@ -8339,7 +8584,7 @@
     <w:lvl w:ilvl="5">
       <w:start w:val="1"/>
       <w:numFmt w:val="bullet"/>
-      <w:lvlText w:val="■"/>
+      <w:lvlText w:val="-"/>
       <w:lvlJc w:val="left"/>
       <w:pPr>
         <w:ind w:left="4320" w:hanging="360"/>
@@ -8351,7 +8596,7 @@
     <w:lvl w:ilvl="6">
       <w:start w:val="1"/>
       <w:numFmt w:val="bullet"/>
-      <w:lvlText w:val="●"/>
+      <w:lvlText w:val="-"/>
       <w:lvlJc w:val="left"/>
       <w:pPr>
         <w:ind w:left="5040" w:hanging="360"/>
@@ -8363,7 +8608,7 @@
     <w:lvl w:ilvl="7">
       <w:start w:val="1"/>
       <w:numFmt w:val="bullet"/>
-      <w:lvlText w:val="○"/>
+      <w:lvlText w:val="-"/>
       <w:lvlJc w:val="left"/>
       <w:pPr>
         <w:ind w:left="5760" w:hanging="360"/>
@@ -8375,7 +8620,7 @@
     <w:lvl w:ilvl="8">
       <w:start w:val="1"/>
       <w:numFmt w:val="bullet"/>
-      <w:lvlText w:val="■"/>
+      <w:lvlText w:val="-"/>
       <w:lvlJc w:val="left"/>
       <w:pPr>
         <w:ind w:left="6480" w:hanging="360"/>
@@ -8386,6 +8631,1200 @@
     </w:lvl>
   </w:abstractNum>
   <w:abstractNum w:abstractNumId="6">
+    <w:lvl w:ilvl="0">
+      <w:start w:val="1"/>
+      <w:numFmt w:val="bullet"/>
+      <w:lvlText w:val="-"/>
+      <w:lvlJc w:val="left"/>
+      <w:pPr>
+        <w:ind w:left="720" w:hanging="360"/>
+      </w:pPr>
+      <w:rPr>
+        <w:u w:val="none"/>
+      </w:rPr>
+    </w:lvl>
+    <w:lvl w:ilvl="1">
+      <w:start w:val="1"/>
+      <w:numFmt w:val="bullet"/>
+      <w:lvlText w:val="-"/>
+      <w:lvlJc w:val="left"/>
+      <w:pPr>
+        <w:ind w:left="1440" w:hanging="360"/>
+      </w:pPr>
+      <w:rPr>
+        <w:u w:val="none"/>
+      </w:rPr>
+    </w:lvl>
+    <w:lvl w:ilvl="2">
+      <w:start w:val="1"/>
+      <w:numFmt w:val="bullet"/>
+      <w:lvlText w:val="-"/>
+      <w:lvlJc w:val="left"/>
+      <w:pPr>
+        <w:ind w:left="2160" w:hanging="360"/>
+      </w:pPr>
+      <w:rPr>
+        <w:u w:val="none"/>
+      </w:rPr>
+    </w:lvl>
+    <w:lvl w:ilvl="3">
+      <w:start w:val="1"/>
+      <w:numFmt w:val="bullet"/>
+      <w:lvlText w:val="-"/>
+      <w:lvlJc w:val="left"/>
+      <w:pPr>
+        <w:ind w:left="2880" w:hanging="360"/>
+      </w:pPr>
+      <w:rPr>
+        <w:u w:val="none"/>
+      </w:rPr>
+    </w:lvl>
+    <w:lvl w:ilvl="4">
+      <w:start w:val="1"/>
+      <w:numFmt w:val="bullet"/>
+      <w:lvlText w:val="-"/>
+      <w:lvlJc w:val="left"/>
+      <w:pPr>
+        <w:ind w:left="3600" w:hanging="360"/>
+      </w:pPr>
+      <w:rPr>
+        <w:u w:val="none"/>
+      </w:rPr>
+    </w:lvl>
+    <w:lvl w:ilvl="5">
+      <w:start w:val="1"/>
+      <w:numFmt w:val="bullet"/>
+      <w:lvlText w:val="-"/>
+      <w:lvlJc w:val="left"/>
+      <w:pPr>
+        <w:ind w:left="4320" w:hanging="360"/>
+      </w:pPr>
+      <w:rPr>
+        <w:u w:val="none"/>
+      </w:rPr>
+    </w:lvl>
+    <w:lvl w:ilvl="6">
+      <w:start w:val="1"/>
+      <w:numFmt w:val="bullet"/>
+      <w:lvlText w:val="-"/>
+      <w:lvlJc w:val="left"/>
+      <w:pPr>
+        <w:ind w:left="5040" w:hanging="360"/>
+      </w:pPr>
+      <w:rPr>
+        <w:u w:val="none"/>
+      </w:rPr>
+    </w:lvl>
+    <w:lvl w:ilvl="7">
+      <w:start w:val="1"/>
+      <w:numFmt w:val="bullet"/>
+      <w:lvlText w:val="-"/>
+      <w:lvlJc w:val="left"/>
+      <w:pPr>
+        <w:ind w:left="5760" w:hanging="360"/>
+      </w:pPr>
+      <w:rPr>
+        <w:u w:val="none"/>
+      </w:rPr>
+    </w:lvl>
+    <w:lvl w:ilvl="8">
+      <w:start w:val="1"/>
+      <w:numFmt w:val="bullet"/>
+      <w:lvlText w:val="-"/>
+      <w:lvlJc w:val="left"/>
+      <w:pPr>
+        <w:ind w:left="6480" w:hanging="360"/>
+      </w:pPr>
+      <w:rPr>
+        <w:u w:val="none"/>
+      </w:rPr>
+    </w:lvl>
+  </w:abstractNum>
+  <w:abstractNum w:abstractNumId="7">
+    <w:lvl w:ilvl="0">
+      <w:start w:val="1"/>
+      <w:numFmt w:val="upperRoman"/>
+      <w:lvlText w:val="%1."/>
+      <w:lvlJc w:val="left"/>
+      <w:pPr>
+        <w:ind w:left="2952" w:hanging="432"/>
+      </w:pPr>
+      <w:rPr>
+        <w:rFonts w:ascii="Calibri" w:cs="Calibri" w:eastAsia="Calibri" w:hAnsi="Calibri"/>
+      </w:rPr>
+    </w:lvl>
+    <w:lvl w:ilvl="1">
+      <w:start w:val="1"/>
+      <w:numFmt w:val="decimal"/>
+      <w:lvlText w:val="%1.%2."/>
+      <w:lvlJc w:val="left"/>
+      <w:pPr>
+        <w:ind w:left="576" w:hanging="576"/>
+      </w:pPr>
+      <w:rPr/>
+    </w:lvl>
+    <w:lvl w:ilvl="2">
+      <w:start w:val="1"/>
+      <w:numFmt w:val="decimal"/>
+      <w:lvlText w:val="%1.%2.%3"/>
+      <w:lvlJc w:val="left"/>
+      <w:pPr>
+        <w:ind w:left="720" w:hanging="720"/>
+      </w:pPr>
+      <w:rPr/>
+    </w:lvl>
+    <w:lvl w:ilvl="3">
+      <w:start w:val="1"/>
+      <w:numFmt w:val="decimal"/>
+      <w:lvlText w:val="%1.%2.%3.%4"/>
+      <w:lvlJc w:val="left"/>
+      <w:pPr>
+        <w:ind w:left="864" w:hanging="864"/>
+      </w:pPr>
+      <w:rPr/>
+    </w:lvl>
+    <w:lvl w:ilvl="4">
+      <w:start w:val="1"/>
+      <w:numFmt w:val="decimal"/>
+      <w:lvlText w:val="%1.%2.%3.%4.%5"/>
+      <w:lvlJc w:val="left"/>
+      <w:pPr>
+        <w:ind w:left="1008" w:hanging="1008"/>
+      </w:pPr>
+      <w:rPr/>
+    </w:lvl>
+    <w:lvl w:ilvl="5">
+      <w:start w:val="1"/>
+      <w:numFmt w:val="decimal"/>
+      <w:lvlText w:val="%1.%2.%3.%4.%5.%6"/>
+      <w:lvlJc w:val="left"/>
+      <w:pPr>
+        <w:ind w:left="1152" w:hanging="1152"/>
+      </w:pPr>
+      <w:rPr/>
+    </w:lvl>
+    <w:lvl w:ilvl="6">
+      <w:start w:val="1"/>
+      <w:numFmt w:val="decimal"/>
+      <w:lvlText w:val="%1.%2.%3.%4.%5.%6.%7"/>
+      <w:lvlJc w:val="left"/>
+      <w:pPr>
+        <w:ind w:left="1296" w:hanging="1296"/>
+      </w:pPr>
+      <w:rPr/>
+    </w:lvl>
+    <w:lvl w:ilvl="7">
+      <w:start w:val="1"/>
+      <w:numFmt w:val="decimal"/>
+      <w:lvlText w:val="%1.%2.%3.%4.%5.%6.%7.%8"/>
+      <w:lvlJc w:val="left"/>
+      <w:pPr>
+        <w:ind w:left="1440" w:hanging="1440"/>
+      </w:pPr>
+      <w:rPr/>
+    </w:lvl>
+    <w:lvl w:ilvl="8">
+      <w:start w:val="1"/>
+      <w:numFmt w:val="decimal"/>
+      <w:lvlText w:val="%1.%2.%3.%4.%5.%6.%7.%8.%9"/>
+      <w:lvlJc w:val="left"/>
+      <w:pPr>
+        <w:ind w:left="1584" w:hanging="1584"/>
+      </w:pPr>
+      <w:rPr/>
+    </w:lvl>
+  </w:abstractNum>
+  <w:abstractNum w:abstractNumId="8">
+    <w:lvl w:ilvl="0">
+      <w:start w:val="1"/>
+      <w:numFmt w:val="bullet"/>
+      <w:lvlText w:val="-"/>
+      <w:lvlJc w:val="left"/>
+      <w:pPr>
+        <w:ind w:left="720" w:hanging="360"/>
+      </w:pPr>
+      <w:rPr>
+        <w:u w:val="none"/>
+      </w:rPr>
+    </w:lvl>
+    <w:lvl w:ilvl="1">
+      <w:start w:val="1"/>
+      <w:numFmt w:val="bullet"/>
+      <w:lvlText w:val="-"/>
+      <w:lvlJc w:val="left"/>
+      <w:pPr>
+        <w:ind w:left="1440" w:hanging="360"/>
+      </w:pPr>
+      <w:rPr>
+        <w:u w:val="none"/>
+      </w:rPr>
+    </w:lvl>
+    <w:lvl w:ilvl="2">
+      <w:start w:val="1"/>
+      <w:numFmt w:val="bullet"/>
+      <w:lvlText w:val="-"/>
+      <w:lvlJc w:val="left"/>
+      <w:pPr>
+        <w:ind w:left="2160" w:hanging="360"/>
+      </w:pPr>
+      <w:rPr>
+        <w:u w:val="none"/>
+      </w:rPr>
+    </w:lvl>
+    <w:lvl w:ilvl="3">
+      <w:start w:val="1"/>
+      <w:numFmt w:val="bullet"/>
+      <w:lvlText w:val="-"/>
+      <w:lvlJc w:val="left"/>
+      <w:pPr>
+        <w:ind w:left="2880" w:hanging="360"/>
+      </w:pPr>
+      <w:rPr>
+        <w:u w:val="none"/>
+      </w:rPr>
+    </w:lvl>
+    <w:lvl w:ilvl="4">
+      <w:start w:val="1"/>
+      <w:numFmt w:val="bullet"/>
+      <w:lvlText w:val="-"/>
+      <w:lvlJc w:val="left"/>
+      <w:pPr>
+        <w:ind w:left="3600" w:hanging="360"/>
+      </w:pPr>
+      <w:rPr>
+        <w:u w:val="none"/>
+      </w:rPr>
+    </w:lvl>
+    <w:lvl w:ilvl="5">
+      <w:start w:val="1"/>
+      <w:numFmt w:val="bullet"/>
+      <w:lvlText w:val="-"/>
+      <w:lvlJc w:val="left"/>
+      <w:pPr>
+        <w:ind w:left="4320" w:hanging="360"/>
+      </w:pPr>
+      <w:rPr>
+        <w:u w:val="none"/>
+      </w:rPr>
+    </w:lvl>
+    <w:lvl w:ilvl="6">
+      <w:start w:val="1"/>
+      <w:numFmt w:val="bullet"/>
+      <w:lvlText w:val="-"/>
+      <w:lvlJc w:val="left"/>
+      <w:pPr>
+        <w:ind w:left="5040" w:hanging="360"/>
+      </w:pPr>
+      <w:rPr>
+        <w:u w:val="none"/>
+      </w:rPr>
+    </w:lvl>
+    <w:lvl w:ilvl="7">
+      <w:start w:val="1"/>
+      <w:numFmt w:val="bullet"/>
+      <w:lvlText w:val="-"/>
+      <w:lvlJc w:val="left"/>
+      <w:pPr>
+        <w:ind w:left="5760" w:hanging="360"/>
+      </w:pPr>
+      <w:rPr>
+        <w:u w:val="none"/>
+      </w:rPr>
+    </w:lvl>
+    <w:lvl w:ilvl="8">
+      <w:start w:val="1"/>
+      <w:numFmt w:val="bullet"/>
+      <w:lvlText w:val="-"/>
+      <w:lvlJc w:val="left"/>
+      <w:pPr>
+        <w:ind w:left="6480" w:hanging="360"/>
+      </w:pPr>
+      <w:rPr>
+        <w:u w:val="none"/>
+      </w:rPr>
+    </w:lvl>
+  </w:abstractNum>
+  <w:abstractNum w:abstractNumId="9">
+    <w:lvl w:ilvl="0">
+      <w:start w:val="1"/>
+      <w:numFmt w:val="bullet"/>
+      <w:lvlText w:val="-"/>
+      <w:lvlJc w:val="left"/>
+      <w:pPr>
+        <w:ind w:left="720" w:hanging="360"/>
+      </w:pPr>
+      <w:rPr>
+        <w:u w:val="none"/>
+      </w:rPr>
+    </w:lvl>
+    <w:lvl w:ilvl="1">
+      <w:start w:val="1"/>
+      <w:numFmt w:val="bullet"/>
+      <w:lvlText w:val="-"/>
+      <w:lvlJc w:val="left"/>
+      <w:pPr>
+        <w:ind w:left="1440" w:hanging="360"/>
+      </w:pPr>
+      <w:rPr>
+        <w:u w:val="none"/>
+      </w:rPr>
+    </w:lvl>
+    <w:lvl w:ilvl="2">
+      <w:start w:val="1"/>
+      <w:numFmt w:val="bullet"/>
+      <w:lvlText w:val="-"/>
+      <w:lvlJc w:val="left"/>
+      <w:pPr>
+        <w:ind w:left="2160" w:hanging="360"/>
+      </w:pPr>
+      <w:rPr>
+        <w:u w:val="none"/>
+      </w:rPr>
+    </w:lvl>
+    <w:lvl w:ilvl="3">
+      <w:start w:val="1"/>
+      <w:numFmt w:val="bullet"/>
+      <w:lvlText w:val="-"/>
+      <w:lvlJc w:val="left"/>
+      <w:pPr>
+        <w:ind w:left="2880" w:hanging="360"/>
+      </w:pPr>
+      <w:rPr>
+        <w:u w:val="none"/>
+      </w:rPr>
+    </w:lvl>
+    <w:lvl w:ilvl="4">
+      <w:start w:val="1"/>
+      <w:numFmt w:val="bullet"/>
+      <w:lvlText w:val="-"/>
+      <w:lvlJc w:val="left"/>
+      <w:pPr>
+        <w:ind w:left="3600" w:hanging="360"/>
+      </w:pPr>
+      <w:rPr>
+        <w:u w:val="none"/>
+      </w:rPr>
+    </w:lvl>
+    <w:lvl w:ilvl="5">
+      <w:start w:val="1"/>
+      <w:numFmt w:val="bullet"/>
+      <w:lvlText w:val="-"/>
+      <w:lvlJc w:val="left"/>
+      <w:pPr>
+        <w:ind w:left="4320" w:hanging="360"/>
+      </w:pPr>
+      <w:rPr>
+        <w:u w:val="none"/>
+      </w:rPr>
+    </w:lvl>
+    <w:lvl w:ilvl="6">
+      <w:start w:val="1"/>
+      <w:numFmt w:val="bullet"/>
+      <w:lvlText w:val="-"/>
+      <w:lvlJc w:val="left"/>
+      <w:pPr>
+        <w:ind w:left="5040" w:hanging="360"/>
+      </w:pPr>
+      <w:rPr>
+        <w:u w:val="none"/>
+      </w:rPr>
+    </w:lvl>
+    <w:lvl w:ilvl="7">
+      <w:start w:val="1"/>
+      <w:numFmt w:val="bullet"/>
+      <w:lvlText w:val="-"/>
+      <w:lvlJc w:val="left"/>
+      <w:pPr>
+        <w:ind w:left="5760" w:hanging="360"/>
+      </w:pPr>
+      <w:rPr>
+        <w:u w:val="none"/>
+      </w:rPr>
+    </w:lvl>
+    <w:lvl w:ilvl="8">
+      <w:start w:val="1"/>
+      <w:numFmt w:val="bullet"/>
+      <w:lvlText w:val="-"/>
+      <w:lvlJc w:val="left"/>
+      <w:pPr>
+        <w:ind w:left="6480" w:hanging="360"/>
+      </w:pPr>
+      <w:rPr>
+        <w:u w:val="none"/>
+      </w:rPr>
+    </w:lvl>
+  </w:abstractNum>
+  <w:abstractNum w:abstractNumId="10">
+    <w:lvl w:ilvl="0">
+      <w:start w:val="1"/>
+      <w:numFmt w:val="bullet"/>
+      <w:lvlText w:val="●"/>
+      <w:lvlJc w:val="left"/>
+      <w:pPr>
+        <w:ind w:left="720" w:hanging="360"/>
+      </w:pPr>
+      <w:rPr>
+        <w:u w:val="none"/>
+      </w:rPr>
+    </w:lvl>
+    <w:lvl w:ilvl="1">
+      <w:start w:val="1"/>
+      <w:numFmt w:val="bullet"/>
+      <w:lvlText w:val="○"/>
+      <w:lvlJc w:val="left"/>
+      <w:pPr>
+        <w:ind w:left="1440" w:hanging="360"/>
+      </w:pPr>
+      <w:rPr>
+        <w:u w:val="none"/>
+      </w:rPr>
+    </w:lvl>
+    <w:lvl w:ilvl="2">
+      <w:start w:val="1"/>
+      <w:numFmt w:val="bullet"/>
+      <w:lvlText w:val="■"/>
+      <w:lvlJc w:val="left"/>
+      <w:pPr>
+        <w:ind w:left="2160" w:hanging="360"/>
+      </w:pPr>
+      <w:rPr>
+        <w:u w:val="none"/>
+      </w:rPr>
+    </w:lvl>
+    <w:lvl w:ilvl="3">
+      <w:start w:val="1"/>
+      <w:numFmt w:val="bullet"/>
+      <w:lvlText w:val="●"/>
+      <w:lvlJc w:val="left"/>
+      <w:pPr>
+        <w:ind w:left="2880" w:hanging="360"/>
+      </w:pPr>
+      <w:rPr>
+        <w:u w:val="none"/>
+      </w:rPr>
+    </w:lvl>
+    <w:lvl w:ilvl="4">
+      <w:start w:val="1"/>
+      <w:numFmt w:val="bullet"/>
+      <w:lvlText w:val="○"/>
+      <w:lvlJc w:val="left"/>
+      <w:pPr>
+        <w:ind w:left="3600" w:hanging="360"/>
+      </w:pPr>
+      <w:rPr>
+        <w:u w:val="none"/>
+      </w:rPr>
+    </w:lvl>
+    <w:lvl w:ilvl="5">
+      <w:start w:val="1"/>
+      <w:numFmt w:val="bullet"/>
+      <w:lvlText w:val="■"/>
+      <w:lvlJc w:val="left"/>
+      <w:pPr>
+        <w:ind w:left="4320" w:hanging="360"/>
+      </w:pPr>
+      <w:rPr>
+        <w:u w:val="none"/>
+      </w:rPr>
+    </w:lvl>
+    <w:lvl w:ilvl="6">
+      <w:start w:val="1"/>
+      <w:numFmt w:val="bullet"/>
+      <w:lvlText w:val="●"/>
+      <w:lvlJc w:val="left"/>
+      <w:pPr>
+        <w:ind w:left="5040" w:hanging="360"/>
+      </w:pPr>
+      <w:rPr>
+        <w:u w:val="none"/>
+      </w:rPr>
+    </w:lvl>
+    <w:lvl w:ilvl="7">
+      <w:start w:val="1"/>
+      <w:numFmt w:val="bullet"/>
+      <w:lvlText w:val="○"/>
+      <w:lvlJc w:val="left"/>
+      <w:pPr>
+        <w:ind w:left="5760" w:hanging="360"/>
+      </w:pPr>
+      <w:rPr>
+        <w:u w:val="none"/>
+      </w:rPr>
+    </w:lvl>
+    <w:lvl w:ilvl="8">
+      <w:start w:val="1"/>
+      <w:numFmt w:val="bullet"/>
+      <w:lvlText w:val="■"/>
+      <w:lvlJc w:val="left"/>
+      <w:pPr>
+        <w:ind w:left="6480" w:hanging="360"/>
+      </w:pPr>
+      <w:rPr>
+        <w:u w:val="none"/>
+      </w:rPr>
+    </w:lvl>
+  </w:abstractNum>
+  <w:abstractNum w:abstractNumId="11">
+    <w:lvl w:ilvl="0">
+      <w:start w:val="1"/>
+      <w:numFmt w:val="bullet"/>
+      <w:lvlText w:val="-"/>
+      <w:lvlJc w:val="left"/>
+      <w:pPr>
+        <w:ind w:left="720" w:hanging="360"/>
+      </w:pPr>
+      <w:rPr>
+        <w:u w:val="none"/>
+      </w:rPr>
+    </w:lvl>
+    <w:lvl w:ilvl="1">
+      <w:start w:val="1"/>
+      <w:numFmt w:val="bullet"/>
+      <w:lvlText w:val="-"/>
+      <w:lvlJc w:val="left"/>
+      <w:pPr>
+        <w:ind w:left="1440" w:hanging="360"/>
+      </w:pPr>
+      <w:rPr>
+        <w:u w:val="none"/>
+      </w:rPr>
+    </w:lvl>
+    <w:lvl w:ilvl="2">
+      <w:start w:val="1"/>
+      <w:numFmt w:val="bullet"/>
+      <w:lvlText w:val="-"/>
+      <w:lvlJc w:val="left"/>
+      <w:pPr>
+        <w:ind w:left="2160" w:hanging="360"/>
+      </w:pPr>
+      <w:rPr>
+        <w:u w:val="none"/>
+      </w:rPr>
+    </w:lvl>
+    <w:lvl w:ilvl="3">
+      <w:start w:val="1"/>
+      <w:numFmt w:val="bullet"/>
+      <w:lvlText w:val="-"/>
+      <w:lvlJc w:val="left"/>
+      <w:pPr>
+        <w:ind w:left="2880" w:hanging="360"/>
+      </w:pPr>
+      <w:rPr>
+        <w:u w:val="none"/>
+      </w:rPr>
+    </w:lvl>
+    <w:lvl w:ilvl="4">
+      <w:start w:val="1"/>
+      <w:numFmt w:val="bullet"/>
+      <w:lvlText w:val="-"/>
+      <w:lvlJc w:val="left"/>
+      <w:pPr>
+        <w:ind w:left="3600" w:hanging="360"/>
+      </w:pPr>
+      <w:rPr>
+        <w:u w:val="none"/>
+      </w:rPr>
+    </w:lvl>
+    <w:lvl w:ilvl="5">
+      <w:start w:val="1"/>
+      <w:numFmt w:val="bullet"/>
+      <w:lvlText w:val="-"/>
+      <w:lvlJc w:val="left"/>
+      <w:pPr>
+        <w:ind w:left="4320" w:hanging="360"/>
+      </w:pPr>
+      <w:rPr>
+        <w:u w:val="none"/>
+      </w:rPr>
+    </w:lvl>
+    <w:lvl w:ilvl="6">
+      <w:start w:val="1"/>
+      <w:numFmt w:val="bullet"/>
+      <w:lvlText w:val="-"/>
+      <w:lvlJc w:val="left"/>
+      <w:pPr>
+        <w:ind w:left="5040" w:hanging="360"/>
+      </w:pPr>
+      <w:rPr>
+        <w:u w:val="none"/>
+      </w:rPr>
+    </w:lvl>
+    <w:lvl w:ilvl="7">
+      <w:start w:val="1"/>
+      <w:numFmt w:val="bullet"/>
+      <w:lvlText w:val="-"/>
+      <w:lvlJc w:val="left"/>
+      <w:pPr>
+        <w:ind w:left="5760" w:hanging="360"/>
+      </w:pPr>
+      <w:rPr>
+        <w:u w:val="none"/>
+      </w:rPr>
+    </w:lvl>
+    <w:lvl w:ilvl="8">
+      <w:start w:val="1"/>
+      <w:numFmt w:val="bullet"/>
+      <w:lvlText w:val="-"/>
+      <w:lvlJc w:val="left"/>
+      <w:pPr>
+        <w:ind w:left="6480" w:hanging="360"/>
+      </w:pPr>
+      <w:rPr>
+        <w:u w:val="none"/>
+      </w:rPr>
+    </w:lvl>
+  </w:abstractNum>
+  <w:abstractNum w:abstractNumId="12">
+    <w:lvl w:ilvl="0">
+      <w:start w:val="1"/>
+      <w:numFmt w:val="bullet"/>
+      <w:lvlText w:val="-"/>
+      <w:lvlJc w:val="left"/>
+      <w:pPr>
+        <w:ind w:left="720" w:hanging="360"/>
+      </w:pPr>
+      <w:rPr>
+        <w:u w:val="none"/>
+      </w:rPr>
+    </w:lvl>
+    <w:lvl w:ilvl="1">
+      <w:start w:val="1"/>
+      <w:numFmt w:val="bullet"/>
+      <w:lvlText w:val="-"/>
+      <w:lvlJc w:val="left"/>
+      <w:pPr>
+        <w:ind w:left="1440" w:hanging="360"/>
+      </w:pPr>
+      <w:rPr>
+        <w:u w:val="none"/>
+      </w:rPr>
+    </w:lvl>
+    <w:lvl w:ilvl="2">
+      <w:start w:val="1"/>
+      <w:numFmt w:val="bullet"/>
+      <w:lvlText w:val="-"/>
+      <w:lvlJc w:val="left"/>
+      <w:pPr>
+        <w:ind w:left="2160" w:hanging="360"/>
+      </w:pPr>
+      <w:rPr>
+        <w:u w:val="none"/>
+      </w:rPr>
+    </w:lvl>
+    <w:lvl w:ilvl="3">
+      <w:start w:val="1"/>
+      <w:numFmt w:val="bullet"/>
+      <w:lvlText w:val="-"/>
+      <w:lvlJc w:val="left"/>
+      <w:pPr>
+        <w:ind w:left="2880" w:hanging="360"/>
+      </w:pPr>
+      <w:rPr>
+        <w:u w:val="none"/>
+      </w:rPr>
+    </w:lvl>
+    <w:lvl w:ilvl="4">
+      <w:start w:val="1"/>
+      <w:numFmt w:val="bullet"/>
+      <w:lvlText w:val="-"/>
+      <w:lvlJc w:val="left"/>
+      <w:pPr>
+        <w:ind w:left="3600" w:hanging="360"/>
+      </w:pPr>
+      <w:rPr>
+        <w:u w:val="none"/>
+      </w:rPr>
+    </w:lvl>
+    <w:lvl w:ilvl="5">
+      <w:start w:val="1"/>
+      <w:numFmt w:val="bullet"/>
+      <w:lvlText w:val="-"/>
+      <w:lvlJc w:val="left"/>
+      <w:pPr>
+        <w:ind w:left="4320" w:hanging="360"/>
+      </w:pPr>
+      <w:rPr>
+        <w:u w:val="none"/>
+      </w:rPr>
+    </w:lvl>
+    <w:lvl w:ilvl="6">
+      <w:start w:val="1"/>
+      <w:numFmt w:val="bullet"/>
+      <w:lvlText w:val="-"/>
+      <w:lvlJc w:val="left"/>
+      <w:pPr>
+        <w:ind w:left="5040" w:hanging="360"/>
+      </w:pPr>
+      <w:rPr>
+        <w:u w:val="none"/>
+      </w:rPr>
+    </w:lvl>
+    <w:lvl w:ilvl="7">
+      <w:start w:val="1"/>
+      <w:numFmt w:val="bullet"/>
+      <w:lvlText w:val="-"/>
+      <w:lvlJc w:val="left"/>
+      <w:pPr>
+        <w:ind w:left="5760" w:hanging="360"/>
+      </w:pPr>
+      <w:rPr>
+        <w:u w:val="none"/>
+      </w:rPr>
+    </w:lvl>
+    <w:lvl w:ilvl="8">
+      <w:start w:val="1"/>
+      <w:numFmt w:val="bullet"/>
+      <w:lvlText w:val="-"/>
+      <w:lvlJc w:val="left"/>
+      <w:pPr>
+        <w:ind w:left="6480" w:hanging="360"/>
+      </w:pPr>
+      <w:rPr>
+        <w:u w:val="none"/>
+      </w:rPr>
+    </w:lvl>
+  </w:abstractNum>
+  <w:abstractNum w:abstractNumId="13">
+    <w:lvl w:ilvl="0">
+      <w:start w:val="1"/>
+      <w:numFmt w:val="bullet"/>
+      <w:lvlText w:val="-"/>
+      <w:lvlJc w:val="left"/>
+      <w:pPr>
+        <w:ind w:left="720" w:hanging="360"/>
+      </w:pPr>
+      <w:rPr>
+        <w:u w:val="none"/>
+      </w:rPr>
+    </w:lvl>
+    <w:lvl w:ilvl="1">
+      <w:start w:val="1"/>
+      <w:numFmt w:val="bullet"/>
+      <w:lvlText w:val="-"/>
+      <w:lvlJc w:val="left"/>
+      <w:pPr>
+        <w:ind w:left="1440" w:hanging="360"/>
+      </w:pPr>
+      <w:rPr>
+        <w:u w:val="none"/>
+      </w:rPr>
+    </w:lvl>
+    <w:lvl w:ilvl="2">
+      <w:start w:val="1"/>
+      <w:numFmt w:val="bullet"/>
+      <w:lvlText w:val="-"/>
+      <w:lvlJc w:val="left"/>
+      <w:pPr>
+        <w:ind w:left="2160" w:hanging="360"/>
+      </w:pPr>
+      <w:rPr>
+        <w:u w:val="none"/>
+      </w:rPr>
+    </w:lvl>
+    <w:lvl w:ilvl="3">
+      <w:start w:val="1"/>
+      <w:numFmt w:val="bullet"/>
+      <w:lvlText w:val="-"/>
+      <w:lvlJc w:val="left"/>
+      <w:pPr>
+        <w:ind w:left="2880" w:hanging="360"/>
+      </w:pPr>
+      <w:rPr>
+        <w:u w:val="none"/>
+      </w:rPr>
+    </w:lvl>
+    <w:lvl w:ilvl="4">
+      <w:start w:val="1"/>
+      <w:numFmt w:val="bullet"/>
+      <w:lvlText w:val="-"/>
+      <w:lvlJc w:val="left"/>
+      <w:pPr>
+        <w:ind w:left="3600" w:hanging="360"/>
+      </w:pPr>
+      <w:rPr>
+        <w:u w:val="none"/>
+      </w:rPr>
+    </w:lvl>
+    <w:lvl w:ilvl="5">
+      <w:start w:val="1"/>
+      <w:numFmt w:val="bullet"/>
+      <w:lvlText w:val="-"/>
+      <w:lvlJc w:val="left"/>
+      <w:pPr>
+        <w:ind w:left="4320" w:hanging="360"/>
+      </w:pPr>
+      <w:rPr>
+        <w:u w:val="none"/>
+      </w:rPr>
+    </w:lvl>
+    <w:lvl w:ilvl="6">
+      <w:start w:val="1"/>
+      <w:numFmt w:val="bullet"/>
+      <w:lvlText w:val="-"/>
+      <w:lvlJc w:val="left"/>
+      <w:pPr>
+        <w:ind w:left="5040" w:hanging="360"/>
+      </w:pPr>
+      <w:rPr>
+        <w:u w:val="none"/>
+      </w:rPr>
+    </w:lvl>
+    <w:lvl w:ilvl="7">
+      <w:start w:val="1"/>
+      <w:numFmt w:val="bullet"/>
+      <w:lvlText w:val="-"/>
+      <w:lvlJc w:val="left"/>
+      <w:pPr>
+        <w:ind w:left="5760" w:hanging="360"/>
+      </w:pPr>
+      <w:rPr>
+        <w:u w:val="none"/>
+      </w:rPr>
+    </w:lvl>
+    <w:lvl w:ilvl="8">
+      <w:start w:val="1"/>
+      <w:numFmt w:val="bullet"/>
+      <w:lvlText w:val="-"/>
+      <w:lvlJc w:val="left"/>
+      <w:pPr>
+        <w:ind w:left="6480" w:hanging="360"/>
+      </w:pPr>
+      <w:rPr>
+        <w:u w:val="none"/>
+      </w:rPr>
+    </w:lvl>
+  </w:abstractNum>
+  <w:abstractNum w:abstractNumId="14">
+    <w:lvl w:ilvl="0">
+      <w:start w:val="1"/>
+      <w:numFmt w:val="bullet"/>
+      <w:lvlText w:val="-"/>
+      <w:lvlJc w:val="left"/>
+      <w:pPr>
+        <w:ind w:left="720" w:hanging="360"/>
+      </w:pPr>
+      <w:rPr>
+        <w:u w:val="none"/>
+      </w:rPr>
+    </w:lvl>
+    <w:lvl w:ilvl="1">
+      <w:start w:val="1"/>
+      <w:numFmt w:val="bullet"/>
+      <w:lvlText w:val="-"/>
+      <w:lvlJc w:val="left"/>
+      <w:pPr>
+        <w:ind w:left="1440" w:hanging="360"/>
+      </w:pPr>
+      <w:rPr>
+        <w:u w:val="none"/>
+      </w:rPr>
+    </w:lvl>
+    <w:lvl w:ilvl="2">
+      <w:start w:val="1"/>
+      <w:numFmt w:val="bullet"/>
+      <w:lvlText w:val="-"/>
+      <w:lvlJc w:val="left"/>
+      <w:pPr>
+        <w:ind w:left="2160" w:hanging="360"/>
+      </w:pPr>
+      <w:rPr>
+        <w:u w:val="none"/>
+      </w:rPr>
+    </w:lvl>
+    <w:lvl w:ilvl="3">
+      <w:start w:val="1"/>
+      <w:numFmt w:val="bullet"/>
+      <w:lvlText w:val="-"/>
+      <w:lvlJc w:val="left"/>
+      <w:pPr>
+        <w:ind w:left="2880" w:hanging="360"/>
+      </w:pPr>
+      <w:rPr>
+        <w:u w:val="none"/>
+      </w:rPr>
+    </w:lvl>
+    <w:lvl w:ilvl="4">
+      <w:start w:val="1"/>
+      <w:numFmt w:val="bullet"/>
+      <w:lvlText w:val="-"/>
+      <w:lvlJc w:val="left"/>
+      <w:pPr>
+        <w:ind w:left="3600" w:hanging="360"/>
+      </w:pPr>
+      <w:rPr>
+        <w:u w:val="none"/>
+      </w:rPr>
+    </w:lvl>
+    <w:lvl w:ilvl="5">
+      <w:start w:val="1"/>
+      <w:numFmt w:val="bullet"/>
+      <w:lvlText w:val="-"/>
+      <w:lvlJc w:val="left"/>
+      <w:pPr>
+        <w:ind w:left="4320" w:hanging="360"/>
+      </w:pPr>
+      <w:rPr>
+        <w:u w:val="none"/>
+      </w:rPr>
+    </w:lvl>
+    <w:lvl w:ilvl="6">
+      <w:start w:val="1"/>
+      <w:numFmt w:val="bullet"/>
+      <w:lvlText w:val="-"/>
+      <w:lvlJc w:val="left"/>
+      <w:pPr>
+        <w:ind w:left="5040" w:hanging="360"/>
+      </w:pPr>
+      <w:rPr>
+        <w:u w:val="none"/>
+      </w:rPr>
+    </w:lvl>
+    <w:lvl w:ilvl="7">
+      <w:start w:val="1"/>
+      <w:numFmt w:val="bullet"/>
+      <w:lvlText w:val="-"/>
+      <w:lvlJc w:val="left"/>
+      <w:pPr>
+        <w:ind w:left="5760" w:hanging="360"/>
+      </w:pPr>
+      <w:rPr>
+        <w:u w:val="none"/>
+      </w:rPr>
+    </w:lvl>
+    <w:lvl w:ilvl="8">
+      <w:start w:val="1"/>
+      <w:numFmt w:val="bullet"/>
+      <w:lvlText w:val="-"/>
+      <w:lvlJc w:val="left"/>
+      <w:pPr>
+        <w:ind w:left="6480" w:hanging="360"/>
+      </w:pPr>
+      <w:rPr>
+        <w:u w:val="none"/>
+      </w:rPr>
+    </w:lvl>
+  </w:abstractNum>
+  <w:abstractNum w:abstractNumId="15">
+    <w:lvl w:ilvl="0">
+      <w:start w:val="1"/>
+      <w:numFmt w:val="bullet"/>
+      <w:lvlText w:val="-"/>
+      <w:lvlJc w:val="left"/>
+      <w:pPr>
+        <w:ind w:left="720" w:hanging="360"/>
+      </w:pPr>
+      <w:rPr>
+        <w:u w:val="none"/>
+      </w:rPr>
+    </w:lvl>
+    <w:lvl w:ilvl="1">
+      <w:start w:val="1"/>
+      <w:numFmt w:val="bullet"/>
+      <w:lvlText w:val="-"/>
+      <w:lvlJc w:val="left"/>
+      <w:pPr>
+        <w:ind w:left="1440" w:hanging="360"/>
+      </w:pPr>
+      <w:rPr>
+        <w:u w:val="none"/>
+      </w:rPr>
+    </w:lvl>
+    <w:lvl w:ilvl="2">
+      <w:start w:val="1"/>
+      <w:numFmt w:val="bullet"/>
+      <w:lvlText w:val="-"/>
+      <w:lvlJc w:val="left"/>
+      <w:pPr>
+        <w:ind w:left="2160" w:hanging="360"/>
+      </w:pPr>
+      <w:rPr>
+        <w:u w:val="none"/>
+      </w:rPr>
+    </w:lvl>
+    <w:lvl w:ilvl="3">
+      <w:start w:val="1"/>
+      <w:numFmt w:val="bullet"/>
+      <w:lvlText w:val="-"/>
+      <w:lvlJc w:val="left"/>
+      <w:pPr>
+        <w:ind w:left="2880" w:hanging="360"/>
+      </w:pPr>
+      <w:rPr>
+        <w:u w:val="none"/>
+      </w:rPr>
+    </w:lvl>
+    <w:lvl w:ilvl="4">
+      <w:start w:val="1"/>
+      <w:numFmt w:val="bullet"/>
+      <w:lvlText w:val="-"/>
+      <w:lvlJc w:val="left"/>
+      <w:pPr>
+        <w:ind w:left="3600" w:hanging="360"/>
+      </w:pPr>
+      <w:rPr>
+        <w:u w:val="none"/>
+      </w:rPr>
+    </w:lvl>
+    <w:lvl w:ilvl="5">
+      <w:start w:val="1"/>
+      <w:numFmt w:val="bullet"/>
+      <w:lvlText w:val="-"/>
+      <w:lvlJc w:val="left"/>
+      <w:pPr>
+        <w:ind w:left="4320" w:hanging="360"/>
+      </w:pPr>
+      <w:rPr>
+        <w:u w:val="none"/>
+      </w:rPr>
+    </w:lvl>
+    <w:lvl w:ilvl="6">
+      <w:start w:val="1"/>
+      <w:numFmt w:val="bullet"/>
+      <w:lvlText w:val="-"/>
+      <w:lvlJc w:val="left"/>
+      <w:pPr>
+        <w:ind w:left="5040" w:hanging="360"/>
+      </w:pPr>
+      <w:rPr>
+        <w:u w:val="none"/>
+      </w:rPr>
+    </w:lvl>
+    <w:lvl w:ilvl="7">
+      <w:start w:val="1"/>
+      <w:numFmt w:val="bullet"/>
+      <w:lvlText w:val="-"/>
+      <w:lvlJc w:val="left"/>
+      <w:pPr>
+        <w:ind w:left="5760" w:hanging="360"/>
+      </w:pPr>
+      <w:rPr>
+        <w:u w:val="none"/>
+      </w:rPr>
+    </w:lvl>
+    <w:lvl w:ilvl="8">
+      <w:start w:val="1"/>
+      <w:numFmt w:val="bullet"/>
+      <w:lvlText w:val="-"/>
+      <w:lvlJc w:val="left"/>
+      <w:pPr>
+        <w:ind w:left="6480" w:hanging="360"/>
+      </w:pPr>
+      <w:rPr>
+        <w:u w:val="none"/>
+      </w:rPr>
+    </w:lvl>
+  </w:abstractNum>
+  <w:abstractNum w:abstractNumId="16">
+    <w:lvl w:ilvl="0">
+      <w:start w:val="1"/>
+      <w:numFmt w:val="bullet"/>
+      <w:lvlText w:val="-"/>
+      <w:lvlJc w:val="left"/>
+      <w:pPr>
+        <w:ind w:left="720" w:hanging="360"/>
+      </w:pPr>
+      <w:rPr>
+        <w:u w:val="none"/>
+      </w:rPr>
+    </w:lvl>
+    <w:lvl w:ilvl="1">
+      <w:start w:val="1"/>
+      <w:numFmt w:val="bullet"/>
+      <w:lvlText w:val="-"/>
+      <w:lvlJc w:val="left"/>
+      <w:pPr>
+        <w:ind w:left="1440" w:hanging="360"/>
+      </w:pPr>
+      <w:rPr>
+        <w:u w:val="none"/>
+      </w:rPr>
+    </w:lvl>
+    <w:lvl w:ilvl="2">
+      <w:start w:val="1"/>
+      <w:numFmt w:val="bullet"/>
+      <w:lvlText w:val="-"/>
+      <w:lvlJc w:val="left"/>
+      <w:pPr>
+        <w:ind w:left="2160" w:hanging="360"/>
+      </w:pPr>
+      <w:rPr>
+        <w:u w:val="none"/>
+      </w:rPr>
+    </w:lvl>
+    <w:lvl w:ilvl="3">
+      <w:start w:val="1"/>
+      <w:numFmt w:val="bullet"/>
+      <w:lvlText w:val="-"/>
+      <w:lvlJc w:val="left"/>
+      <w:pPr>
+        <w:ind w:left="2880" w:hanging="360"/>
+      </w:pPr>
+      <w:rPr>
+        <w:u w:val="none"/>
+      </w:rPr>
+    </w:lvl>
+    <w:lvl w:ilvl="4">
+      <w:start w:val="1"/>
+      <w:numFmt w:val="bullet"/>
+      <w:lvlText w:val="-"/>
+      <w:lvlJc w:val="left"/>
+      <w:pPr>
+        <w:ind w:left="3600" w:hanging="360"/>
+      </w:pPr>
+      <w:rPr>
+        <w:u w:val="none"/>
+      </w:rPr>
+    </w:lvl>
+    <w:lvl w:ilvl="5">
+      <w:start w:val="1"/>
+      <w:numFmt w:val="bullet"/>
+      <w:lvlText w:val="-"/>
+      <w:lvlJc w:val="left"/>
+      <w:pPr>
+        <w:ind w:left="4320" w:hanging="360"/>
+      </w:pPr>
+      <w:rPr>
+        <w:u w:val="none"/>
+      </w:rPr>
+    </w:lvl>
+    <w:lvl w:ilvl="6">
+      <w:start w:val="1"/>
+      <w:numFmt w:val="bullet"/>
+      <w:lvlText w:val="-"/>
+      <w:lvlJc w:val="left"/>
+      <w:pPr>
+        <w:ind w:left="5040" w:hanging="360"/>
+      </w:pPr>
+      <w:rPr>
+        <w:u w:val="none"/>
+      </w:rPr>
+    </w:lvl>
+    <w:lvl w:ilvl="7">
+      <w:start w:val="1"/>
+      <w:numFmt w:val="bullet"/>
+      <w:lvlText w:val="-"/>
+      <w:lvlJc w:val="left"/>
+      <w:pPr>
+        <w:ind w:left="5760" w:hanging="360"/>
+      </w:pPr>
+      <w:rPr>
+        <w:u w:val="none"/>
+      </w:rPr>
+    </w:lvl>
+    <w:lvl w:ilvl="8">
+      <w:start w:val="1"/>
+      <w:numFmt w:val="bullet"/>
+      <w:lvlText w:val="-"/>
+      <w:lvlJc w:val="left"/>
+      <w:pPr>
+        <w:ind w:left="6480" w:hanging="360"/>
+      </w:pPr>
+      <w:rPr>
+        <w:u w:val="none"/>
+      </w:rPr>
+    </w:lvl>
+  </w:abstractNum>
+  <w:abstractNum w:abstractNumId="17">
     <w:lvl w:ilvl="0">
       <w:start w:val="1"/>
       <w:numFmt w:val="bullet"/>
@@ -8512,6 +9951,39 @@
   </w:num>
   <w:num w:numId="6">
     <w:abstractNumId w:val="6"/>
+  </w:num>
+  <w:num w:numId="7">
+    <w:abstractNumId w:val="7"/>
+  </w:num>
+  <w:num w:numId="8">
+    <w:abstractNumId w:val="8"/>
+  </w:num>
+  <w:num w:numId="9">
+    <w:abstractNumId w:val="9"/>
+  </w:num>
+  <w:num w:numId="10">
+    <w:abstractNumId w:val="10"/>
+  </w:num>
+  <w:num w:numId="11">
+    <w:abstractNumId w:val="11"/>
+  </w:num>
+  <w:num w:numId="12">
+    <w:abstractNumId w:val="12"/>
+  </w:num>
+  <w:num w:numId="13">
+    <w:abstractNumId w:val="13"/>
+  </w:num>
+  <w:num w:numId="14">
+    <w:abstractNumId w:val="14"/>
+  </w:num>
+  <w:num w:numId="15">
+    <w:abstractNumId w:val="15"/>
+  </w:num>
+  <w:num w:numId="16">
+    <w:abstractNumId w:val="16"/>
+  </w:num>
+  <w:num w:numId="17">
+    <w:abstractNumId w:val="17"/>
   </w:num>
 </w:numbering>
 </file>

</xml_diff>

<commit_message>
minor syllabus updates (notes on specific sub-topics)
</commit_message>
<xml_diff>
--- a/syllabus/Community Ecology Syllabus 2025.docx
+++ b/syllabus/Community Ecology Syllabus 2025.docx
@@ -455,7 +455,7 @@
         <w:pStyle w:val="Heading1"/>
         <w:numPr>
           <w:ilvl w:val="0"/>
-          <w:numId w:val="7"/>
+          <w:numId w:val="8"/>
         </w:numPr>
         <w:tabs>
           <w:tab w:val="left" w:leader="none" w:pos="540"/>
@@ -521,7 +521,7 @@
         <w:pStyle w:val="Heading1"/>
         <w:numPr>
           <w:ilvl w:val="0"/>
-          <w:numId w:val="7"/>
+          <w:numId w:val="8"/>
         </w:numPr>
         <w:tabs>
           <w:tab w:val="left" w:leader="none" w:pos="540"/>
@@ -638,7 +638,7 @@
         <w:pStyle w:val="Heading1"/>
         <w:numPr>
           <w:ilvl w:val="0"/>
-          <w:numId w:val="7"/>
+          <w:numId w:val="8"/>
         </w:numPr>
         <w:tabs>
           <w:tab w:val="left" w:leader="none" w:pos="540"/>
@@ -705,7 +705,7 @@
         <w:pStyle w:val="Heading1"/>
         <w:numPr>
           <w:ilvl w:val="0"/>
-          <w:numId w:val="7"/>
+          <w:numId w:val="8"/>
         </w:numPr>
         <w:tabs>
           <w:tab w:val="left" w:leader="none" w:pos="540"/>
@@ -773,7 +773,7 @@
         <w:pStyle w:val="Heading1"/>
         <w:numPr>
           <w:ilvl w:val="0"/>
-          <w:numId w:val="7"/>
+          <w:numId w:val="8"/>
         </w:numPr>
         <w:tabs>
           <w:tab w:val="left" w:leader="none" w:pos="540"/>
@@ -816,7 +816,7 @@
       <w:pPr>
         <w:numPr>
           <w:ilvl w:val="0"/>
-          <w:numId w:val="10"/>
+          <w:numId w:val="13"/>
         </w:numPr>
         <w:ind w:left="720" w:hanging="360"/>
         <w:rPr>
@@ -840,7 +840,7 @@
       <w:pPr>
         <w:numPr>
           <w:ilvl w:val="0"/>
-          <w:numId w:val="10"/>
+          <w:numId w:val="13"/>
         </w:numPr>
         <w:ind w:left="720" w:hanging="360"/>
         <w:rPr>
@@ -864,7 +864,7 @@
       <w:pPr>
         <w:numPr>
           <w:ilvl w:val="0"/>
-          <w:numId w:val="10"/>
+          <w:numId w:val="13"/>
         </w:numPr>
         <w:ind w:left="720" w:hanging="360"/>
         <w:rPr>
@@ -888,7 +888,7 @@
       <w:pPr>
         <w:numPr>
           <w:ilvl w:val="0"/>
-          <w:numId w:val="10"/>
+          <w:numId w:val="13"/>
         </w:numPr>
         <w:ind w:left="720" w:hanging="360"/>
         <w:rPr>
@@ -912,7 +912,7 @@
       <w:pPr>
         <w:numPr>
           <w:ilvl w:val="0"/>
-          <w:numId w:val="10"/>
+          <w:numId w:val="13"/>
         </w:numPr>
         <w:ind w:left="720" w:hanging="360"/>
         <w:rPr>
@@ -966,7 +966,7 @@
         <w:pStyle w:val="Heading1"/>
         <w:numPr>
           <w:ilvl w:val="0"/>
-          <w:numId w:val="7"/>
+          <w:numId w:val="8"/>
         </w:numPr>
         <w:tabs>
           <w:tab w:val="left" w:leader="none" w:pos="540"/>
@@ -1118,7 +1118,7 @@
         <w:pStyle w:val="Heading1"/>
         <w:numPr>
           <w:ilvl w:val="0"/>
-          <w:numId w:val="7"/>
+          <w:numId w:val="8"/>
         </w:numPr>
         <w:tabs>
           <w:tab w:val="left" w:leader="none" w:pos="540"/>
@@ -1315,7 +1315,7 @@
         <w:pStyle w:val="Heading1"/>
         <w:numPr>
           <w:ilvl w:val="0"/>
-          <w:numId w:val="7"/>
+          <w:numId w:val="8"/>
         </w:numPr>
         <w:tabs>
           <w:tab w:val="left" w:leader="none" w:pos="540"/>
@@ -2166,7 +2166,7 @@
         <w:pStyle w:val="Heading1"/>
         <w:numPr>
           <w:ilvl w:val="0"/>
-          <w:numId w:val="7"/>
+          <w:numId w:val="8"/>
         </w:numPr>
         <w:tabs>
           <w:tab w:val="left" w:leader="none" w:pos="540"/>
@@ -2227,7 +2227,7 @@
         <w:pStyle w:val="Heading1"/>
         <w:numPr>
           <w:ilvl w:val="0"/>
-          <w:numId w:val="7"/>
+          <w:numId w:val="8"/>
         </w:numPr>
         <w:tabs>
           <w:tab w:val="left" w:leader="none" w:pos="540"/>
@@ -2653,7 +2653,7 @@
                   <w:widowControl w:val="0"/>
                   <w:numPr>
                     <w:ilvl w:val="0"/>
-                    <w:numId w:val="14"/>
+                    <w:numId w:val="17"/>
                   </w:numPr>
                   <w:ind w:left="720" w:hanging="360"/>
                   <w:rPr>
@@ -2678,7 +2678,7 @@
                   <w:widowControl w:val="0"/>
                   <w:numPr>
                     <w:ilvl w:val="0"/>
-                    <w:numId w:val="14"/>
+                    <w:numId w:val="17"/>
                   </w:numPr>
                   <w:ind w:left="720" w:hanging="360"/>
                   <w:rPr>
@@ -2703,7 +2703,7 @@
                   <w:widowControl w:val="0"/>
                   <w:numPr>
                     <w:ilvl w:val="0"/>
-                    <w:numId w:val="14"/>
+                    <w:numId w:val="17"/>
                   </w:numPr>
                   <w:ind w:left="720" w:hanging="360"/>
                   <w:rPr>
@@ -3077,7 +3077,7 @@
                   <w:widowControl w:val="0"/>
                   <w:numPr>
                     <w:ilvl w:val="0"/>
-                    <w:numId w:val="6"/>
+                    <w:numId w:val="7"/>
                   </w:numPr>
                   <w:ind w:left="720" w:hanging="360"/>
                   <w:rPr>
@@ -3340,7 +3340,7 @@
                   <w:widowControl w:val="0"/>
                   <w:numPr>
                     <w:ilvl w:val="0"/>
-                    <w:numId w:val="13"/>
+                    <w:numId w:val="16"/>
                   </w:numPr>
                   <w:ind w:left="720" w:hanging="360"/>
                   <w:rPr>
@@ -3365,7 +3365,7 @@
                   <w:widowControl w:val="0"/>
                   <w:numPr>
                     <w:ilvl w:val="0"/>
-                    <w:numId w:val="13"/>
+                    <w:numId w:val="16"/>
                   </w:numPr>
                   <w:ind w:left="720" w:hanging="360"/>
                   <w:rPr>
@@ -3390,7 +3390,7 @@
                   <w:widowControl w:val="0"/>
                   <w:numPr>
                     <w:ilvl w:val="0"/>
-                    <w:numId w:val="13"/>
+                    <w:numId w:val="16"/>
                   </w:numPr>
                   <w:ind w:left="720" w:hanging="360"/>
                   <w:rPr>
@@ -3511,7 +3511,7 @@
                   <w:widowControl w:val="0"/>
                   <w:numPr>
                     <w:ilvl w:val="0"/>
-                    <w:numId w:val="12"/>
+                    <w:numId w:val="15"/>
                   </w:numPr>
                   <w:ind w:left="720" w:hanging="360"/>
                   <w:rPr>
@@ -4709,7 +4709,7 @@
                   <w:widowControl w:val="0"/>
                   <w:numPr>
                     <w:ilvl w:val="0"/>
-                    <w:numId w:val="17"/>
+                    <w:numId w:val="21"/>
                   </w:numPr>
                   <w:ind w:left="720" w:hanging="360"/>
                   <w:rPr>
@@ -5060,7 +5060,7 @@
                   <w:widowControl w:val="0"/>
                   <w:numPr>
                     <w:ilvl w:val="0"/>
-                    <w:numId w:val="15"/>
+                    <w:numId w:val="18"/>
                   </w:numPr>
                   <w:ind w:left="720" w:hanging="360"/>
                   <w:rPr>
@@ -5301,7 +5301,7 @@
                   <w:widowControl w:val="0"/>
                   <w:numPr>
                     <w:ilvl w:val="0"/>
-                    <w:numId w:val="16"/>
+                    <w:numId w:val="20"/>
                   </w:numPr>
                   <w:ind w:left="720" w:hanging="360"/>
                   <w:rPr>
@@ -5543,7 +5543,7 @@
                   <w:widowControl w:val="0"/>
                   <w:numPr>
                     <w:ilvl w:val="0"/>
-                    <w:numId w:val="9"/>
+                    <w:numId w:val="11"/>
                   </w:numPr>
                   <w:ind w:left="720" w:hanging="360"/>
                   <w:rPr>
@@ -5829,6 +5829,31 @@
                   <w:t xml:space="preserve">Patchy environments</w:t>
                 </w:r>
               </w:p>
+              <w:p>
+                <w:pPr>
+                  <w:widowControl w:val="0"/>
+                  <w:numPr>
+                    <w:ilvl w:val="0"/>
+                    <w:numId w:val="12"/>
+                  </w:numPr>
+                  <w:ind w:left="720" w:hanging="360"/>
+                  <w:rPr>
+                    <w:rFonts w:ascii="Arial" w:cs="Arial" w:eastAsia="Arial" w:hAnsi="Arial"/>
+                    <w:sz w:val="22"/>
+                    <w:szCs w:val="22"/>
+                    <w:u w:val="none"/>
+                  </w:rPr>
+                </w:pPr>
+                <w:r>
+                  <w:rPr>
+                    <w:rFonts w:ascii="Arial" w:cs="Arial" w:eastAsia="Arial" w:hAnsi="Arial"/>
+                    <w:sz w:val="22"/>
+                    <w:szCs w:val="22"/>
+                    <w:rtl w:val="0"/>
+                  </w:rPr>
+                  <w:t xml:space="preserve">Introduction</w:t>
+                </w:r>
+              </w:p>
             </w:tc>
             <w:tc>
               <w:tcPr>
@@ -5925,6 +5950,31 @@
                   <w:t xml:space="preserve">Patchy environments</w:t>
                 </w:r>
               </w:p>
+              <w:p>
+                <w:pPr>
+                  <w:widowControl w:val="0"/>
+                  <w:numPr>
+                    <w:ilvl w:val="0"/>
+                    <w:numId w:val="6"/>
+                  </w:numPr>
+                  <w:ind w:left="720" w:hanging="360"/>
+                  <w:rPr>
+                    <w:rFonts w:ascii="Arial" w:cs="Arial" w:eastAsia="Arial" w:hAnsi="Arial"/>
+                    <w:sz w:val="22"/>
+                    <w:szCs w:val="22"/>
+                    <w:u w:val="none"/>
+                  </w:rPr>
+                </w:pPr>
+                <w:r>
+                  <w:rPr>
+                    <w:rFonts w:ascii="Arial" w:cs="Arial" w:eastAsia="Arial" w:hAnsi="Arial"/>
+                    <w:sz w:val="22"/>
+                    <w:szCs w:val="22"/>
+                    <w:rtl w:val="0"/>
+                  </w:rPr>
+                  <w:t xml:space="preserve">Coexistence</w:t>
+                </w:r>
+              </w:p>
             </w:tc>
             <w:tc>
               <w:tcPr>
@@ -6027,6 +6077,55 @@
                   <w:t xml:space="preserve">Metacommunities</w:t>
                 </w:r>
               </w:p>
+              <w:p>
+                <w:pPr>
+                  <w:widowControl w:val="0"/>
+                  <w:numPr>
+                    <w:ilvl w:val="0"/>
+                    <w:numId w:val="19"/>
+                  </w:numPr>
+                  <w:ind w:left="720" w:hanging="360"/>
+                  <w:rPr>
+                    <w:rFonts w:ascii="Arial" w:cs="Arial" w:eastAsia="Arial" w:hAnsi="Arial"/>
+                    <w:sz w:val="22"/>
+                    <w:szCs w:val="22"/>
+                    <w:u w:val="none"/>
+                  </w:rPr>
+                </w:pPr>
+                <w:r>
+                  <w:rPr>
+                    <w:rFonts w:ascii="Arial" w:cs="Arial" w:eastAsia="Arial" w:hAnsi="Arial"/>
+                    <w:sz w:val="22"/>
+                    <w:szCs w:val="22"/>
+                    <w:rtl w:val="0"/>
+                  </w:rPr>
+                  <w:t xml:space="preserve">Species sorting</w:t>
+                </w:r>
+              </w:p>
+              <w:p>
+                <w:pPr>
+                  <w:widowControl w:val="0"/>
+                  <w:numPr>
+                    <w:ilvl w:val="0"/>
+                    <w:numId w:val="19"/>
+                  </w:numPr>
+                  <w:ind w:left="720" w:hanging="360"/>
+                  <w:rPr>
+                    <w:rFonts w:ascii="Arial" w:cs="Arial" w:eastAsia="Arial" w:hAnsi="Arial"/>
+                    <w:sz w:val="22"/>
+                    <w:szCs w:val="22"/>
+                  </w:rPr>
+                </w:pPr>
+                <w:r>
+                  <w:rPr>
+                    <w:rFonts w:ascii="Arial" w:cs="Arial" w:eastAsia="Arial" w:hAnsi="Arial"/>
+                    <w:sz w:val="22"/>
+                    <w:szCs w:val="22"/>
+                    <w:rtl w:val="0"/>
+                  </w:rPr>
+                  <w:t xml:space="preserve">Mass effects</w:t>
+                </w:r>
+              </w:p>
             </w:tc>
             <w:tc>
               <w:tcPr>
@@ -6123,6 +6222,31 @@
                   <w:t xml:space="preserve">Metacommunities</w:t>
                 </w:r>
               </w:p>
+              <w:p>
+                <w:pPr>
+                  <w:widowControl w:val="0"/>
+                  <w:numPr>
+                    <w:ilvl w:val="0"/>
+                    <w:numId w:val="10"/>
+                  </w:numPr>
+                  <w:ind w:left="720" w:hanging="360"/>
+                  <w:rPr>
+                    <w:rFonts w:ascii="Arial" w:cs="Arial" w:eastAsia="Arial" w:hAnsi="Arial"/>
+                    <w:sz w:val="22"/>
+                    <w:szCs w:val="22"/>
+                    <w:u w:val="none"/>
+                  </w:rPr>
+                </w:pPr>
+                <w:r>
+                  <w:rPr>
+                    <w:rFonts w:ascii="Arial" w:cs="Arial" w:eastAsia="Arial" w:hAnsi="Arial"/>
+                    <w:sz w:val="22"/>
+                    <w:szCs w:val="22"/>
+                    <w:rtl w:val="0"/>
+                  </w:rPr>
+                  <w:t xml:space="preserve">Neutral Theory</w:t>
+                </w:r>
+              </w:p>
             </w:tc>
             <w:tc>
               <w:tcPr>
@@ -6230,7 +6354,7 @@
                   <w:widowControl w:val="0"/>
                   <w:numPr>
                     <w:ilvl w:val="0"/>
-                    <w:numId w:val="8"/>
+                    <w:numId w:val="9"/>
                   </w:numPr>
                   <w:ind w:left="720" w:hanging="360"/>
                   <w:rPr>
@@ -6351,7 +6475,7 @@
                   <w:widowControl w:val="0"/>
                   <w:numPr>
                     <w:ilvl w:val="0"/>
-                    <w:numId w:val="11"/>
+                    <w:numId w:val="14"/>
                   </w:numPr>
                   <w:ind w:left="720" w:hanging="360"/>
                   <w:rPr>
@@ -6570,7 +6694,7 @@
         <w:pStyle w:val="Heading1"/>
         <w:numPr>
           <w:ilvl w:val="0"/>
-          <w:numId w:val="7"/>
+          <w:numId w:val="8"/>
         </w:numPr>
         <w:tabs>
           <w:tab w:val="left" w:leader="none" w:pos="540"/>
@@ -6693,7 +6817,7 @@
         <w:pStyle w:val="Heading1"/>
         <w:numPr>
           <w:ilvl w:val="0"/>
-          <w:numId w:val="7"/>
+          <w:numId w:val="8"/>
         </w:numPr>
         <w:tabs>
           <w:tab w:val="left" w:leader="none" w:pos="540"/>
@@ -7132,7 +7256,7 @@
         <w:pStyle w:val="Heading1"/>
         <w:numPr>
           <w:ilvl w:val="0"/>
-          <w:numId w:val="7"/>
+          <w:numId w:val="8"/>
         </w:numPr>
         <w:tabs>
           <w:tab w:val="left" w:leader="none" w:pos="540"/>
@@ -7342,7 +7466,7 @@
         <w:pStyle w:val="Heading1"/>
         <w:numPr>
           <w:ilvl w:val="0"/>
-          <w:numId w:val="7"/>
+          <w:numId w:val="8"/>
         </w:numPr>
         <w:tabs>
           <w:tab w:val="left" w:leader="none" w:pos="540"/>
@@ -7704,7 +7828,7 @@
         <w:pStyle w:val="Heading1"/>
         <w:numPr>
           <w:ilvl w:val="0"/>
-          <w:numId w:val="7"/>
+          <w:numId w:val="8"/>
         </w:numPr>
         <w:tabs>
           <w:tab w:val="left" w:leader="none" w:pos="540"/>
@@ -8743,205 +8867,205 @@
   <w:abstractNum w:abstractNumId="7">
     <w:lvl w:ilvl="0">
       <w:start w:val="1"/>
-      <w:numFmt w:val="upperRoman"/>
-      <w:lvlText w:val="%1."/>
-      <w:lvlJc w:val="left"/>
-      <w:pPr>
-        <w:ind w:left="2952" w:hanging="432"/>
-      </w:pPr>
-      <w:rPr>
-        <w:rFonts w:ascii="Calibri" w:cs="Calibri" w:eastAsia="Calibri" w:hAnsi="Calibri"/>
+      <w:numFmt w:val="bullet"/>
+      <w:lvlText w:val="-"/>
+      <w:lvlJc w:val="left"/>
+      <w:pPr>
+        <w:ind w:left="720" w:hanging="360"/>
+      </w:pPr>
+      <w:rPr>
+        <w:u w:val="none"/>
       </w:rPr>
     </w:lvl>
     <w:lvl w:ilvl="1">
       <w:start w:val="1"/>
-      <w:numFmt w:val="decimal"/>
-      <w:lvlText w:val="%1.%2."/>
-      <w:lvlJc w:val="left"/>
-      <w:pPr>
-        <w:ind w:left="576" w:hanging="576"/>
-      </w:pPr>
-      <w:rPr/>
+      <w:numFmt w:val="bullet"/>
+      <w:lvlText w:val="-"/>
+      <w:lvlJc w:val="left"/>
+      <w:pPr>
+        <w:ind w:left="1440" w:hanging="360"/>
+      </w:pPr>
+      <w:rPr>
+        <w:u w:val="none"/>
+      </w:rPr>
     </w:lvl>
     <w:lvl w:ilvl="2">
       <w:start w:val="1"/>
-      <w:numFmt w:val="decimal"/>
-      <w:lvlText w:val="%1.%2.%3"/>
-      <w:lvlJc w:val="left"/>
-      <w:pPr>
-        <w:ind w:left="720" w:hanging="720"/>
-      </w:pPr>
-      <w:rPr/>
+      <w:numFmt w:val="bullet"/>
+      <w:lvlText w:val="-"/>
+      <w:lvlJc w:val="left"/>
+      <w:pPr>
+        <w:ind w:left="2160" w:hanging="360"/>
+      </w:pPr>
+      <w:rPr>
+        <w:u w:val="none"/>
+      </w:rPr>
     </w:lvl>
     <w:lvl w:ilvl="3">
       <w:start w:val="1"/>
-      <w:numFmt w:val="decimal"/>
-      <w:lvlText w:val="%1.%2.%3.%4"/>
-      <w:lvlJc w:val="left"/>
-      <w:pPr>
-        <w:ind w:left="864" w:hanging="864"/>
-      </w:pPr>
-      <w:rPr/>
+      <w:numFmt w:val="bullet"/>
+      <w:lvlText w:val="-"/>
+      <w:lvlJc w:val="left"/>
+      <w:pPr>
+        <w:ind w:left="2880" w:hanging="360"/>
+      </w:pPr>
+      <w:rPr>
+        <w:u w:val="none"/>
+      </w:rPr>
     </w:lvl>
     <w:lvl w:ilvl="4">
       <w:start w:val="1"/>
-      <w:numFmt w:val="decimal"/>
-      <w:lvlText w:val="%1.%2.%3.%4.%5"/>
-      <w:lvlJc w:val="left"/>
-      <w:pPr>
-        <w:ind w:left="1008" w:hanging="1008"/>
-      </w:pPr>
-      <w:rPr/>
+      <w:numFmt w:val="bullet"/>
+      <w:lvlText w:val="-"/>
+      <w:lvlJc w:val="left"/>
+      <w:pPr>
+        <w:ind w:left="3600" w:hanging="360"/>
+      </w:pPr>
+      <w:rPr>
+        <w:u w:val="none"/>
+      </w:rPr>
     </w:lvl>
     <w:lvl w:ilvl="5">
       <w:start w:val="1"/>
-      <w:numFmt w:val="decimal"/>
-      <w:lvlText w:val="%1.%2.%3.%4.%5.%6"/>
-      <w:lvlJc w:val="left"/>
-      <w:pPr>
-        <w:ind w:left="1152" w:hanging="1152"/>
-      </w:pPr>
-      <w:rPr/>
+      <w:numFmt w:val="bullet"/>
+      <w:lvlText w:val="-"/>
+      <w:lvlJc w:val="left"/>
+      <w:pPr>
+        <w:ind w:left="4320" w:hanging="360"/>
+      </w:pPr>
+      <w:rPr>
+        <w:u w:val="none"/>
+      </w:rPr>
     </w:lvl>
     <w:lvl w:ilvl="6">
       <w:start w:val="1"/>
-      <w:numFmt w:val="decimal"/>
-      <w:lvlText w:val="%1.%2.%3.%4.%5.%6.%7"/>
-      <w:lvlJc w:val="left"/>
-      <w:pPr>
-        <w:ind w:left="1296" w:hanging="1296"/>
-      </w:pPr>
-      <w:rPr/>
+      <w:numFmt w:val="bullet"/>
+      <w:lvlText w:val="-"/>
+      <w:lvlJc w:val="left"/>
+      <w:pPr>
+        <w:ind w:left="5040" w:hanging="360"/>
+      </w:pPr>
+      <w:rPr>
+        <w:u w:val="none"/>
+      </w:rPr>
     </w:lvl>
     <w:lvl w:ilvl="7">
       <w:start w:val="1"/>
-      <w:numFmt w:val="decimal"/>
-      <w:lvlText w:val="%1.%2.%3.%4.%5.%6.%7.%8"/>
-      <w:lvlJc w:val="left"/>
-      <w:pPr>
-        <w:ind w:left="1440" w:hanging="1440"/>
-      </w:pPr>
-      <w:rPr/>
+      <w:numFmt w:val="bullet"/>
+      <w:lvlText w:val="-"/>
+      <w:lvlJc w:val="left"/>
+      <w:pPr>
+        <w:ind w:left="5760" w:hanging="360"/>
+      </w:pPr>
+      <w:rPr>
+        <w:u w:val="none"/>
+      </w:rPr>
     </w:lvl>
     <w:lvl w:ilvl="8">
       <w:start w:val="1"/>
-      <w:numFmt w:val="decimal"/>
-      <w:lvlText w:val="%1.%2.%3.%4.%5.%6.%7.%8.%9"/>
-      <w:lvlJc w:val="left"/>
-      <w:pPr>
-        <w:ind w:left="1584" w:hanging="1584"/>
-      </w:pPr>
-      <w:rPr/>
+      <w:numFmt w:val="bullet"/>
+      <w:lvlText w:val="-"/>
+      <w:lvlJc w:val="left"/>
+      <w:pPr>
+        <w:ind w:left="6480" w:hanging="360"/>
+      </w:pPr>
+      <w:rPr>
+        <w:u w:val="none"/>
+      </w:rPr>
     </w:lvl>
   </w:abstractNum>
   <w:abstractNum w:abstractNumId="8">
     <w:lvl w:ilvl="0">
       <w:start w:val="1"/>
-      <w:numFmt w:val="bullet"/>
-      <w:lvlText w:val="-"/>
-      <w:lvlJc w:val="left"/>
-      <w:pPr>
-        <w:ind w:left="720" w:hanging="360"/>
-      </w:pPr>
-      <w:rPr>
-        <w:u w:val="none"/>
+      <w:numFmt w:val="upperRoman"/>
+      <w:lvlText w:val="%1."/>
+      <w:lvlJc w:val="left"/>
+      <w:pPr>
+        <w:ind w:left="2952" w:hanging="432"/>
+      </w:pPr>
+      <w:rPr>
+        <w:rFonts w:ascii="Calibri" w:cs="Calibri" w:eastAsia="Calibri" w:hAnsi="Calibri"/>
       </w:rPr>
     </w:lvl>
     <w:lvl w:ilvl="1">
       <w:start w:val="1"/>
-      <w:numFmt w:val="bullet"/>
-      <w:lvlText w:val="-"/>
-      <w:lvlJc w:val="left"/>
-      <w:pPr>
-        <w:ind w:left="1440" w:hanging="360"/>
-      </w:pPr>
-      <w:rPr>
-        <w:u w:val="none"/>
-      </w:rPr>
+      <w:numFmt w:val="decimal"/>
+      <w:lvlText w:val="%1.%2."/>
+      <w:lvlJc w:val="left"/>
+      <w:pPr>
+        <w:ind w:left="576" w:hanging="576"/>
+      </w:pPr>
+      <w:rPr/>
     </w:lvl>
     <w:lvl w:ilvl="2">
       <w:start w:val="1"/>
-      <w:numFmt w:val="bullet"/>
-      <w:lvlText w:val="-"/>
-      <w:lvlJc w:val="left"/>
-      <w:pPr>
-        <w:ind w:left="2160" w:hanging="360"/>
-      </w:pPr>
-      <w:rPr>
-        <w:u w:val="none"/>
-      </w:rPr>
+      <w:numFmt w:val="decimal"/>
+      <w:lvlText w:val="%1.%2.%3"/>
+      <w:lvlJc w:val="left"/>
+      <w:pPr>
+        <w:ind w:left="720" w:hanging="720"/>
+      </w:pPr>
+      <w:rPr/>
     </w:lvl>
     <w:lvl w:ilvl="3">
       <w:start w:val="1"/>
-      <w:numFmt w:val="bullet"/>
-      <w:lvlText w:val="-"/>
-      <w:lvlJc w:val="left"/>
-      <w:pPr>
-        <w:ind w:left="2880" w:hanging="360"/>
-      </w:pPr>
-      <w:rPr>
-        <w:u w:val="none"/>
-      </w:rPr>
+      <w:numFmt w:val="decimal"/>
+      <w:lvlText w:val="%1.%2.%3.%4"/>
+      <w:lvlJc w:val="left"/>
+      <w:pPr>
+        <w:ind w:left="864" w:hanging="864"/>
+      </w:pPr>
+      <w:rPr/>
     </w:lvl>
     <w:lvl w:ilvl="4">
       <w:start w:val="1"/>
-      <w:numFmt w:val="bullet"/>
-      <w:lvlText w:val="-"/>
-      <w:lvlJc w:val="left"/>
-      <w:pPr>
-        <w:ind w:left="3600" w:hanging="360"/>
-      </w:pPr>
-      <w:rPr>
-        <w:u w:val="none"/>
-      </w:rPr>
+      <w:numFmt w:val="decimal"/>
+      <w:lvlText w:val="%1.%2.%3.%4.%5"/>
+      <w:lvlJc w:val="left"/>
+      <w:pPr>
+        <w:ind w:left="1008" w:hanging="1008"/>
+      </w:pPr>
+      <w:rPr/>
     </w:lvl>
     <w:lvl w:ilvl="5">
       <w:start w:val="1"/>
-      <w:numFmt w:val="bullet"/>
-      <w:lvlText w:val="-"/>
-      <w:lvlJc w:val="left"/>
-      <w:pPr>
-        <w:ind w:left="4320" w:hanging="360"/>
-      </w:pPr>
-      <w:rPr>
-        <w:u w:val="none"/>
-      </w:rPr>
+      <w:numFmt w:val="decimal"/>
+      <w:lvlText w:val="%1.%2.%3.%4.%5.%6"/>
+      <w:lvlJc w:val="left"/>
+      <w:pPr>
+        <w:ind w:left="1152" w:hanging="1152"/>
+      </w:pPr>
+      <w:rPr/>
     </w:lvl>
     <w:lvl w:ilvl="6">
       <w:start w:val="1"/>
-      <w:numFmt w:val="bullet"/>
-      <w:lvlText w:val="-"/>
-      <w:lvlJc w:val="left"/>
-      <w:pPr>
-        <w:ind w:left="5040" w:hanging="360"/>
-      </w:pPr>
-      <w:rPr>
-        <w:u w:val="none"/>
-      </w:rPr>
+      <w:numFmt w:val="decimal"/>
+      <w:lvlText w:val="%1.%2.%3.%4.%5.%6.%7"/>
+      <w:lvlJc w:val="left"/>
+      <w:pPr>
+        <w:ind w:left="1296" w:hanging="1296"/>
+      </w:pPr>
+      <w:rPr/>
     </w:lvl>
     <w:lvl w:ilvl="7">
       <w:start w:val="1"/>
-      <w:numFmt w:val="bullet"/>
-      <w:lvlText w:val="-"/>
-      <w:lvlJc w:val="left"/>
-      <w:pPr>
-        <w:ind w:left="5760" w:hanging="360"/>
-      </w:pPr>
-      <w:rPr>
-        <w:u w:val="none"/>
-      </w:rPr>
+      <w:numFmt w:val="decimal"/>
+      <w:lvlText w:val="%1.%2.%3.%4.%5.%6.%7.%8"/>
+      <w:lvlJc w:val="left"/>
+      <w:pPr>
+        <w:ind w:left="1440" w:hanging="1440"/>
+      </w:pPr>
+      <w:rPr/>
     </w:lvl>
     <w:lvl w:ilvl="8">
       <w:start w:val="1"/>
-      <w:numFmt w:val="bullet"/>
-      <w:lvlText w:val="-"/>
-      <w:lvlJc w:val="left"/>
-      <w:pPr>
-        <w:ind w:left="6480" w:hanging="360"/>
-      </w:pPr>
-      <w:rPr>
-        <w:u w:val="none"/>
-      </w:rPr>
+      <w:numFmt w:val="decimal"/>
+      <w:lvlText w:val="%1.%2.%3.%4.%5.%6.%7.%8.%9"/>
+      <w:lvlJc w:val="left"/>
+      <w:pPr>
+        <w:ind w:left="1584" w:hanging="1584"/>
+      </w:pPr>
+      <w:rPr/>
     </w:lvl>
   </w:abstractNum>
   <w:abstractNum w:abstractNumId="9">
@@ -9058,7 +9182,7 @@
     <w:lvl w:ilvl="0">
       <w:start w:val="1"/>
       <w:numFmt w:val="bullet"/>
-      <w:lvlText w:val="●"/>
+      <w:lvlText w:val="-"/>
       <w:lvlJc w:val="left"/>
       <w:pPr>
         <w:ind w:left="720" w:hanging="360"/>
@@ -9070,7 +9194,7 @@
     <w:lvl w:ilvl="1">
       <w:start w:val="1"/>
       <w:numFmt w:val="bullet"/>
-      <w:lvlText w:val="○"/>
+      <w:lvlText w:val="-"/>
       <w:lvlJc w:val="left"/>
       <w:pPr>
         <w:ind w:left="1440" w:hanging="360"/>
@@ -9082,7 +9206,7 @@
     <w:lvl w:ilvl="2">
       <w:start w:val="1"/>
       <w:numFmt w:val="bullet"/>
-      <w:lvlText w:val="■"/>
+      <w:lvlText w:val="-"/>
       <w:lvlJc w:val="left"/>
       <w:pPr>
         <w:ind w:left="2160" w:hanging="360"/>
@@ -9094,7 +9218,7 @@
     <w:lvl w:ilvl="3">
       <w:start w:val="1"/>
       <w:numFmt w:val="bullet"/>
-      <w:lvlText w:val="●"/>
+      <w:lvlText w:val="-"/>
       <w:lvlJc w:val="left"/>
       <w:pPr>
         <w:ind w:left="2880" w:hanging="360"/>
@@ -9106,7 +9230,7 @@
     <w:lvl w:ilvl="4">
       <w:start w:val="1"/>
       <w:numFmt w:val="bullet"/>
-      <w:lvlText w:val="○"/>
+      <w:lvlText w:val="-"/>
       <w:lvlJc w:val="left"/>
       <w:pPr>
         <w:ind w:left="3600" w:hanging="360"/>
@@ -9118,7 +9242,7 @@
     <w:lvl w:ilvl="5">
       <w:start w:val="1"/>
       <w:numFmt w:val="bullet"/>
-      <w:lvlText w:val="■"/>
+      <w:lvlText w:val="-"/>
       <w:lvlJc w:val="left"/>
       <w:pPr>
         <w:ind w:left="4320" w:hanging="360"/>
@@ -9130,7 +9254,7 @@
     <w:lvl w:ilvl="6">
       <w:start w:val="1"/>
       <w:numFmt w:val="bullet"/>
-      <w:lvlText w:val="●"/>
+      <w:lvlText w:val="-"/>
       <w:lvlJc w:val="left"/>
       <w:pPr>
         <w:ind w:left="5040" w:hanging="360"/>
@@ -9142,7 +9266,7 @@
     <w:lvl w:ilvl="7">
       <w:start w:val="1"/>
       <w:numFmt w:val="bullet"/>
-      <w:lvlText w:val="○"/>
+      <w:lvlText w:val="-"/>
       <w:lvlJc w:val="left"/>
       <w:pPr>
         <w:ind w:left="5760" w:hanging="360"/>
@@ -9154,7 +9278,7 @@
     <w:lvl w:ilvl="8">
       <w:start w:val="1"/>
       <w:numFmt w:val="bullet"/>
-      <w:lvlText w:val="■"/>
+      <w:lvlText w:val="-"/>
       <w:lvlJc w:val="left"/>
       <w:pPr>
         <w:ind w:left="6480" w:hanging="360"/>
@@ -9388,7 +9512,7 @@
     <w:lvl w:ilvl="0">
       <w:start w:val="1"/>
       <w:numFmt w:val="bullet"/>
-      <w:lvlText w:val="-"/>
+      <w:lvlText w:val="●"/>
       <w:lvlJc w:val="left"/>
       <w:pPr>
         <w:ind w:left="720" w:hanging="360"/>
@@ -9400,7 +9524,7 @@
     <w:lvl w:ilvl="1">
       <w:start w:val="1"/>
       <w:numFmt w:val="bullet"/>
-      <w:lvlText w:val="-"/>
+      <w:lvlText w:val="○"/>
       <w:lvlJc w:val="left"/>
       <w:pPr>
         <w:ind w:left="1440" w:hanging="360"/>
@@ -9412,7 +9536,7 @@
     <w:lvl w:ilvl="2">
       <w:start w:val="1"/>
       <w:numFmt w:val="bullet"/>
-      <w:lvlText w:val="-"/>
+      <w:lvlText w:val="■"/>
       <w:lvlJc w:val="left"/>
       <w:pPr>
         <w:ind w:left="2160" w:hanging="360"/>
@@ -9424,7 +9548,7 @@
     <w:lvl w:ilvl="3">
       <w:start w:val="1"/>
       <w:numFmt w:val="bullet"/>
-      <w:lvlText w:val="-"/>
+      <w:lvlText w:val="●"/>
       <w:lvlJc w:val="left"/>
       <w:pPr>
         <w:ind w:left="2880" w:hanging="360"/>
@@ -9436,7 +9560,7 @@
     <w:lvl w:ilvl="4">
       <w:start w:val="1"/>
       <w:numFmt w:val="bullet"/>
-      <w:lvlText w:val="-"/>
+      <w:lvlText w:val="○"/>
       <w:lvlJc w:val="left"/>
       <w:pPr>
         <w:ind w:left="3600" w:hanging="360"/>
@@ -9448,7 +9572,7 @@
     <w:lvl w:ilvl="5">
       <w:start w:val="1"/>
       <w:numFmt w:val="bullet"/>
-      <w:lvlText w:val="-"/>
+      <w:lvlText w:val="■"/>
       <w:lvlJc w:val="left"/>
       <w:pPr>
         <w:ind w:left="4320" w:hanging="360"/>
@@ -9460,7 +9584,7 @@
     <w:lvl w:ilvl="6">
       <w:start w:val="1"/>
       <w:numFmt w:val="bullet"/>
-      <w:lvlText w:val="-"/>
+      <w:lvlText w:val="●"/>
       <w:lvlJc w:val="left"/>
       <w:pPr>
         <w:ind w:left="5040" w:hanging="360"/>
@@ -9472,7 +9596,7 @@
     <w:lvl w:ilvl="7">
       <w:start w:val="1"/>
       <w:numFmt w:val="bullet"/>
-      <w:lvlText w:val="-"/>
+      <w:lvlText w:val="○"/>
       <w:lvlJc w:val="left"/>
       <w:pPr>
         <w:ind w:left="5760" w:hanging="360"/>
@@ -9484,7 +9608,7 @@
     <w:lvl w:ilvl="8">
       <w:start w:val="1"/>
       <w:numFmt w:val="bullet"/>
-      <w:lvlText w:val="-"/>
+      <w:lvlText w:val="■"/>
       <w:lvlJc w:val="left"/>
       <w:pPr>
         <w:ind w:left="6480" w:hanging="360"/>
@@ -9825,6 +9949,446 @@
     </w:lvl>
   </w:abstractNum>
   <w:abstractNum w:abstractNumId="17">
+    <w:lvl w:ilvl="0">
+      <w:start w:val="1"/>
+      <w:numFmt w:val="bullet"/>
+      <w:lvlText w:val="-"/>
+      <w:lvlJc w:val="left"/>
+      <w:pPr>
+        <w:ind w:left="720" w:hanging="360"/>
+      </w:pPr>
+      <w:rPr>
+        <w:u w:val="none"/>
+      </w:rPr>
+    </w:lvl>
+    <w:lvl w:ilvl="1">
+      <w:start w:val="1"/>
+      <w:numFmt w:val="bullet"/>
+      <w:lvlText w:val="-"/>
+      <w:lvlJc w:val="left"/>
+      <w:pPr>
+        <w:ind w:left="1440" w:hanging="360"/>
+      </w:pPr>
+      <w:rPr>
+        <w:u w:val="none"/>
+      </w:rPr>
+    </w:lvl>
+    <w:lvl w:ilvl="2">
+      <w:start w:val="1"/>
+      <w:numFmt w:val="bullet"/>
+      <w:lvlText w:val="-"/>
+      <w:lvlJc w:val="left"/>
+      <w:pPr>
+        <w:ind w:left="2160" w:hanging="360"/>
+      </w:pPr>
+      <w:rPr>
+        <w:u w:val="none"/>
+      </w:rPr>
+    </w:lvl>
+    <w:lvl w:ilvl="3">
+      <w:start w:val="1"/>
+      <w:numFmt w:val="bullet"/>
+      <w:lvlText w:val="-"/>
+      <w:lvlJc w:val="left"/>
+      <w:pPr>
+        <w:ind w:left="2880" w:hanging="360"/>
+      </w:pPr>
+      <w:rPr>
+        <w:u w:val="none"/>
+      </w:rPr>
+    </w:lvl>
+    <w:lvl w:ilvl="4">
+      <w:start w:val="1"/>
+      <w:numFmt w:val="bullet"/>
+      <w:lvlText w:val="-"/>
+      <w:lvlJc w:val="left"/>
+      <w:pPr>
+        <w:ind w:left="3600" w:hanging="360"/>
+      </w:pPr>
+      <w:rPr>
+        <w:u w:val="none"/>
+      </w:rPr>
+    </w:lvl>
+    <w:lvl w:ilvl="5">
+      <w:start w:val="1"/>
+      <w:numFmt w:val="bullet"/>
+      <w:lvlText w:val="-"/>
+      <w:lvlJc w:val="left"/>
+      <w:pPr>
+        <w:ind w:left="4320" w:hanging="360"/>
+      </w:pPr>
+      <w:rPr>
+        <w:u w:val="none"/>
+      </w:rPr>
+    </w:lvl>
+    <w:lvl w:ilvl="6">
+      <w:start w:val="1"/>
+      <w:numFmt w:val="bullet"/>
+      <w:lvlText w:val="-"/>
+      <w:lvlJc w:val="left"/>
+      <w:pPr>
+        <w:ind w:left="5040" w:hanging="360"/>
+      </w:pPr>
+      <w:rPr>
+        <w:u w:val="none"/>
+      </w:rPr>
+    </w:lvl>
+    <w:lvl w:ilvl="7">
+      <w:start w:val="1"/>
+      <w:numFmt w:val="bullet"/>
+      <w:lvlText w:val="-"/>
+      <w:lvlJc w:val="left"/>
+      <w:pPr>
+        <w:ind w:left="5760" w:hanging="360"/>
+      </w:pPr>
+      <w:rPr>
+        <w:u w:val="none"/>
+      </w:rPr>
+    </w:lvl>
+    <w:lvl w:ilvl="8">
+      <w:start w:val="1"/>
+      <w:numFmt w:val="bullet"/>
+      <w:lvlText w:val="-"/>
+      <w:lvlJc w:val="left"/>
+      <w:pPr>
+        <w:ind w:left="6480" w:hanging="360"/>
+      </w:pPr>
+      <w:rPr>
+        <w:u w:val="none"/>
+      </w:rPr>
+    </w:lvl>
+  </w:abstractNum>
+  <w:abstractNum w:abstractNumId="18">
+    <w:lvl w:ilvl="0">
+      <w:start w:val="1"/>
+      <w:numFmt w:val="bullet"/>
+      <w:lvlText w:val="-"/>
+      <w:lvlJc w:val="left"/>
+      <w:pPr>
+        <w:ind w:left="720" w:hanging="360"/>
+      </w:pPr>
+      <w:rPr>
+        <w:u w:val="none"/>
+      </w:rPr>
+    </w:lvl>
+    <w:lvl w:ilvl="1">
+      <w:start w:val="1"/>
+      <w:numFmt w:val="bullet"/>
+      <w:lvlText w:val="-"/>
+      <w:lvlJc w:val="left"/>
+      <w:pPr>
+        <w:ind w:left="1440" w:hanging="360"/>
+      </w:pPr>
+      <w:rPr>
+        <w:u w:val="none"/>
+      </w:rPr>
+    </w:lvl>
+    <w:lvl w:ilvl="2">
+      <w:start w:val="1"/>
+      <w:numFmt w:val="bullet"/>
+      <w:lvlText w:val="-"/>
+      <w:lvlJc w:val="left"/>
+      <w:pPr>
+        <w:ind w:left="2160" w:hanging="360"/>
+      </w:pPr>
+      <w:rPr>
+        <w:u w:val="none"/>
+      </w:rPr>
+    </w:lvl>
+    <w:lvl w:ilvl="3">
+      <w:start w:val="1"/>
+      <w:numFmt w:val="bullet"/>
+      <w:lvlText w:val="-"/>
+      <w:lvlJc w:val="left"/>
+      <w:pPr>
+        <w:ind w:left="2880" w:hanging="360"/>
+      </w:pPr>
+      <w:rPr>
+        <w:u w:val="none"/>
+      </w:rPr>
+    </w:lvl>
+    <w:lvl w:ilvl="4">
+      <w:start w:val="1"/>
+      <w:numFmt w:val="bullet"/>
+      <w:lvlText w:val="-"/>
+      <w:lvlJc w:val="left"/>
+      <w:pPr>
+        <w:ind w:left="3600" w:hanging="360"/>
+      </w:pPr>
+      <w:rPr>
+        <w:u w:val="none"/>
+      </w:rPr>
+    </w:lvl>
+    <w:lvl w:ilvl="5">
+      <w:start w:val="1"/>
+      <w:numFmt w:val="bullet"/>
+      <w:lvlText w:val="-"/>
+      <w:lvlJc w:val="left"/>
+      <w:pPr>
+        <w:ind w:left="4320" w:hanging="360"/>
+      </w:pPr>
+      <w:rPr>
+        <w:u w:val="none"/>
+      </w:rPr>
+    </w:lvl>
+    <w:lvl w:ilvl="6">
+      <w:start w:val="1"/>
+      <w:numFmt w:val="bullet"/>
+      <w:lvlText w:val="-"/>
+      <w:lvlJc w:val="left"/>
+      <w:pPr>
+        <w:ind w:left="5040" w:hanging="360"/>
+      </w:pPr>
+      <w:rPr>
+        <w:u w:val="none"/>
+      </w:rPr>
+    </w:lvl>
+    <w:lvl w:ilvl="7">
+      <w:start w:val="1"/>
+      <w:numFmt w:val="bullet"/>
+      <w:lvlText w:val="-"/>
+      <w:lvlJc w:val="left"/>
+      <w:pPr>
+        <w:ind w:left="5760" w:hanging="360"/>
+      </w:pPr>
+      <w:rPr>
+        <w:u w:val="none"/>
+      </w:rPr>
+    </w:lvl>
+    <w:lvl w:ilvl="8">
+      <w:start w:val="1"/>
+      <w:numFmt w:val="bullet"/>
+      <w:lvlText w:val="-"/>
+      <w:lvlJc w:val="left"/>
+      <w:pPr>
+        <w:ind w:left="6480" w:hanging="360"/>
+      </w:pPr>
+      <w:rPr>
+        <w:u w:val="none"/>
+      </w:rPr>
+    </w:lvl>
+  </w:abstractNum>
+  <w:abstractNum w:abstractNumId="19">
+    <w:lvl w:ilvl="0">
+      <w:start w:val="1"/>
+      <w:numFmt w:val="bullet"/>
+      <w:lvlText w:val="-"/>
+      <w:lvlJc w:val="left"/>
+      <w:pPr>
+        <w:ind w:left="720" w:hanging="360"/>
+      </w:pPr>
+      <w:rPr>
+        <w:u w:val="none"/>
+      </w:rPr>
+    </w:lvl>
+    <w:lvl w:ilvl="1">
+      <w:start w:val="1"/>
+      <w:numFmt w:val="bullet"/>
+      <w:lvlText w:val="-"/>
+      <w:lvlJc w:val="left"/>
+      <w:pPr>
+        <w:ind w:left="1440" w:hanging="360"/>
+      </w:pPr>
+      <w:rPr>
+        <w:u w:val="none"/>
+      </w:rPr>
+    </w:lvl>
+    <w:lvl w:ilvl="2">
+      <w:start w:val="1"/>
+      <w:numFmt w:val="bullet"/>
+      <w:lvlText w:val="-"/>
+      <w:lvlJc w:val="left"/>
+      <w:pPr>
+        <w:ind w:left="2160" w:hanging="360"/>
+      </w:pPr>
+      <w:rPr>
+        <w:u w:val="none"/>
+      </w:rPr>
+    </w:lvl>
+    <w:lvl w:ilvl="3">
+      <w:start w:val="1"/>
+      <w:numFmt w:val="bullet"/>
+      <w:lvlText w:val="-"/>
+      <w:lvlJc w:val="left"/>
+      <w:pPr>
+        <w:ind w:left="2880" w:hanging="360"/>
+      </w:pPr>
+      <w:rPr>
+        <w:u w:val="none"/>
+      </w:rPr>
+    </w:lvl>
+    <w:lvl w:ilvl="4">
+      <w:start w:val="1"/>
+      <w:numFmt w:val="bullet"/>
+      <w:lvlText w:val="-"/>
+      <w:lvlJc w:val="left"/>
+      <w:pPr>
+        <w:ind w:left="3600" w:hanging="360"/>
+      </w:pPr>
+      <w:rPr>
+        <w:u w:val="none"/>
+      </w:rPr>
+    </w:lvl>
+    <w:lvl w:ilvl="5">
+      <w:start w:val="1"/>
+      <w:numFmt w:val="bullet"/>
+      <w:lvlText w:val="-"/>
+      <w:lvlJc w:val="left"/>
+      <w:pPr>
+        <w:ind w:left="4320" w:hanging="360"/>
+      </w:pPr>
+      <w:rPr>
+        <w:u w:val="none"/>
+      </w:rPr>
+    </w:lvl>
+    <w:lvl w:ilvl="6">
+      <w:start w:val="1"/>
+      <w:numFmt w:val="bullet"/>
+      <w:lvlText w:val="-"/>
+      <w:lvlJc w:val="left"/>
+      <w:pPr>
+        <w:ind w:left="5040" w:hanging="360"/>
+      </w:pPr>
+      <w:rPr>
+        <w:u w:val="none"/>
+      </w:rPr>
+    </w:lvl>
+    <w:lvl w:ilvl="7">
+      <w:start w:val="1"/>
+      <w:numFmt w:val="bullet"/>
+      <w:lvlText w:val="-"/>
+      <w:lvlJc w:val="left"/>
+      <w:pPr>
+        <w:ind w:left="5760" w:hanging="360"/>
+      </w:pPr>
+      <w:rPr>
+        <w:u w:val="none"/>
+      </w:rPr>
+    </w:lvl>
+    <w:lvl w:ilvl="8">
+      <w:start w:val="1"/>
+      <w:numFmt w:val="bullet"/>
+      <w:lvlText w:val="-"/>
+      <w:lvlJc w:val="left"/>
+      <w:pPr>
+        <w:ind w:left="6480" w:hanging="360"/>
+      </w:pPr>
+      <w:rPr>
+        <w:u w:val="none"/>
+      </w:rPr>
+    </w:lvl>
+  </w:abstractNum>
+  <w:abstractNum w:abstractNumId="20">
+    <w:lvl w:ilvl="0">
+      <w:start w:val="1"/>
+      <w:numFmt w:val="bullet"/>
+      <w:lvlText w:val="-"/>
+      <w:lvlJc w:val="left"/>
+      <w:pPr>
+        <w:ind w:left="720" w:hanging="360"/>
+      </w:pPr>
+      <w:rPr>
+        <w:u w:val="none"/>
+      </w:rPr>
+    </w:lvl>
+    <w:lvl w:ilvl="1">
+      <w:start w:val="1"/>
+      <w:numFmt w:val="bullet"/>
+      <w:lvlText w:val="-"/>
+      <w:lvlJc w:val="left"/>
+      <w:pPr>
+        <w:ind w:left="1440" w:hanging="360"/>
+      </w:pPr>
+      <w:rPr>
+        <w:u w:val="none"/>
+      </w:rPr>
+    </w:lvl>
+    <w:lvl w:ilvl="2">
+      <w:start w:val="1"/>
+      <w:numFmt w:val="bullet"/>
+      <w:lvlText w:val="-"/>
+      <w:lvlJc w:val="left"/>
+      <w:pPr>
+        <w:ind w:left="2160" w:hanging="360"/>
+      </w:pPr>
+      <w:rPr>
+        <w:u w:val="none"/>
+      </w:rPr>
+    </w:lvl>
+    <w:lvl w:ilvl="3">
+      <w:start w:val="1"/>
+      <w:numFmt w:val="bullet"/>
+      <w:lvlText w:val="-"/>
+      <w:lvlJc w:val="left"/>
+      <w:pPr>
+        <w:ind w:left="2880" w:hanging="360"/>
+      </w:pPr>
+      <w:rPr>
+        <w:u w:val="none"/>
+      </w:rPr>
+    </w:lvl>
+    <w:lvl w:ilvl="4">
+      <w:start w:val="1"/>
+      <w:numFmt w:val="bullet"/>
+      <w:lvlText w:val="-"/>
+      <w:lvlJc w:val="left"/>
+      <w:pPr>
+        <w:ind w:left="3600" w:hanging="360"/>
+      </w:pPr>
+      <w:rPr>
+        <w:u w:val="none"/>
+      </w:rPr>
+    </w:lvl>
+    <w:lvl w:ilvl="5">
+      <w:start w:val="1"/>
+      <w:numFmt w:val="bullet"/>
+      <w:lvlText w:val="-"/>
+      <w:lvlJc w:val="left"/>
+      <w:pPr>
+        <w:ind w:left="4320" w:hanging="360"/>
+      </w:pPr>
+      <w:rPr>
+        <w:u w:val="none"/>
+      </w:rPr>
+    </w:lvl>
+    <w:lvl w:ilvl="6">
+      <w:start w:val="1"/>
+      <w:numFmt w:val="bullet"/>
+      <w:lvlText w:val="-"/>
+      <w:lvlJc w:val="left"/>
+      <w:pPr>
+        <w:ind w:left="5040" w:hanging="360"/>
+      </w:pPr>
+      <w:rPr>
+        <w:u w:val="none"/>
+      </w:rPr>
+    </w:lvl>
+    <w:lvl w:ilvl="7">
+      <w:start w:val="1"/>
+      <w:numFmt w:val="bullet"/>
+      <w:lvlText w:val="-"/>
+      <w:lvlJc w:val="left"/>
+      <w:pPr>
+        <w:ind w:left="5760" w:hanging="360"/>
+      </w:pPr>
+      <w:rPr>
+        <w:u w:val="none"/>
+      </w:rPr>
+    </w:lvl>
+    <w:lvl w:ilvl="8">
+      <w:start w:val="1"/>
+      <w:numFmt w:val="bullet"/>
+      <w:lvlText w:val="-"/>
+      <w:lvlJc w:val="left"/>
+      <w:pPr>
+        <w:ind w:left="6480" w:hanging="360"/>
+      </w:pPr>
+      <w:rPr>
+        <w:u w:val="none"/>
+      </w:rPr>
+    </w:lvl>
+  </w:abstractNum>
+  <w:abstractNum w:abstractNumId="21">
     <w:lvl w:ilvl="0">
       <w:start w:val="1"/>
       <w:numFmt w:val="bullet"/>
@@ -9984,6 +10548,18 @@
   </w:num>
   <w:num w:numId="17">
     <w:abstractNumId w:val="17"/>
+  </w:num>
+  <w:num w:numId="18">
+    <w:abstractNumId w:val="18"/>
+  </w:num>
+  <w:num w:numId="19">
+    <w:abstractNumId w:val="19"/>
+  </w:num>
+  <w:num w:numId="20">
+    <w:abstractNumId w:val="20"/>
+  </w:num>
+  <w:num w:numId="21">
+    <w:abstractNumId w:val="21"/>
   </w:num>
 </w:numbering>
 </file>

</xml_diff>